<commit_message>
Refresh editorial interface and adopt updated article template
</commit_message>
<xml_diff>
--- a/templates/article-format-a4.docx
+++ b/templates/article-format-a4.docx
@@ -255,15 +255,10 @@
           <w:szCs w:val="24"/>
           <w:lang w:eastAsia="zh-TW"/>
         </w:rPr>
-        <w:t>範例。字體為微軟正黑體，字號 12pt，首行縮排兩字元，行距 1.2 倍，對齊方式為左右對齊。</w:t>
-      </w:r>
-    </w:p>
-    <w:p>
-      <w:pPr>
-        <w:pStyle w:val="1"/>
-        <w:spacing w:before="0" w:line="276" w:lineRule="auto"/>
-        <w:ind w:left="0" w:firstLineChars="200" w:firstLine="476"/>
-        <w:jc w:val="both"/>
+        <w:t>範例。字體為微軟正黑體，字號 12pt，首行</w:t>
+      </w:r>
+      <w:proofErr w:type="gramStart"/>
+      <w:r>
         <w:rPr>
           <w:rFonts w:ascii="微軟正黑體" w:eastAsia="微軟正黑體" w:hAnsi="微軟正黑體" w:cs="新細明體"/>
           <w:i w:val="0"/>
@@ -274,6 +269,67 @@
           <w:szCs w:val="24"/>
           <w:lang w:eastAsia="zh-TW"/>
         </w:rPr>
+        <w:t>縮排兩字元</w:t>
+      </w:r>
+      <w:proofErr w:type="gramEnd"/>
+      <w:r>
+        <w:rPr>
+          <w:rFonts w:ascii="微軟正黑體" w:eastAsia="微軟正黑體" w:hAnsi="微軟正黑體" w:cs="新細明體"/>
+          <w:i w:val="0"/>
+          <w:iCs w:val="0"/>
+          <w:color w:val="000000" w:themeColor="text1"/>
+          <w:spacing w:val="-2"/>
+          <w:sz w:val="24"/>
+          <w:szCs w:val="24"/>
+          <w:lang w:eastAsia="zh-TW"/>
+        </w:rPr>
+        <w:t xml:space="preserve">，行距 1.2 </w:t>
+      </w:r>
+      <w:proofErr w:type="gramStart"/>
+      <w:r>
+        <w:rPr>
+          <w:rFonts w:ascii="微軟正黑體" w:eastAsia="微軟正黑體" w:hAnsi="微軟正黑體" w:cs="新細明體"/>
+          <w:i w:val="0"/>
+          <w:iCs w:val="0"/>
+          <w:color w:val="000000" w:themeColor="text1"/>
+          <w:spacing w:val="-2"/>
+          <w:sz w:val="24"/>
+          <w:szCs w:val="24"/>
+          <w:lang w:eastAsia="zh-TW"/>
+        </w:rPr>
+        <w:t>倍</w:t>
+      </w:r>
+      <w:proofErr w:type="gramEnd"/>
+      <w:r>
+        <w:rPr>
+          <w:rFonts w:ascii="微軟正黑體" w:eastAsia="微軟正黑體" w:hAnsi="微軟正黑體" w:cs="新細明體"/>
+          <w:i w:val="0"/>
+          <w:iCs w:val="0"/>
+          <w:color w:val="000000" w:themeColor="text1"/>
+          <w:spacing w:val="-2"/>
+          <w:sz w:val="24"/>
+          <w:szCs w:val="24"/>
+          <w:lang w:eastAsia="zh-TW"/>
+        </w:rPr>
+        <w:t>，對齊方式為左右對齊。</w:t>
+      </w:r>
+    </w:p>
+    <w:p>
+      <w:pPr>
+        <w:pStyle w:val="1"/>
+        <w:spacing w:before="0" w:line="276" w:lineRule="auto"/>
+        <w:ind w:left="0" w:firstLineChars="200" w:firstLine="476"/>
+        <w:jc w:val="both"/>
+        <w:rPr>
+          <w:rFonts w:ascii="微軟正黑體" w:eastAsia="微軟正黑體" w:hAnsi="微軟正黑體" w:cs="新細明體"/>
+          <w:i w:val="0"/>
+          <w:iCs w:val="0"/>
+          <w:color w:val="000000" w:themeColor="text1"/>
+          <w:spacing w:val="-2"/>
+          <w:sz w:val="24"/>
+          <w:szCs w:val="24"/>
+          <w:lang w:eastAsia="zh-TW"/>
+        </w:rPr>
       </w:pPr>
     </w:p>
     <w:p>
@@ -328,7 +384,55 @@
           <w:szCs w:val="24"/>
           <w:lang w:eastAsia="zh-TW"/>
         </w:rPr>
-        <w:t>這是內文範例。字體為微軟正黑體，字號 12pt，首行縮排兩字元，行距 1.2 倍，對齊方式為左右對齊。</w:t>
+        <w:t>這是內文範例。字體為微軟正黑體，字號 12pt，首行</w:t>
+      </w:r>
+      <w:proofErr w:type="gramStart"/>
+      <w:r>
+        <w:rPr>
+          <w:rFonts w:ascii="微軟正黑體" w:eastAsia="微軟正黑體" w:hAnsi="微軟正黑體" w:hint="eastAsia"/>
+          <w:bCs/>
+          <w:color w:val="000000"/>
+          <w:sz w:val="24"/>
+          <w:szCs w:val="24"/>
+          <w:lang w:eastAsia="zh-TW"/>
+        </w:rPr>
+        <w:t>縮排兩字元</w:t>
+      </w:r>
+      <w:proofErr w:type="gramEnd"/>
+      <w:r>
+        <w:rPr>
+          <w:rFonts w:ascii="微軟正黑體" w:eastAsia="微軟正黑體" w:hAnsi="微軟正黑體" w:hint="eastAsia"/>
+          <w:bCs/>
+          <w:color w:val="000000"/>
+          <w:sz w:val="24"/>
+          <w:szCs w:val="24"/>
+          <w:lang w:eastAsia="zh-TW"/>
+        </w:rPr>
+        <w:t xml:space="preserve">，行距 1.2 </w:t>
+      </w:r>
+      <w:proofErr w:type="gramStart"/>
+      <w:r>
+        <w:rPr>
+          <w:rFonts w:ascii="微軟正黑體" w:eastAsia="微軟正黑體" w:hAnsi="微軟正黑體" w:hint="eastAsia"/>
+          <w:bCs/>
+          <w:color w:val="000000"/>
+          <w:sz w:val="24"/>
+          <w:szCs w:val="24"/>
+          <w:lang w:eastAsia="zh-TW"/>
+        </w:rPr>
+        <w:t>倍</w:t>
+      </w:r>
+      <w:proofErr w:type="gramEnd"/>
+      <w:r>
+        <w:rPr>
+          <w:rFonts w:ascii="微軟正黑體" w:eastAsia="微軟正黑體" w:hAnsi="微軟正黑體" w:hint="eastAsia"/>
+          <w:bCs/>
+          <w:color w:val="000000"/>
+          <w:sz w:val="24"/>
+          <w:szCs w:val="24"/>
+          <w:lang w:eastAsia="zh-TW"/>
+        </w:rPr>
+        <w:t>，對齊方式為左右對齊。</w:t>
       </w:r>
     </w:p>
     <w:bookmarkEnd w:id="1"/>
@@ -384,7 +488,55 @@
           <w:szCs w:val="24"/>
           <w:lang w:eastAsia="zh-TW"/>
         </w:rPr>
-        <w:t>這是內文範例。字體為微軟正黑體，字號 12pt，首行縮排兩字元，行距 1.2 倍，對齊方式為左右對齊。</w:t>
+        <w:t>這是內文範例。字體為微軟正黑體，字號 12pt，首行</w:t>
+      </w:r>
+      <w:proofErr w:type="gramStart"/>
+      <w:r>
+        <w:rPr>
+          <w:rFonts w:ascii="微軟正黑體" w:eastAsia="微軟正黑體" w:hAnsi="微軟正黑體" w:hint="eastAsia"/>
+          <w:bCs/>
+          <w:color w:val="000000"/>
+          <w:sz w:val="24"/>
+          <w:szCs w:val="24"/>
+          <w:lang w:eastAsia="zh-TW"/>
+        </w:rPr>
+        <w:t>縮排兩字元</w:t>
+      </w:r>
+      <w:proofErr w:type="gramEnd"/>
+      <w:r>
+        <w:rPr>
+          <w:rFonts w:ascii="微軟正黑體" w:eastAsia="微軟正黑體" w:hAnsi="微軟正黑體" w:hint="eastAsia"/>
+          <w:bCs/>
+          <w:color w:val="000000"/>
+          <w:sz w:val="24"/>
+          <w:szCs w:val="24"/>
+          <w:lang w:eastAsia="zh-TW"/>
+        </w:rPr>
+        <w:t xml:space="preserve">，行距 1.2 </w:t>
+      </w:r>
+      <w:proofErr w:type="gramStart"/>
+      <w:r>
+        <w:rPr>
+          <w:rFonts w:ascii="微軟正黑體" w:eastAsia="微軟正黑體" w:hAnsi="微軟正黑體" w:hint="eastAsia"/>
+          <w:bCs/>
+          <w:color w:val="000000"/>
+          <w:sz w:val="24"/>
+          <w:szCs w:val="24"/>
+          <w:lang w:eastAsia="zh-TW"/>
+        </w:rPr>
+        <w:t>倍</w:t>
+      </w:r>
+      <w:proofErr w:type="gramEnd"/>
+      <w:r>
+        <w:rPr>
+          <w:rFonts w:ascii="微軟正黑體" w:eastAsia="微軟正黑體" w:hAnsi="微軟正黑體" w:hint="eastAsia"/>
+          <w:bCs/>
+          <w:color w:val="000000"/>
+          <w:sz w:val="24"/>
+          <w:szCs w:val="24"/>
+          <w:lang w:eastAsia="zh-TW"/>
+        </w:rPr>
+        <w:t>，對齊方式為左右對齊。</w:t>
       </w:r>
     </w:p>
     <w:p>
@@ -434,8 +586,20 @@
           <w:szCs w:val="24"/>
           <w:lang w:eastAsia="zh-TW"/>
         </w:rPr>
-        <w:t>這是內文範例。字體為微軟正黑體，字號 12pt，首行不縮排，行距 1.2 倍</w:t>
-      </w:r>
+        <w:t xml:space="preserve">這是內文範例。字體為微軟正黑體，字號 12pt，首行不縮排，行距 1.2 </w:t>
+      </w:r>
+      <w:proofErr w:type="gramStart"/>
+      <w:r>
+        <w:rPr>
+          <w:rFonts w:ascii="微軟正黑體" w:eastAsia="微軟正黑體" w:hAnsi="微軟正黑體" w:hint="eastAsia"/>
+          <w:bCs/>
+          <w:sz w:val="24"/>
+          <w:szCs w:val="24"/>
+          <w:lang w:eastAsia="zh-TW"/>
+        </w:rPr>
+        <w:t>倍</w:t>
+      </w:r>
+      <w:proofErr w:type="gramEnd"/>
       <w:r>
         <w:rPr>
           <w:rFonts w:ascii="微軟正黑體" w:eastAsia="微軟正黑體" w:hAnsi="微軟正黑體" w:hint="eastAsia"/>
@@ -473,6 +637,7 @@
           <w:lang w:eastAsia="zh-TW"/>
         </w:rPr>
       </w:pPr>
+      <w:proofErr w:type="gramStart"/>
       <w:r>
         <w:rPr>
           <w:rFonts w:ascii="微軟正黑體" w:eastAsia="微軟正黑體" w:hAnsi="微軟正黑體" w:cs="新細明體" w:hint="eastAsia"/>
@@ -482,7 +647,19 @@
           <w:szCs w:val="24"/>
           <w:lang w:eastAsia="zh-TW"/>
         </w:rPr>
-        <w:t>次條列標題（Heading 4）</w:t>
+        <w:t>次條列</w:t>
+      </w:r>
+      <w:proofErr w:type="gramEnd"/>
+      <w:r>
+        <w:rPr>
+          <w:rFonts w:ascii="微軟正黑體" w:eastAsia="微軟正黑體" w:hAnsi="微軟正黑體" w:cs="新細明體" w:hint="eastAsia"/>
+          <w:color w:val="000000"/>
+          <w:spacing w:val="-2"/>
+          <w:sz w:val="24"/>
+          <w:szCs w:val="24"/>
+          <w:lang w:eastAsia="zh-TW"/>
+        </w:rPr>
+        <w:t>標題（Heading 4）</w:t>
       </w:r>
     </w:p>
     <w:p>
@@ -506,8 +683,20 @@
           <w:szCs w:val="24"/>
           <w:lang w:eastAsia="zh-TW"/>
         </w:rPr>
-        <w:t>這是內文範例。字體為微軟正黑體，字號 12pt，首行不縮排，行距 1.2 倍</w:t>
-      </w:r>
+        <w:t xml:space="preserve">這是內文範例。字體為微軟正黑體，字號 12pt，首行不縮排，行距 1.2 </w:t>
+      </w:r>
+      <w:proofErr w:type="gramStart"/>
+      <w:r>
+        <w:rPr>
+          <w:rFonts w:ascii="微軟正黑體" w:eastAsia="微軟正黑體" w:hAnsi="微軟正黑體" w:hint="eastAsia"/>
+          <w:bCs/>
+          <w:sz w:val="24"/>
+          <w:szCs w:val="24"/>
+          <w:lang w:eastAsia="zh-TW"/>
+        </w:rPr>
+        <w:t>倍</w:t>
+      </w:r>
+      <w:proofErr w:type="gramEnd"/>
       <w:r>
         <w:rPr>
           <w:rFonts w:ascii="微軟正黑體" w:eastAsia="微軟正黑體" w:hAnsi="微軟正黑體" w:hint="eastAsia"/>
@@ -742,7 +931,29 @@
           <w:szCs w:val="24"/>
           <w:lang w:eastAsia="zh-TW"/>
         </w:rPr>
-        <w:t>大小：圖片寬度須適合 A4 版面（建議 8–12 cm）。</w:t>
+        <w:t>大小：圖片寬度須適合 A4 版面（建議 8</w:t>
+      </w:r>
+      <w:proofErr w:type="gramStart"/>
+      <w:r>
+        <w:rPr>
+          <w:rFonts w:ascii="微軟正黑體" w:eastAsia="微軟正黑體" w:hAnsi="微軟正黑體"/>
+          <w:bCs/>
+          <w:sz w:val="24"/>
+          <w:szCs w:val="24"/>
+          <w:lang w:eastAsia="zh-TW"/>
+        </w:rPr>
+        <w:t>–</w:t>
+      </w:r>
+      <w:proofErr w:type="gramEnd"/>
+      <w:r>
+        <w:rPr>
+          <w:rFonts w:ascii="微軟正黑體" w:eastAsia="微軟正黑體" w:hAnsi="微軟正黑體"/>
+          <w:bCs/>
+          <w:sz w:val="24"/>
+          <w:szCs w:val="24"/>
+          <w:lang w:eastAsia="zh-TW"/>
+        </w:rPr>
+        <w:t>12 cm）。</w:t>
       </w:r>
     </w:p>
     <w:p>
@@ -874,6 +1085,7 @@
         </w:rPr>
         <w:t>：</w:t>
       </w:r>
+      <w:proofErr w:type="gramStart"/>
       <w:r>
         <w:rPr>
           <w:rFonts w:ascii="微軟正黑體" w:eastAsia="微軟正黑體" w:hAnsi="微軟正黑體" w:cs="Calibri"/>
@@ -884,6 +1096,7 @@
         </w:rPr>
         <w:t>置於表上方</w:t>
       </w:r>
+      <w:proofErr w:type="gramEnd"/>
       <w:r>
         <w:rPr>
           <w:rFonts w:ascii="微軟正黑體" w:eastAsia="微軟正黑體" w:hAnsi="微軟正黑體" w:cs="Calibri"/>
@@ -902,8 +1115,9 @@
           <w:szCs w:val="24"/>
           <w:lang w:eastAsia="zh-TW"/>
         </w:rPr>
-        <w:t>表一</w:t>
-      </w:r>
+        <w:t>表</w:t>
+      </w:r>
+      <w:proofErr w:type="gramStart"/>
       <w:r>
         <w:rPr>
           <w:rFonts w:ascii="微軟正黑體" w:eastAsia="微軟正黑體" w:hAnsi="微軟正黑體" w:cs="Calibri" w:hint="eastAsia"/>
@@ -912,6 +1126,17 @@
           <w:szCs w:val="24"/>
           <w:lang w:eastAsia="zh-TW"/>
         </w:rPr>
+        <w:t>一</w:t>
+      </w:r>
+      <w:proofErr w:type="gramEnd"/>
+      <w:r>
+        <w:rPr>
+          <w:rFonts w:ascii="微軟正黑體" w:eastAsia="微軟正黑體" w:hAnsi="微軟正黑體" w:cs="Calibri" w:hint="eastAsia"/>
+          <w:w w:val="105"/>
+          <w:sz w:val="24"/>
+          <w:szCs w:val="24"/>
+          <w:lang w:eastAsia="zh-TW"/>
+        </w:rPr>
         <w:t xml:space="preserve"> </w:t>
       </w:r>
       <w:r>
@@ -922,8 +1147,20 @@
           <w:szCs w:val="24"/>
           <w:lang w:eastAsia="zh-TW"/>
         </w:rPr>
-        <w:t>表一</w:t>
-      </w:r>
+        <w:t>表</w:t>
+      </w:r>
+      <w:proofErr w:type="gramStart"/>
+      <w:r>
+        <w:rPr>
+          <w:rFonts w:ascii="微軟正黑體" w:eastAsia="微軟正黑體" w:hAnsi="微軟正黑體" w:cs="Calibri" w:hint="eastAsia"/>
+          <w:w w:val="105"/>
+          <w:sz w:val="24"/>
+          <w:szCs w:val="24"/>
+          <w:lang w:eastAsia="zh-TW"/>
+        </w:rPr>
+        <w:t>一</w:t>
+      </w:r>
+      <w:proofErr w:type="gramEnd"/>
       <w:r>
         <w:rPr>
           <w:rFonts w:ascii="微軟正黑體" w:eastAsia="微軟正黑體" w:hAnsi="微軟正黑體" w:cs="Calibri" w:hint="eastAsia"/>
@@ -1057,8 +1294,20 @@
           <w:szCs w:val="24"/>
           <w:lang w:val="en-US" w:eastAsia="zh-TW"/>
         </w:rPr>
-        <w:t>，並將圖表提及處粗體</w:t>
-      </w:r>
+        <w:t>，並將圖表</w:t>
+      </w:r>
+      <w:proofErr w:type="gramStart"/>
+      <w:r>
+        <w:rPr>
+          <w:rFonts w:ascii="微軟正黑體" w:eastAsia="微軟正黑體" w:hAnsi="微軟正黑體" w:cs="Calibri" w:hint="eastAsia"/>
+          <w:w w:val="105"/>
+          <w:sz w:val="24"/>
+          <w:szCs w:val="24"/>
+          <w:lang w:val="en-US" w:eastAsia="zh-TW"/>
+        </w:rPr>
+        <w:t>提及處粗體</w:t>
+      </w:r>
+      <w:proofErr w:type="gramEnd"/>
       <w:r>
         <w:rPr>
           <w:rFonts w:ascii="微軟正黑體" w:eastAsia="微軟正黑體" w:hAnsi="微軟正黑體" w:cs="Calibri"/>
@@ -1146,7 +1395,59 @@
           <w:szCs w:val="24"/>
           <w:lang w:eastAsia="zh-TW"/>
         </w:rPr>
-        <w:t>範例。字體為微軟正黑體，字號 12pt，首行縮排兩字元，行距 1.2 倍，對齊方式為左右對齊。</w:t>
+        <w:t>範例。字體為微軟正黑體，字號 12pt，首行</w:t>
+      </w:r>
+      <w:proofErr w:type="gramStart"/>
+      <w:r>
+        <w:rPr>
+          <w:rFonts w:ascii="微軟正黑體" w:eastAsia="微軟正黑體" w:hAnsi="微軟正黑體"/>
+          <w:i w:val="0"/>
+          <w:iCs w:val="0"/>
+          <w:color w:val="000000" w:themeColor="text1"/>
+          <w:sz w:val="24"/>
+          <w:szCs w:val="24"/>
+          <w:lang w:eastAsia="zh-TW"/>
+        </w:rPr>
+        <w:t>縮排兩字元</w:t>
+      </w:r>
+      <w:proofErr w:type="gramEnd"/>
+      <w:r>
+        <w:rPr>
+          <w:rFonts w:ascii="微軟正黑體" w:eastAsia="微軟正黑體" w:hAnsi="微軟正黑體"/>
+          <w:i w:val="0"/>
+          <w:iCs w:val="0"/>
+          <w:color w:val="000000" w:themeColor="text1"/>
+          <w:sz w:val="24"/>
+          <w:szCs w:val="24"/>
+          <w:lang w:eastAsia="zh-TW"/>
+        </w:rPr>
+        <w:t xml:space="preserve">，行距 1.2 </w:t>
+      </w:r>
+      <w:proofErr w:type="gramStart"/>
+      <w:r>
+        <w:rPr>
+          <w:rFonts w:ascii="微軟正黑體" w:eastAsia="微軟正黑體" w:hAnsi="微軟正黑體"/>
+          <w:i w:val="0"/>
+          <w:iCs w:val="0"/>
+          <w:color w:val="000000" w:themeColor="text1"/>
+          <w:sz w:val="24"/>
+          <w:szCs w:val="24"/>
+          <w:lang w:eastAsia="zh-TW"/>
+        </w:rPr>
+        <w:t>倍</w:t>
+      </w:r>
+      <w:proofErr w:type="gramEnd"/>
+      <w:r>
+        <w:rPr>
+          <w:rFonts w:ascii="微軟正黑體" w:eastAsia="微軟正黑體" w:hAnsi="微軟正黑體"/>
+          <w:i w:val="0"/>
+          <w:iCs w:val="0"/>
+          <w:color w:val="000000" w:themeColor="text1"/>
+          <w:sz w:val="24"/>
+          <w:szCs w:val="24"/>
+          <w:lang w:eastAsia="zh-TW"/>
+        </w:rPr>
+        <w:t>，對齊方式為左右對齊。</w:t>
       </w:r>
     </w:p>
     <w:p>
@@ -1667,2524 +1968,16 @@
       <w:pPr>
         <w:pStyle w:val="a3"/>
         <w:spacing w:before="11"/>
-        <w:jc w:val="center"/>
-        <w:rPr>
-          <w:rFonts w:ascii="微軟正黑體" w:eastAsia="微軟正黑體" w:hAnsi="微軟正黑體"/>
+        <w:rPr>
+          <w:rFonts w:ascii="微軟正黑體" w:eastAsia="微軟正黑體" w:hAnsi="微軟正黑體" w:hint="eastAsia"/>
           <w:sz w:val="12"/>
           <w:lang w:eastAsia="zh-TW"/>
         </w:rPr>
       </w:pPr>
-    </w:p>
-    <w:p>
-      <w:pPr>
-        <w:jc w:val="both"/>
-        <w:rPr>
-          <w:rFonts w:ascii="微軟正黑體" w:eastAsia="微軟正黑體" w:hAnsi="微軟正黑體" w:cs="微軟正黑體"/>
-          <w:spacing w:val="-8"/>
-          <w:w w:val="105"/>
-          <w:sz w:val="24"/>
-          <w:szCs w:val="24"/>
-          <w:lang w:eastAsia="zh-TW"/>
-        </w:rPr>
-      </w:pPr>
-    </w:p>
-    <w:p>
-      <w:pPr>
-        <w:spacing w:before="163"/>
-        <w:ind w:left="284"/>
-        <w:rPr>
-          <w:rFonts w:ascii="微軟正黑體" w:eastAsia="微軟正黑體" w:hAnsi="微軟正黑體" w:cs="微軟正黑體"/>
-          <w:spacing w:val="-4"/>
-          <w:w w:val="105"/>
-          <w:sz w:val="24"/>
-          <w:szCs w:val="24"/>
-          <w:lang w:eastAsia="zh-TW"/>
-        </w:rPr>
-      </w:pPr>
-      <w:r>
-        <w:rPr>
-          <w:rFonts w:ascii="微軟正黑體" w:eastAsia="微軟正黑體" w:hAnsi="微軟正黑體" w:cs="新細明體"/>
-          <w:noProof/>
-          <w:spacing w:val="-7"/>
-          <w:w w:val="105"/>
-          <w:sz w:val="24"/>
-          <w:szCs w:val="24"/>
-          <w:lang w:val="en-US" w:eastAsia="zh-TW"/>
-        </w:rPr>
-        <w:lastRenderedPageBreak/>
-        <mc:AlternateContent>
-          <mc:Choice Requires="wpg">
-            <w:drawing>
-              <wp:anchor distT="0" distB="0" distL="0" distR="0" simplePos="0" relativeHeight="251659264" behindDoc="1" locked="0" layoutInCell="1" allowOverlap="1" wp14:anchorId="53C85172" wp14:editId="46E95955">
-                <wp:simplePos x="0" y="0"/>
-                <wp:positionH relativeFrom="page">
-                  <wp:posOffset>840193</wp:posOffset>
-                </wp:positionH>
-                <wp:positionV relativeFrom="paragraph">
-                  <wp:posOffset>205866</wp:posOffset>
-                </wp:positionV>
-                <wp:extent cx="5724525" cy="216535"/>
-                <wp:effectExtent l="0" t="0" r="0" b="0"/>
-                <wp:wrapTopAndBottom/>
-                <wp:docPr id="535" name="Group 535"/>
-                <wp:cNvGraphicFramePr>
-                  <a:graphicFrameLocks xmlns:a="http://schemas.openxmlformats.org/drawingml/2006/main"/>
-                </wp:cNvGraphicFramePr>
-                <a:graphic xmlns:a="http://schemas.openxmlformats.org/drawingml/2006/main">
-                  <a:graphicData uri="http://schemas.microsoft.com/office/word/2010/wordprocessingGroup">
-                    <wpg:wgp>
-                      <wpg:cNvGrpSpPr>
-                        <a:grpSpLocks/>
-                      </wpg:cNvGrpSpPr>
-                      <wpg:grpSpPr>
-                        <a:xfrm>
-                          <a:off x="0" y="0"/>
-                          <a:ext cx="5724525" cy="216535"/>
-                          <a:chOff x="0" y="0"/>
-                          <a:chExt cx="5724525" cy="216535"/>
-                        </a:xfrm>
-                      </wpg:grpSpPr>
-                      <wps:wsp>
-                        <wps:cNvPr id="536" name="Graphic 536"/>
-                        <wps:cNvSpPr/>
-                        <wps:spPr>
-                          <a:xfrm>
-                            <a:off x="0" y="92848"/>
-                            <a:ext cx="5724525" cy="46990"/>
-                          </a:xfrm>
-                          <a:custGeom>
-                            <a:avLst/>
-                            <a:gdLst/>
-                            <a:ahLst/>
-                            <a:cxnLst/>
-                            <a:rect l="l" t="t" r="r" b="b"/>
-                            <a:pathLst>
-                              <a:path w="5724525" h="46990">
-                                <a:moveTo>
-                                  <a:pt x="5724042" y="0"/>
-                                </a:moveTo>
-                                <a:lnTo>
-                                  <a:pt x="0" y="0"/>
-                                </a:lnTo>
-                                <a:lnTo>
-                                  <a:pt x="0" y="46799"/>
-                                </a:lnTo>
-                                <a:lnTo>
-                                  <a:pt x="5724042" y="46799"/>
-                                </a:lnTo>
-                                <a:lnTo>
-                                  <a:pt x="5724042" y="0"/>
-                                </a:lnTo>
-                                <a:close/>
-                              </a:path>
-                            </a:pathLst>
-                          </a:custGeom>
-                          <a:solidFill>
-                            <a:srgbClr val="A6A6A6"/>
-                          </a:solidFill>
-                        </wps:spPr>
-                        <wps:bodyPr wrap="square" lIns="0" tIns="0" rIns="0" bIns="0" rtlCol="0">
-                          <a:prstTxWarp prst="textNoShape">
-                            <a:avLst/>
-                          </a:prstTxWarp>
-                          <a:noAutofit/>
-                        </wps:bodyPr>
-                      </wps:wsp>
-                      <wps:wsp>
-                        <wps:cNvPr id="537" name="Graphic 537"/>
-                        <wps:cNvSpPr/>
-                        <wps:spPr>
-                          <a:xfrm>
-                            <a:off x="189896" y="13500"/>
-                            <a:ext cx="189230" cy="189230"/>
-                          </a:xfrm>
-                          <a:custGeom>
-                            <a:avLst/>
-                            <a:gdLst/>
-                            <a:ahLst/>
-                            <a:cxnLst/>
-                            <a:rect l="l" t="t" r="r" b="b"/>
-                            <a:pathLst>
-                              <a:path w="189230" h="189230">
-                                <a:moveTo>
-                                  <a:pt x="94500" y="0"/>
-                                </a:moveTo>
-                                <a:lnTo>
-                                  <a:pt x="57714" y="7427"/>
-                                </a:lnTo>
-                                <a:lnTo>
-                                  <a:pt x="27676" y="27681"/>
-                                </a:lnTo>
-                                <a:lnTo>
-                                  <a:pt x="7425" y="57719"/>
-                                </a:lnTo>
-                                <a:lnTo>
-                                  <a:pt x="0" y="94500"/>
-                                </a:lnTo>
-                                <a:lnTo>
-                                  <a:pt x="7425" y="131287"/>
-                                </a:lnTo>
-                                <a:lnTo>
-                                  <a:pt x="27676" y="161324"/>
-                                </a:lnTo>
-                                <a:lnTo>
-                                  <a:pt x="57714" y="181575"/>
-                                </a:lnTo>
-                                <a:lnTo>
-                                  <a:pt x="94500" y="189001"/>
-                                </a:lnTo>
-                                <a:lnTo>
-                                  <a:pt x="131287" y="181575"/>
-                                </a:lnTo>
-                                <a:lnTo>
-                                  <a:pt x="161324" y="161324"/>
-                                </a:lnTo>
-                                <a:lnTo>
-                                  <a:pt x="181575" y="131287"/>
-                                </a:lnTo>
-                                <a:lnTo>
-                                  <a:pt x="189001" y="94500"/>
-                                </a:lnTo>
-                                <a:lnTo>
-                                  <a:pt x="181575" y="57719"/>
-                                </a:lnTo>
-                                <a:lnTo>
-                                  <a:pt x="161324" y="27681"/>
-                                </a:lnTo>
-                                <a:lnTo>
-                                  <a:pt x="131287" y="7427"/>
-                                </a:lnTo>
-                                <a:lnTo>
-                                  <a:pt x="94500" y="0"/>
-                                </a:lnTo>
-                                <a:close/>
-                              </a:path>
-                            </a:pathLst>
-                          </a:custGeom>
-                          <a:solidFill>
-                            <a:srgbClr val="797979"/>
-                          </a:solidFill>
-                        </wps:spPr>
-                        <wps:bodyPr wrap="square" lIns="0" tIns="0" rIns="0" bIns="0" rtlCol="0">
-                          <a:prstTxWarp prst="textNoShape">
-                            <a:avLst/>
-                          </a:prstTxWarp>
-                          <a:noAutofit/>
-                        </wps:bodyPr>
-                      </wps:wsp>
-                      <wps:wsp>
-                        <wps:cNvPr id="538" name="Graphic 538"/>
-                        <wps:cNvSpPr/>
-                        <wps:spPr>
-                          <a:xfrm>
-                            <a:off x="189896" y="13500"/>
-                            <a:ext cx="189230" cy="189230"/>
-                          </a:xfrm>
-                          <a:custGeom>
-                            <a:avLst/>
-                            <a:gdLst/>
-                            <a:ahLst/>
-                            <a:cxnLst/>
-                            <a:rect l="l" t="t" r="r" b="b"/>
-                            <a:pathLst>
-                              <a:path w="189230" h="189230">
-                                <a:moveTo>
-                                  <a:pt x="94500" y="189001"/>
-                                </a:moveTo>
-                                <a:lnTo>
-                                  <a:pt x="131287" y="181575"/>
-                                </a:lnTo>
-                                <a:lnTo>
-                                  <a:pt x="161324" y="161324"/>
-                                </a:lnTo>
-                                <a:lnTo>
-                                  <a:pt x="181575" y="131287"/>
-                                </a:lnTo>
-                                <a:lnTo>
-                                  <a:pt x="189001" y="94500"/>
-                                </a:lnTo>
-                                <a:lnTo>
-                                  <a:pt x="181575" y="57719"/>
-                                </a:lnTo>
-                                <a:lnTo>
-                                  <a:pt x="161324" y="27681"/>
-                                </a:lnTo>
-                                <a:lnTo>
-                                  <a:pt x="131287" y="7427"/>
-                                </a:lnTo>
-                                <a:lnTo>
-                                  <a:pt x="94500" y="0"/>
-                                </a:lnTo>
-                                <a:lnTo>
-                                  <a:pt x="57714" y="7427"/>
-                                </a:lnTo>
-                                <a:lnTo>
-                                  <a:pt x="27676" y="27681"/>
-                                </a:lnTo>
-                                <a:lnTo>
-                                  <a:pt x="7425" y="57719"/>
-                                </a:lnTo>
-                                <a:lnTo>
-                                  <a:pt x="0" y="94500"/>
-                                </a:lnTo>
-                                <a:lnTo>
-                                  <a:pt x="7425" y="131287"/>
-                                </a:lnTo>
-                                <a:lnTo>
-                                  <a:pt x="27676" y="161324"/>
-                                </a:lnTo>
-                                <a:lnTo>
-                                  <a:pt x="57714" y="181575"/>
-                                </a:lnTo>
-                                <a:lnTo>
-                                  <a:pt x="94500" y="189001"/>
-                                </a:lnTo>
-                                <a:close/>
-                              </a:path>
-                            </a:pathLst>
-                          </a:custGeom>
-                          <a:ln w="27000">
-                            <a:solidFill>
-                              <a:srgbClr val="E0E0E0"/>
-                            </a:solidFill>
-                            <a:prstDash val="solid"/>
-                          </a:ln>
-                        </wps:spPr>
-                        <wps:bodyPr wrap="square" lIns="0" tIns="0" rIns="0" bIns="0" rtlCol="0">
-                          <a:prstTxWarp prst="textNoShape">
-                            <a:avLst/>
-                          </a:prstTxWarp>
-                          <a:noAutofit/>
-                        </wps:bodyPr>
-                      </wps:wsp>
-                      <wps:wsp>
-                        <wps:cNvPr id="539" name="Graphic 539"/>
-                        <wps:cNvSpPr/>
-                        <wps:spPr>
-                          <a:xfrm>
-                            <a:off x="405895" y="13500"/>
-                            <a:ext cx="189230" cy="189230"/>
-                          </a:xfrm>
-                          <a:custGeom>
-                            <a:avLst/>
-                            <a:gdLst/>
-                            <a:ahLst/>
-                            <a:cxnLst/>
-                            <a:rect l="l" t="t" r="r" b="b"/>
-                            <a:pathLst>
-                              <a:path w="189230" h="189230">
-                                <a:moveTo>
-                                  <a:pt x="94500" y="0"/>
-                                </a:moveTo>
-                                <a:lnTo>
-                                  <a:pt x="57714" y="7427"/>
-                                </a:lnTo>
-                                <a:lnTo>
-                                  <a:pt x="27676" y="27681"/>
-                                </a:lnTo>
-                                <a:lnTo>
-                                  <a:pt x="7425" y="57719"/>
-                                </a:lnTo>
-                                <a:lnTo>
-                                  <a:pt x="0" y="94500"/>
-                                </a:lnTo>
-                                <a:lnTo>
-                                  <a:pt x="7425" y="131287"/>
-                                </a:lnTo>
-                                <a:lnTo>
-                                  <a:pt x="27676" y="161324"/>
-                                </a:lnTo>
-                                <a:lnTo>
-                                  <a:pt x="57714" y="181575"/>
-                                </a:lnTo>
-                                <a:lnTo>
-                                  <a:pt x="94500" y="189001"/>
-                                </a:lnTo>
-                                <a:lnTo>
-                                  <a:pt x="131287" y="181575"/>
-                                </a:lnTo>
-                                <a:lnTo>
-                                  <a:pt x="161324" y="161324"/>
-                                </a:lnTo>
-                                <a:lnTo>
-                                  <a:pt x="181575" y="131287"/>
-                                </a:lnTo>
-                                <a:lnTo>
-                                  <a:pt x="189001" y="94500"/>
-                                </a:lnTo>
-                                <a:lnTo>
-                                  <a:pt x="181575" y="57719"/>
-                                </a:lnTo>
-                                <a:lnTo>
-                                  <a:pt x="161324" y="27681"/>
-                                </a:lnTo>
-                                <a:lnTo>
-                                  <a:pt x="131287" y="7427"/>
-                                </a:lnTo>
-                                <a:lnTo>
-                                  <a:pt x="94500" y="0"/>
-                                </a:lnTo>
-                                <a:close/>
-                              </a:path>
-                            </a:pathLst>
-                          </a:custGeom>
-                          <a:solidFill>
-                            <a:srgbClr val="797979"/>
-                          </a:solidFill>
-                        </wps:spPr>
-                        <wps:bodyPr wrap="square" lIns="0" tIns="0" rIns="0" bIns="0" rtlCol="0">
-                          <a:prstTxWarp prst="textNoShape">
-                            <a:avLst/>
-                          </a:prstTxWarp>
-                          <a:noAutofit/>
-                        </wps:bodyPr>
-                      </wps:wsp>
-                      <wps:wsp>
-                        <wps:cNvPr id="540" name="Graphic 540"/>
-                        <wps:cNvSpPr/>
-                        <wps:spPr>
-                          <a:xfrm>
-                            <a:off x="405895" y="13500"/>
-                            <a:ext cx="189230" cy="189230"/>
-                          </a:xfrm>
-                          <a:custGeom>
-                            <a:avLst/>
-                            <a:gdLst/>
-                            <a:ahLst/>
-                            <a:cxnLst/>
-                            <a:rect l="l" t="t" r="r" b="b"/>
-                            <a:pathLst>
-                              <a:path w="189230" h="189230">
-                                <a:moveTo>
-                                  <a:pt x="94500" y="189001"/>
-                                </a:moveTo>
-                                <a:lnTo>
-                                  <a:pt x="131287" y="181575"/>
-                                </a:lnTo>
-                                <a:lnTo>
-                                  <a:pt x="161324" y="161324"/>
-                                </a:lnTo>
-                                <a:lnTo>
-                                  <a:pt x="181575" y="131287"/>
-                                </a:lnTo>
-                                <a:lnTo>
-                                  <a:pt x="189001" y="94500"/>
-                                </a:lnTo>
-                                <a:lnTo>
-                                  <a:pt x="181575" y="57719"/>
-                                </a:lnTo>
-                                <a:lnTo>
-                                  <a:pt x="161324" y="27681"/>
-                                </a:lnTo>
-                                <a:lnTo>
-                                  <a:pt x="131287" y="7427"/>
-                                </a:lnTo>
-                                <a:lnTo>
-                                  <a:pt x="94500" y="0"/>
-                                </a:lnTo>
-                                <a:lnTo>
-                                  <a:pt x="57714" y="7427"/>
-                                </a:lnTo>
-                                <a:lnTo>
-                                  <a:pt x="27676" y="27681"/>
-                                </a:lnTo>
-                                <a:lnTo>
-                                  <a:pt x="7425" y="57719"/>
-                                </a:lnTo>
-                                <a:lnTo>
-                                  <a:pt x="0" y="94500"/>
-                                </a:lnTo>
-                                <a:lnTo>
-                                  <a:pt x="7425" y="131287"/>
-                                </a:lnTo>
-                                <a:lnTo>
-                                  <a:pt x="27676" y="161324"/>
-                                </a:lnTo>
-                                <a:lnTo>
-                                  <a:pt x="57714" y="181575"/>
-                                </a:lnTo>
-                                <a:lnTo>
-                                  <a:pt x="94500" y="189001"/>
-                                </a:lnTo>
-                                <a:close/>
-                              </a:path>
-                            </a:pathLst>
-                          </a:custGeom>
-                          <a:ln w="27000">
-                            <a:solidFill>
-                              <a:srgbClr val="E0E0E0"/>
-                            </a:solidFill>
-                            <a:prstDash val="solid"/>
-                          </a:ln>
-                        </wps:spPr>
-                        <wps:bodyPr wrap="square" lIns="0" tIns="0" rIns="0" bIns="0" rtlCol="0">
-                          <a:prstTxWarp prst="textNoShape">
-                            <a:avLst/>
-                          </a:prstTxWarp>
-                          <a:noAutofit/>
-                        </wps:bodyPr>
-                      </wps:wsp>
-                      <wps:wsp>
-                        <wps:cNvPr id="541" name="Graphic 541"/>
-                        <wps:cNvSpPr/>
-                        <wps:spPr>
-                          <a:xfrm>
-                            <a:off x="621896" y="13500"/>
-                            <a:ext cx="189230" cy="189230"/>
-                          </a:xfrm>
-                          <a:custGeom>
-                            <a:avLst/>
-                            <a:gdLst/>
-                            <a:ahLst/>
-                            <a:cxnLst/>
-                            <a:rect l="l" t="t" r="r" b="b"/>
-                            <a:pathLst>
-                              <a:path w="189230" h="189230">
-                                <a:moveTo>
-                                  <a:pt x="94500" y="0"/>
-                                </a:moveTo>
-                                <a:lnTo>
-                                  <a:pt x="57714" y="7427"/>
-                                </a:lnTo>
-                                <a:lnTo>
-                                  <a:pt x="27676" y="27681"/>
-                                </a:lnTo>
-                                <a:lnTo>
-                                  <a:pt x="7425" y="57719"/>
-                                </a:lnTo>
-                                <a:lnTo>
-                                  <a:pt x="0" y="94500"/>
-                                </a:lnTo>
-                                <a:lnTo>
-                                  <a:pt x="7425" y="131287"/>
-                                </a:lnTo>
-                                <a:lnTo>
-                                  <a:pt x="27676" y="161324"/>
-                                </a:lnTo>
-                                <a:lnTo>
-                                  <a:pt x="57714" y="181575"/>
-                                </a:lnTo>
-                                <a:lnTo>
-                                  <a:pt x="94500" y="189001"/>
-                                </a:lnTo>
-                                <a:lnTo>
-                                  <a:pt x="131287" y="181575"/>
-                                </a:lnTo>
-                                <a:lnTo>
-                                  <a:pt x="161324" y="161324"/>
-                                </a:lnTo>
-                                <a:lnTo>
-                                  <a:pt x="181575" y="131287"/>
-                                </a:lnTo>
-                                <a:lnTo>
-                                  <a:pt x="189001" y="94500"/>
-                                </a:lnTo>
-                                <a:lnTo>
-                                  <a:pt x="181575" y="57719"/>
-                                </a:lnTo>
-                                <a:lnTo>
-                                  <a:pt x="161324" y="27681"/>
-                                </a:lnTo>
-                                <a:lnTo>
-                                  <a:pt x="131287" y="7427"/>
-                                </a:lnTo>
-                                <a:lnTo>
-                                  <a:pt x="94500" y="0"/>
-                                </a:lnTo>
-                                <a:close/>
-                              </a:path>
-                            </a:pathLst>
-                          </a:custGeom>
-                          <a:solidFill>
-                            <a:srgbClr val="797979"/>
-                          </a:solidFill>
-                        </wps:spPr>
-                        <wps:bodyPr wrap="square" lIns="0" tIns="0" rIns="0" bIns="0" rtlCol="0">
-                          <a:prstTxWarp prst="textNoShape">
-                            <a:avLst/>
-                          </a:prstTxWarp>
-                          <a:noAutofit/>
-                        </wps:bodyPr>
-                      </wps:wsp>
-                      <wps:wsp>
-                        <wps:cNvPr id="542" name="Graphic 542"/>
-                        <wps:cNvSpPr/>
-                        <wps:spPr>
-                          <a:xfrm>
-                            <a:off x="621896" y="13500"/>
-                            <a:ext cx="189230" cy="189230"/>
-                          </a:xfrm>
-                          <a:custGeom>
-                            <a:avLst/>
-                            <a:gdLst/>
-                            <a:ahLst/>
-                            <a:cxnLst/>
-                            <a:rect l="l" t="t" r="r" b="b"/>
-                            <a:pathLst>
-                              <a:path w="189230" h="189230">
-                                <a:moveTo>
-                                  <a:pt x="94500" y="189001"/>
-                                </a:moveTo>
-                                <a:lnTo>
-                                  <a:pt x="131287" y="181575"/>
-                                </a:lnTo>
-                                <a:lnTo>
-                                  <a:pt x="161324" y="161324"/>
-                                </a:lnTo>
-                                <a:lnTo>
-                                  <a:pt x="181575" y="131287"/>
-                                </a:lnTo>
-                                <a:lnTo>
-                                  <a:pt x="189001" y="94500"/>
-                                </a:lnTo>
-                                <a:lnTo>
-                                  <a:pt x="181575" y="57719"/>
-                                </a:lnTo>
-                                <a:lnTo>
-                                  <a:pt x="161324" y="27681"/>
-                                </a:lnTo>
-                                <a:lnTo>
-                                  <a:pt x="131287" y="7427"/>
-                                </a:lnTo>
-                                <a:lnTo>
-                                  <a:pt x="94500" y="0"/>
-                                </a:lnTo>
-                                <a:lnTo>
-                                  <a:pt x="57714" y="7427"/>
-                                </a:lnTo>
-                                <a:lnTo>
-                                  <a:pt x="27676" y="27681"/>
-                                </a:lnTo>
-                                <a:lnTo>
-                                  <a:pt x="7425" y="57719"/>
-                                </a:lnTo>
-                                <a:lnTo>
-                                  <a:pt x="0" y="94500"/>
-                                </a:lnTo>
-                                <a:lnTo>
-                                  <a:pt x="7425" y="131287"/>
-                                </a:lnTo>
-                                <a:lnTo>
-                                  <a:pt x="27676" y="161324"/>
-                                </a:lnTo>
-                                <a:lnTo>
-                                  <a:pt x="57714" y="181575"/>
-                                </a:lnTo>
-                                <a:lnTo>
-                                  <a:pt x="94500" y="189001"/>
-                                </a:lnTo>
-                                <a:close/>
-                              </a:path>
-                            </a:pathLst>
-                          </a:custGeom>
-                          <a:ln w="27000">
-                            <a:solidFill>
-                              <a:srgbClr val="E0E0E0"/>
-                            </a:solidFill>
-                            <a:prstDash val="solid"/>
-                          </a:ln>
-                        </wps:spPr>
-                        <wps:bodyPr wrap="square" lIns="0" tIns="0" rIns="0" bIns="0" rtlCol="0">
-                          <a:prstTxWarp prst="textNoShape">
-                            <a:avLst/>
-                          </a:prstTxWarp>
-                          <a:noAutofit/>
-                        </wps:bodyPr>
-                      </wps:wsp>
-                      <wps:wsp>
-                        <wps:cNvPr id="543" name="Graphic 543"/>
-                        <wps:cNvSpPr/>
-                        <wps:spPr>
-                          <a:xfrm>
-                            <a:off x="837896" y="13500"/>
-                            <a:ext cx="189230" cy="189230"/>
-                          </a:xfrm>
-                          <a:custGeom>
-                            <a:avLst/>
-                            <a:gdLst/>
-                            <a:ahLst/>
-                            <a:cxnLst/>
-                            <a:rect l="l" t="t" r="r" b="b"/>
-                            <a:pathLst>
-                              <a:path w="189230" h="189230">
-                                <a:moveTo>
-                                  <a:pt x="94500" y="0"/>
-                                </a:moveTo>
-                                <a:lnTo>
-                                  <a:pt x="57714" y="7427"/>
-                                </a:lnTo>
-                                <a:lnTo>
-                                  <a:pt x="27676" y="27681"/>
-                                </a:lnTo>
-                                <a:lnTo>
-                                  <a:pt x="7425" y="57719"/>
-                                </a:lnTo>
-                                <a:lnTo>
-                                  <a:pt x="0" y="94500"/>
-                                </a:lnTo>
-                                <a:lnTo>
-                                  <a:pt x="7425" y="131287"/>
-                                </a:lnTo>
-                                <a:lnTo>
-                                  <a:pt x="27676" y="161324"/>
-                                </a:lnTo>
-                                <a:lnTo>
-                                  <a:pt x="57714" y="181575"/>
-                                </a:lnTo>
-                                <a:lnTo>
-                                  <a:pt x="94500" y="189001"/>
-                                </a:lnTo>
-                                <a:lnTo>
-                                  <a:pt x="131287" y="181575"/>
-                                </a:lnTo>
-                                <a:lnTo>
-                                  <a:pt x="161324" y="161324"/>
-                                </a:lnTo>
-                                <a:lnTo>
-                                  <a:pt x="181575" y="131287"/>
-                                </a:lnTo>
-                                <a:lnTo>
-                                  <a:pt x="189001" y="94500"/>
-                                </a:lnTo>
-                                <a:lnTo>
-                                  <a:pt x="181575" y="57719"/>
-                                </a:lnTo>
-                                <a:lnTo>
-                                  <a:pt x="161324" y="27681"/>
-                                </a:lnTo>
-                                <a:lnTo>
-                                  <a:pt x="131287" y="7427"/>
-                                </a:lnTo>
-                                <a:lnTo>
-                                  <a:pt x="94500" y="0"/>
-                                </a:lnTo>
-                                <a:close/>
-                              </a:path>
-                            </a:pathLst>
-                          </a:custGeom>
-                          <a:solidFill>
-                            <a:srgbClr val="797979"/>
-                          </a:solidFill>
-                        </wps:spPr>
-                        <wps:bodyPr wrap="square" lIns="0" tIns="0" rIns="0" bIns="0" rtlCol="0">
-                          <a:prstTxWarp prst="textNoShape">
-                            <a:avLst/>
-                          </a:prstTxWarp>
-                          <a:noAutofit/>
-                        </wps:bodyPr>
-                      </wps:wsp>
-                      <wps:wsp>
-                        <wps:cNvPr id="544" name="Graphic 544"/>
-                        <wps:cNvSpPr/>
-                        <wps:spPr>
-                          <a:xfrm>
-                            <a:off x="837896" y="13500"/>
-                            <a:ext cx="189230" cy="189230"/>
-                          </a:xfrm>
-                          <a:custGeom>
-                            <a:avLst/>
-                            <a:gdLst/>
-                            <a:ahLst/>
-                            <a:cxnLst/>
-                            <a:rect l="l" t="t" r="r" b="b"/>
-                            <a:pathLst>
-                              <a:path w="189230" h="189230">
-                                <a:moveTo>
-                                  <a:pt x="94500" y="189001"/>
-                                </a:moveTo>
-                                <a:lnTo>
-                                  <a:pt x="131287" y="181575"/>
-                                </a:lnTo>
-                                <a:lnTo>
-                                  <a:pt x="161324" y="161324"/>
-                                </a:lnTo>
-                                <a:lnTo>
-                                  <a:pt x="181575" y="131287"/>
-                                </a:lnTo>
-                                <a:lnTo>
-                                  <a:pt x="189001" y="94500"/>
-                                </a:lnTo>
-                                <a:lnTo>
-                                  <a:pt x="181575" y="57719"/>
-                                </a:lnTo>
-                                <a:lnTo>
-                                  <a:pt x="161324" y="27681"/>
-                                </a:lnTo>
-                                <a:lnTo>
-                                  <a:pt x="131287" y="7427"/>
-                                </a:lnTo>
-                                <a:lnTo>
-                                  <a:pt x="94500" y="0"/>
-                                </a:lnTo>
-                                <a:lnTo>
-                                  <a:pt x="57714" y="7427"/>
-                                </a:lnTo>
-                                <a:lnTo>
-                                  <a:pt x="27676" y="27681"/>
-                                </a:lnTo>
-                                <a:lnTo>
-                                  <a:pt x="7425" y="57719"/>
-                                </a:lnTo>
-                                <a:lnTo>
-                                  <a:pt x="0" y="94500"/>
-                                </a:lnTo>
-                                <a:lnTo>
-                                  <a:pt x="7425" y="131287"/>
-                                </a:lnTo>
-                                <a:lnTo>
-                                  <a:pt x="27676" y="161324"/>
-                                </a:lnTo>
-                                <a:lnTo>
-                                  <a:pt x="57714" y="181575"/>
-                                </a:lnTo>
-                                <a:lnTo>
-                                  <a:pt x="94500" y="189001"/>
-                                </a:lnTo>
-                                <a:close/>
-                              </a:path>
-                            </a:pathLst>
-                          </a:custGeom>
-                          <a:ln w="27000">
-                            <a:solidFill>
-                              <a:srgbClr val="E0E0E0"/>
-                            </a:solidFill>
-                            <a:prstDash val="solid"/>
-                          </a:ln>
-                        </wps:spPr>
-                        <wps:bodyPr wrap="square" lIns="0" tIns="0" rIns="0" bIns="0" rtlCol="0">
-                          <a:prstTxWarp prst="textNoShape">
-                            <a:avLst/>
-                          </a:prstTxWarp>
-                          <a:noAutofit/>
-                        </wps:bodyPr>
-                      </wps:wsp>
-                      <wps:wsp>
-                        <wps:cNvPr id="545" name="Textbox 545"/>
-                        <wps:cNvSpPr txBox="1"/>
-                        <wps:spPr>
-                          <a:xfrm>
-                            <a:off x="0" y="0"/>
-                            <a:ext cx="5724525" cy="216535"/>
-                          </a:xfrm>
-                          <a:prstGeom prst="rect">
-                            <a:avLst/>
-                          </a:prstGeom>
-                        </wps:spPr>
-                        <wps:txbx>
-                          <w:txbxContent>
-                            <w:p>
-                              <w:pPr>
-                                <w:spacing w:before="57"/>
-                                <w:ind w:left="351"/>
-                                <w:rPr>
-                                  <w:rFonts w:ascii="新細明體" w:eastAsia="新細明體"/>
-                                  <w:sz w:val="18"/>
-                                </w:rPr>
-                              </w:pPr>
-                              <w:r>
-                                <w:rPr>
-                                  <w:rFonts w:ascii="新細明體" w:eastAsia="新細明體" w:hint="eastAsia"/>
-                                  <w:color w:val="FFFFFF"/>
-                                  <w:w w:val="110"/>
-                                  <w:sz w:val="18"/>
-                                </w:rPr>
-                                <w:t>作</w:t>
-                              </w:r>
-                              <w:r>
-                                <w:rPr>
-                                  <w:rFonts w:ascii="新細明體" w:eastAsia="新細明體" w:hint="eastAsia"/>
-                                  <w:color w:val="FFFFFF"/>
-                                  <w:spacing w:val="65"/>
-                                  <w:w w:val="150"/>
-                                  <w:sz w:val="18"/>
-                                </w:rPr>
-                                <w:t xml:space="preserve"> </w:t>
-                              </w:r>
-                              <w:r>
-                                <w:rPr>
-                                  <w:rFonts w:ascii="新細明體" w:eastAsia="新細明體" w:hint="eastAsia"/>
-                                  <w:color w:val="FFFFFF"/>
-                                  <w:w w:val="110"/>
-                                  <w:sz w:val="18"/>
-                                </w:rPr>
-                                <w:t>者</w:t>
-                              </w:r>
-                              <w:r>
-                                <w:rPr>
-                                  <w:rFonts w:ascii="新細明體" w:eastAsia="新細明體" w:hint="eastAsia"/>
-                                  <w:color w:val="FFFFFF"/>
-                                  <w:spacing w:val="73"/>
-                                  <w:w w:val="150"/>
-                                  <w:sz w:val="18"/>
-                                </w:rPr>
-                                <w:t xml:space="preserve"> </w:t>
-                              </w:r>
-                              <w:r>
-                                <w:rPr>
-                                  <w:rFonts w:ascii="新細明體" w:eastAsia="新細明體" w:hint="eastAsia"/>
-                                  <w:color w:val="FFFFFF"/>
-                                  <w:w w:val="110"/>
-                                  <w:sz w:val="18"/>
-                                </w:rPr>
-                                <w:t>簡</w:t>
-                              </w:r>
-                              <w:r>
-                                <w:rPr>
-                                  <w:rFonts w:ascii="新細明體" w:eastAsia="新細明體" w:hint="eastAsia"/>
-                                  <w:color w:val="FFFFFF"/>
-                                  <w:spacing w:val="73"/>
-                                  <w:w w:val="150"/>
-                                  <w:sz w:val="18"/>
-                                </w:rPr>
-                                <w:t xml:space="preserve"> </w:t>
-                              </w:r>
-                              <w:r>
-                                <w:rPr>
-                                  <w:rFonts w:ascii="新細明體" w:eastAsia="新細明體" w:hint="eastAsia"/>
-                                  <w:color w:val="FFFFFF"/>
-                                  <w:spacing w:val="-10"/>
-                                  <w:w w:val="110"/>
-                                  <w:sz w:val="18"/>
-                                </w:rPr>
-                                <w:t>介</w:t>
-                              </w:r>
-                            </w:p>
-                          </w:txbxContent>
-                        </wps:txbx>
-                        <wps:bodyPr wrap="square" lIns="0" tIns="0" rIns="0" bIns="0" rtlCol="0">
-                          <a:noAutofit/>
-                        </wps:bodyPr>
-                      </wps:wsp>
-                    </wpg:wgp>
-                  </a:graphicData>
-                </a:graphic>
-              </wp:anchor>
-            </w:drawing>
-          </mc:Choice>
-          <mc:Fallback>
-            <w:pict>
-              <v:group w14:anchorId="53C85172" id="Group 535" o:spid="_x0000_s1026" style="position:absolute;left:0;text-align:left;margin-left:66.15pt;margin-top:16.2pt;width:450.75pt;height:17.05pt;z-index:-251657216;mso-wrap-distance-left:0;mso-wrap-distance-right:0;mso-position-horizontal-relative:page" coordsize="57245,2165" o:gfxdata="UEsDBBQABgAIAAAAIQC2gziS/gAAAOEBAAATAAAAW0NvbnRlbnRfVHlwZXNdLnhtbJSRQU7DMBBF 90jcwfIWJU67QAgl6YK0S0CoHGBkTxKLZGx5TGhvj5O2G0SRWNoz/78nu9wcxkFMGNg6quQqL6RA 0s5Y6ir5vt9lD1JwBDIwOMJKHpHlpr69KfdHjyxSmriSfYz+USnWPY7AufNIadK6MEJMx9ApD/oD OlTrorhX2lFEilmcO2RdNtjC5xDF9pCuTyYBB5bi6bQ4syoJ3g9WQ0ymaiLzg5KdCXlKLjvcW893 SUOqXwnz5DrgnHtJTxOsQfEKIT7DmDSUCaxw7Rqn8787ZsmRM9e2VmPeBN4uqYvTtW7jvijg9N/y JsXecLq0q+WD6m8AAAD//wMAUEsDBBQABgAIAAAAIQA4/SH/1gAAAJQBAAALAAAAX3JlbHMvLnJl bHOkkMFqwzAMhu+DvYPRfXGawxijTi+j0GvpHsDYimMaW0Yy2fr2M4PBMnrbUb/Q94l/f/hMi1qR JVI2sOt6UJgd+ZiDgffL8ekFlFSbvV0oo4EbChzGx4f9GRdb25HMsYhqlCwG5lrLq9biZkxWOiqY 22YiTra2kYMu1l1tQD30/bPm3wwYN0x18gb45AdQl1tp5j/sFB2T0FQ7R0nTNEV3j6o9feQzro1i OWA14Fm+Q8a1a8+Bvu/d/dMb2JY5uiPbhG/ktn4cqGU/er3pcvwCAAD//wMAUEsDBBQABgAIAAAA IQDjvBVYXgUAAJUzAAAOAAAAZHJzL2Uyb0RvYy54bWzsW1uPozYUfq/U/4B47wQICRdNZrXd2R1V Wm1X2qn22SEkoBJMbWeS+fc9vnFJJgF2p9Pt1IoUDBhz/Pn488fhcP3msC2sh5TQHJcL271ybCst E7zKy83C/uP+wy+hbVGGyhUqcJku7MeU2m9ufv7pel/FqYczXKxSYkEjJY331cLOGKviyYQmWbpF 9ApXaQkn15hsEYNdspmsCNpD69ti4jnOfLLHZFURnKSUwtFbedK+Ee2v12nCfl+vacqsYmGDbUz8 E/G/5P+Tm2sUbwiqsjxRZqBvsGKL8hJuWjd1ixiydiQ/aWqbJwRTvGZXCd5O8HqdJ6noA/TGdY56 c0fwrhJ92cT7TVXDBNAe4fTNzSafHu5I9aX6TKT1UPyIkz8p4DLZV5u4fZ7vb5rKhzXZ8ougE9ZB IPpYI5oemJXAwVng+TNvZlsJnPPc+Ww6k5AnGYzLyWVJ9v7yhRMUy9sK42pj9hV4D20Aot8H0JcM VanAnXIAPhMrX0FfpnPbKtEWvPhOOQw/BEjx20M9jqLaowrQJzGKvNAPJQxP4uTPo0h4Zt1bFCc7 yu5SLABHDx8pk4670iWU6VJyKHWRgPtzxy+E4zPbAscntgWOv5S3rxDj1/FR5EVr3xqxbGFLQ/jZ LX5I77Gox/io8XF1fM+29JCDqU2domzXhWnXqqXP6W0l2pN1/HkQRdwyaE2f11tZr33fcbU1oLq9 pMA0lbfiXRf3rOGA+7cBp7jIVx/youAAULJZviuI9YAA2bdz/lMmt6qBe9JYOgEvLfHqEbxoD26z sOlfO0RS2yp+K8FPOSnpAtGFpS4QVrzDgroE9oSy+8NXRCqrguLCZuA/n7B2VxRrzwD7eQVZl19Z 4rc7htc5dxthm7RI7cDUkU78AnMoOJ1DAcdv8BxywyiMYCaCT7nTmaMoXE8kOOtNAVPON6osB1nP xPa4ariAtp9/ImlLYB6pIh+IZpJIh4583oX2BGlqaFfVrh+4vqgZ+J6A7Ows8YJ5IBGCUuhenFHQ GNAzoDULAvfy5JN2SoslqNpCvZWW1k26U9cLh5rqzt2p51+0lZsoIXBDdxaIpeQsCA2yAL/jXEZB WSqcqr9pZaqo3W+1slXU7gdEGctr9yPdarp/+FpW97tFC5Bed2uQ/mdINoj4z5DsqUDUzK/IsxYq ILqPhYoQHP97ku1QwTmmbfn+AJ5pTasBFNaasQPY8VWRQXeRaLi8l1/McgaKuyHZjg9rUMfI2aLk Qt8LHFAeQtGelbfvHf47ZV4pL28RzaQMFsq3XrqVqjTy94lHyOiUmcXKNpiZfWcWRlKxGfmrvV9v pf40fNHPF13EzIpXxxukC7UA6V2eGmbWTKnBHUPKreDBUYzByF8e430qPnpG/vrwoHokf+HQmBjD ayXZjnQw8lfEPV7qWViTgonmxMcQDHjKaki248Ma1DFMa+Svike/fPTXd0+ZWQTmBsvfuQfjb6K/ l8KvRv4a+csf6zU3KkUrA9U8rvxSK94YUjbyV+Q7jHqPf07+wmvZY/nrjZK/r5VkO9LByF8jfwe8 YvtPvMwcw7RG/v578nd6yszTUcwcTgMjf4dmFPTrnHpy9789N8kP6rHdvO/sZLc1gQkT/f0hMsx8 yBA6lr8irWhwjOG1kqyRv6cU1r9GPM+roO7DuEl+EOmGz5XLZ+QvhHt0MuuPm/vrQ9qCZOZ7SNdd 4oM1g0Pd93IWO/yKIX5XR4UvZtKLJRfFOvn3zNcGgIjO/uVZ0TyNXuVP8wR5kQJzBJ7MtD9K4maH 5UEZ+0z53AOyssV3DvDtB8TqOx+XtPdFHL/5mubmbwAAAP//AwBQSwMEFAAGAAgAAAAhAFbQhYnf AAAACgEAAA8AAABkcnMvZG93bnJldi54bWxMj0FLw0AQhe+C/2EZwZvdJGuDxGxKKeqpCLaCeNsm 0yQ0Oxuy2yT9905P9viYjzffy1ez7cSIg28daYgXEQik0lUt1Rq+9+9PLyB8MFSZzhFquKCHVXF/ l5uschN94bgLteAS8pnR0ITQZ1L6skFr/ML1SHw7usGawHGoZTWYicttJ5MoSqU1LfGHxvS4abA8 7c5Ww8dkprWK38bt6bi5/O6Xnz/bGLV+fJjXryACzuEfhqs+q0PBTgd3psqLjrNKFKMaVPIM4gpE SvGYg4Y0XYIscnk7ofgDAAD//wMAUEsBAi0AFAAGAAgAAAAhALaDOJL+AAAA4QEAABMAAAAAAAAA AAAAAAAAAAAAAFtDb250ZW50X1R5cGVzXS54bWxQSwECLQAUAAYACAAAACEAOP0h/9YAAACUAQAA CwAAAAAAAAAAAAAAAAAvAQAAX3JlbHMvLnJlbHNQSwECLQAUAAYACAAAACEA47wVWF4FAACVMwAA DgAAAAAAAAAAAAAAAAAuAgAAZHJzL2Uyb0RvYy54bWxQSwECLQAUAAYACAAAACEAVtCFid8AAAAK AQAADwAAAAAAAAAAAAAAAAC4BwAAZHJzL2Rvd25yZXYueG1sUEsFBgAAAAAEAAQA8wAAAMQIAAAA AA== ">
-                <v:shape id="Graphic 536" o:spid="_x0000_s1027" style="position:absolute;top:928;width:57245;height:470;visibility:visible;mso-wrap-style:square;v-text-anchor:top" coordsize="5724525,46990" o:gfxdata="UEsDBBQABgAIAAAAIQDb4fbL7gAAAIUBAAATAAAAW0NvbnRlbnRfVHlwZXNdLnhtbHyQz07DMAyH 70i8Q+QralM4IITa7kDhCAiNB7ASt43WOlEcyvb2pNu4IODoPz9/n1xv9vOkForiPDdwXVagiI23 jocG3rdPxR0oScgWJ8/UwIEENu3lRb09BBKV0ywNjCmFe63FjDSjlD4Q50nv44wpl3HQAc0OB9I3 VXWrjedEnIq03oC27qjHjympx31un0wiTQLq4bS4shrAECZnMGVTvbD9QSnOhDInjzsyuiBXWQP0 r4R18jfgnHvJr4nOknrFmJ5xzhraRtHWf3Kkpfz/yGo5S+H73hkquyhdjr3R8m2lj09svwAAAP// AwBQSwMEFAAGAAgAAAAhAFr0LFu/AAAAFQEAAAsAAABfcmVscy8ucmVsc2zPwWrDMAwG4Ptg72B0 X5TuUMaI01uh19I+gLGVxCy2jGSy9e1nemrHjpL4P0nD4SetZiPRyNnCruvBUPYcYp4tXC/Htw8w Wl0ObuVMFm6kcBhfX4Yzra62kC6xqGlKVgtLreUTUf1CyWnHhXKbTCzJ1VbKjMX5LzcTvvf9HuXR gPHJNKdgQU5hB+ZyK23zHztFL6w81c5zQp6m6P9TMfB3PtPWFCczVQtB9N4U2rp2HOA44NMz4y8A AAD//wMAUEsDBBQABgAIAAAAIQAC1V0IxAAAANwAAAAPAAAAZHJzL2Rvd25yZXYueG1sRI9Ba8JA FITvBf/D8gRvddNoQ4muIhVBRJBavb9mn9nQ7Ns0u2r8965Q8DjMzDfMdN7ZWlyo9ZVjBW/DBARx 4XTFpYLD9+r1A4QPyBprx6TgRh7ms97LFHPtrvxFl30oRYSwz1GBCaHJpfSFIYt+6Bri6J1cazFE 2ZZSt3iNcFvLNEkyabHiuGCwoU9Dxe/+bBUcl5t06/4WaVn9HA9jfcuWO7NRatDvFhMQgbrwDP+3 11rB+yiDx5l4BOTsDgAA//8DAFBLAQItABQABgAIAAAAIQDb4fbL7gAAAIUBAAATAAAAAAAAAAAA AAAAAAAAAABbQ29udGVudF9UeXBlc10ueG1sUEsBAi0AFAAGAAgAAAAhAFr0LFu/AAAAFQEAAAsA AAAAAAAAAAAAAAAAHwEAAF9yZWxzLy5yZWxzUEsBAi0AFAAGAAgAAAAhAALVXQjEAAAA3AAAAA8A AAAAAAAAAAAAAAAABwIAAGRycy9kb3ducmV2LnhtbFBLBQYAAAAAAwADALcAAAD4AgAAAAA= " path="m5724042,l,,,46799r5724042,l5724042,xe" fillcolor="#a6a6a6" stroked="f">
-                  <v:path arrowok="t"/>
-                </v:shape>
-                <v:shape id="Graphic 537" o:spid="_x0000_s1028" style="position:absolute;left:1898;top:135;width:1893;height:1892;visibility:visible;mso-wrap-style:square;v-text-anchor:top" coordsize="189230,189230" o:gfxdata="UEsDBBQABgAIAAAAIQDb4fbL7gAAAIUBAAATAAAAW0NvbnRlbnRfVHlwZXNdLnhtbHyQz07DMAyH 70i8Q+QralM4IITa7kDhCAiNB7ASt43WOlEcyvb2pNu4IODoPz9/n1xv9vOkForiPDdwXVagiI23 jocG3rdPxR0oScgWJ8/UwIEENu3lRb09BBKV0ywNjCmFe63FjDSjlD4Q50nv44wpl3HQAc0OB9I3 VXWrjedEnIq03oC27qjHjympx31un0wiTQLq4bS4shrAECZnMGVTvbD9QSnOhDInjzsyuiBXWQP0 r4R18jfgnHvJr4nOknrFmJ5xzhraRtHWf3Kkpfz/yGo5S+H73hkquyhdjr3R8m2lj09svwAAAP// AwBQSwMEFAAGAAgAAAAhAFr0LFu/AAAAFQEAAAsAAABfcmVscy8ucmVsc2zPwWrDMAwG4Ptg72B0 X5TuUMaI01uh19I+gLGVxCy2jGSy9e1nemrHjpL4P0nD4SetZiPRyNnCruvBUPYcYp4tXC/Htw8w Wl0ObuVMFm6kcBhfX4Yzra62kC6xqGlKVgtLreUTUf1CyWnHhXKbTCzJ1VbKjMX5LzcTvvf9HuXR gPHJNKdgQU5hB+ZyK23zHztFL6w81c5zQp6m6P9TMfB3PtPWFCczVQtB9N4U2rp2HOA44NMz4y8A AAD//wMAUEsDBBQABgAIAAAAIQAbcCb0xgAAANwAAAAPAAAAZHJzL2Rvd25yZXYueG1sRI9PS8NA FMTvQr/D8gq9BLuxYpXYbSkRRTxp/9wf2ddNaPZtml2T1U/vCoLHYWZ+w6w20bZioN43jhXczHMQ xJXTDRsFh/3z9QMIH5A1to5JwRd52KwnVysstBv5g4ZdMCJB2BeooA6hK6T0VU0W/dx1xMk7ud5i SLI3Uvc4Jrht5SLPl9Jiw2mhxo7Kmqrz7tMqMKesG17eTHbJj2MW38un8hK/lZpN4/YRRKAY/sN/ 7Vet4O72Hn7PpCMg1z8AAAD//wMAUEsBAi0AFAAGAAgAAAAhANvh9svuAAAAhQEAABMAAAAAAAAA AAAAAAAAAAAAAFtDb250ZW50X1R5cGVzXS54bWxQSwECLQAUAAYACAAAACEAWvQsW78AAAAVAQAA CwAAAAAAAAAAAAAAAAAfAQAAX3JlbHMvLnJlbHNQSwECLQAUAAYACAAAACEAG3Am9MYAAADcAAAA DwAAAAAAAAAAAAAAAAAHAgAAZHJzL2Rvd25yZXYueG1sUEsFBgAAAAADAAMAtwAAAPoCAAAAAA== " path="m94500,l57714,7427,27676,27681,7425,57719,,94500r7425,36787l27676,161324r30038,20251l94500,189001r36787,-7426l161324,161324r20251,-30037l189001,94500,181575,57719,161324,27681,131287,7427,94500,xe" fillcolor="#797979" stroked="f">
-                  <v:path arrowok="t"/>
-                </v:shape>
-                <v:shape id="Graphic 538" o:spid="_x0000_s1029" style="position:absolute;left:1898;top:135;width:1893;height:1892;visibility:visible;mso-wrap-style:square;v-text-anchor:top" coordsize="189230,189230" o:gfxdata="UEsDBBQABgAIAAAAIQDb4fbL7gAAAIUBAAATAAAAW0NvbnRlbnRfVHlwZXNdLnhtbHyQz07DMAyH 70i8Q+QralM4IITa7kDhCAiNB7ASt43WOlEcyvb2pNu4IODoPz9/n1xv9vOkForiPDdwXVagiI23 jocG3rdPxR0oScgWJ8/UwIEENu3lRb09BBKV0ywNjCmFe63FjDSjlD4Q50nv44wpl3HQAc0OB9I3 VXWrjedEnIq03oC27qjHjympx31un0wiTQLq4bS4shrAECZnMGVTvbD9QSnOhDInjzsyuiBXWQP0 r4R18jfgnHvJr4nOknrFmJ5xzhraRtHWf3Kkpfz/yGo5S+H73hkquyhdjr3R8m2lj09svwAAAP// AwBQSwMEFAAGAAgAAAAhAFr0LFu/AAAAFQEAAAsAAABfcmVscy8ucmVsc2zPwWrDMAwG4Ptg72B0 X5TuUMaI01uh19I+gLGVxCy2jGSy9e1nemrHjpL4P0nD4SetZiPRyNnCruvBUPYcYp4tXC/Htw8w Wl0ObuVMFm6kcBhfX4Yzra62kC6xqGlKVgtLreUTUf1CyWnHhXKbTCzJ1VbKjMX5LzcTvvf9HuXR gPHJNKdgQU5hB+ZyK23zHztFL6w81c5zQp6m6P9TMfB3PtPWFCczVQtB9N4U2rp2HOA44NMz4y8A AAD//wMAUEsDBBQABgAIAAAAIQCPXwDyxgAAANwAAAAPAAAAZHJzL2Rvd25yZXYueG1sRE/JbsIw EL0j9R+sqcSlAgcQSwMGlVYFDi1LWpXrKB6SqPE4ig2kf48PlTg+vX22aEwpLlS7wrKCXjcCQZxa XXCm4PvrvTMB4TyyxtIyKfgjB4v5Q2uGsbZXPtAl8ZkIIexiVJB7X8VSujQng65rK+LAnWxt0AdY Z1LXeA3hppT9KBpJgwWHhhwres0p/U3ORsFquRk/fyy3e/e2Tj53P7vBMHs6KtV+bF6mIDw1/i7+ d2+0guEgrA1nwhGQ8xsAAAD//wMAUEsBAi0AFAAGAAgAAAAhANvh9svuAAAAhQEAABMAAAAAAAAA AAAAAAAAAAAAAFtDb250ZW50X1R5cGVzXS54bWxQSwECLQAUAAYACAAAACEAWvQsW78AAAAVAQAA CwAAAAAAAAAAAAAAAAAfAQAAX3JlbHMvLnJlbHNQSwECLQAUAAYACAAAACEAj18A8sYAAADcAAAA DwAAAAAAAAAAAAAAAAAHAgAAZHJzL2Rvd25yZXYueG1sUEsFBgAAAAADAAMAtwAAAPoCAAAAAA== " path="m94500,189001r36787,-7426l161324,161324r20251,-30037l189001,94500,181575,57719,161324,27681,131287,7427,94500,,57714,7427,27676,27681,7425,57719,,94500r7425,36787l27676,161324r30038,20251l94500,189001xe" filled="f" strokecolor="#e0e0e0" strokeweight=".75mm">
-                  <v:path arrowok="t"/>
-                </v:shape>
-                <v:shape id="Graphic 539" o:spid="_x0000_s1030" style="position:absolute;left:4058;top:135;width:1893;height:1892;visibility:visible;mso-wrap-style:square;v-text-anchor:top" coordsize="189230,189230" o:gfxdata="UEsDBBQABgAIAAAAIQDb4fbL7gAAAIUBAAATAAAAW0NvbnRlbnRfVHlwZXNdLnhtbHyQz07DMAyH 70i8Q+QralM4IITa7kDhCAiNB7ASt43WOlEcyvb2pNu4IODoPz9/n1xv9vOkForiPDdwXVagiI23 jocG3rdPxR0oScgWJ8/UwIEENu3lRb09BBKV0ywNjCmFe63FjDSjlD4Q50nv44wpl3HQAc0OB9I3 VXWrjedEnIq03oC27qjHjympx31un0wiTQLq4bS4shrAECZnMGVTvbD9QSnOhDInjzsyuiBXWQP0 r4R18jfgnHvJr4nOknrFmJ5xzhraRtHWf3Kkpfz/yGo5S+H73hkquyhdjr3R8m2lj09svwAAAP// AwBQSwMEFAAGAAgAAAAhAFr0LFu/AAAAFQEAAAsAAABfcmVscy8ucmVsc2zPwWrDMAwG4Ptg72B0 X5TuUMaI01uh19I+gLGVxCy2jGSy9e1nemrHjpL4P0nD4SetZiPRyNnCruvBUPYcYp4tXC/Htw8w Wl0ObuVMFm6kcBhfX4Yzra62kC6xqGlKVgtLreUTUf1CyWnHhXKbTCzJ1VbKjMX5LzcTvvf9HuXR gPHJNKdgQU5hB+ZyK23zHztFL6w81c5zQp6m6P9TMfB3PtPWFCczVQtB9N4U2rp2HOA44NMz4y8A AAD//wMAUEsDBBQABgAIAAAAIQAFoxcdxgAAANwAAAAPAAAAZHJzL2Rvd25yZXYueG1sRI9PS8NA FMTvQr/D8gq9BLuxYtHYbSkRRTxp/9wf2ddNaPZtml2T1U/vCoLHYWZ+w6w20bZioN43jhXczHMQ xJXTDRsFh/3z9T0IH5A1to5JwRd52KwnVysstBv5g4ZdMCJB2BeooA6hK6T0VU0W/dx1xMk7ud5i SLI3Uvc4Jrht5SLPl9Jiw2mhxo7Kmqrz7tMqMKesG17eTHbJj2MW38un8hK/lZpN4/YRRKAY/sN/ 7Vet4O72AX7PpCMg1z8AAAD//wMAUEsBAi0AFAAGAAgAAAAhANvh9svuAAAAhQEAABMAAAAAAAAA AAAAAAAAAAAAAFtDb250ZW50X1R5cGVzXS54bWxQSwECLQAUAAYACAAAACEAWvQsW78AAAAVAQAA CwAAAAAAAAAAAAAAAAAfAQAAX3JlbHMvLnJlbHNQSwECLQAUAAYACAAAACEABaMXHcYAAADcAAAA DwAAAAAAAAAAAAAAAAAHAgAAZHJzL2Rvd25yZXYueG1sUEsFBgAAAAADAAMAtwAAAPoCAAAAAA== " path="m94500,l57714,7427,27676,27681,7425,57719,,94500r7425,36787l27676,161324r30038,20251l94500,189001r36787,-7426l161324,161324r20251,-30037l189001,94500,181575,57719,161324,27681,131287,7427,94500,xe" fillcolor="#797979" stroked="f">
-                  <v:path arrowok="t"/>
-                </v:shape>
-                <v:shape id="Graphic 540" o:spid="_x0000_s1031" style="position:absolute;left:4058;top:135;width:1893;height:1892;visibility:visible;mso-wrap-style:square;v-text-anchor:top" coordsize="189230,189230" o:gfxdata="UEsDBBQABgAIAAAAIQDb4fbL7gAAAIUBAAATAAAAW0NvbnRlbnRfVHlwZXNdLnhtbHyQz07DMAyH 70i8Q+QralM4IITa7kDhCAiNB7ASt43WOlEcyvb2pNu4IODoPz9/n1xv9vOkForiPDdwXVagiI23 jocG3rdPxR0oScgWJ8/UwIEENu3lRb09BBKV0ywNjCmFe63FjDSjlD4Q50nv44wpl3HQAc0OB9I3 VXWrjedEnIq03oC27qjHjympx31un0wiTQLq4bS4shrAECZnMGVTvbD9QSnOhDInjzsyuiBXWQP0 r4R18jfgnHvJr4nOknrFmJ5xzhraRtHWf3Kkpfz/yGo5S+H73hkquyhdjr3R8m2lj09svwAAAP// AwBQSwMEFAAGAAgAAAAhAFr0LFu/AAAAFQEAAAsAAABfcmVscy8ucmVsc2zPwWrDMAwG4Ptg72B0 X5TuUMaI01uh19I+gLGVxCy2jGSy9e1nemrHjpL4P0nD4SetZiPRyNnCruvBUPYcYp4tXC/Htw8w Wl0ObuVMFm6kcBhfX4Yzra62kC6xqGlKVgtLreUTUf1CyWnHhXKbTCzJ1VbKjMX5LzcTvvf9HuXR gPHJNKdgQU5hB+ZyK23zHztFL6w81c5zQp6m6P9TMfB3PtPWFCczVQtB9N4U2rp2HOA44NMz4y8A AAD//wMAUEsDBBQABgAIAAAAIQApL3+JxgAAANwAAAAPAAAAZHJzL2Rvd25yZXYueG1sRE/LTsJA FN2T+A+Ta+KGwFR5qJUpEQjIQq1Wo9ubzrVt7NxpOgOtf+8sSFienPdi2ZtaHKl1lWUF1+MIBHFu dcWFgs+P7egOhPPIGmvLpOCPHCyTi8ECY207fqdj5gsRQtjFqKD0vomldHlJBt3YNsSB+7GtQR9g W0jdYhfCTS1vomguDVYcGkpsaF1S/psdjILdan97/7x6fXObp+wl/Uons2L4rdTVZf/4AMJT78/i k3uvFcymYX44E46ATP4BAAD//wMAUEsBAi0AFAAGAAgAAAAhANvh9svuAAAAhQEAABMAAAAAAAAA AAAAAAAAAAAAAFtDb250ZW50X1R5cGVzXS54bWxQSwECLQAUAAYACAAAACEAWvQsW78AAAAVAQAA CwAAAAAAAAAAAAAAAAAfAQAAX3JlbHMvLnJlbHNQSwECLQAUAAYACAAAACEAKS9/icYAAADcAAAA DwAAAAAAAAAAAAAAAAAHAgAAZHJzL2Rvd25yZXYueG1sUEsFBgAAAAADAAMAtwAAAPoCAAAAAA== " path="m94500,189001r36787,-7426l161324,161324r20251,-30037l189001,94500,181575,57719,161324,27681,131287,7427,94500,,57714,7427,27676,27681,7425,57719,,94500r7425,36787l27676,161324r30038,20251l94500,189001xe" filled="f" strokecolor="#e0e0e0" strokeweight=".75mm">
-                  <v:path arrowok="t"/>
-                </v:shape>
-                <v:shape id="Graphic 541" o:spid="_x0000_s1032" style="position:absolute;left:6218;top:135;width:1893;height:1892;visibility:visible;mso-wrap-style:square;v-text-anchor:top" coordsize="189230,189230" o:gfxdata="UEsDBBQABgAIAAAAIQDb4fbL7gAAAIUBAAATAAAAW0NvbnRlbnRfVHlwZXNdLnhtbHyQz07DMAyH 70i8Q+QralM4IITa7kDhCAiNB7ASt43WOlEcyvb2pNu4IODoPz9/n1xv9vOkForiPDdwXVagiI23 jocG3rdPxR0oScgWJ8/UwIEENu3lRb09BBKV0ywNjCmFe63FjDSjlD4Q50nv44wpl3HQAc0OB9I3 VXWrjedEnIq03oC27qjHjympx31un0wiTQLq4bS4shrAECZnMGVTvbD9QSnOhDInjzsyuiBXWQP0 r4R18jfgnHvJr4nOknrFmJ5xzhraRtHWf3Kkpfz/yGo5S+H73hkquyhdjr3R8m2lj09svwAAAP// AwBQSwMEFAAGAAgAAAAhAFr0LFu/AAAAFQEAAAsAAABfcmVscy8ucmVsc2zPwWrDMAwG4Ptg72B0 X5TuUMaI01uh19I+gLGVxCy2jGSy9e1nemrHjpL4P0nD4SetZiPRyNnCruvBUPYcYp4tXC/Htw8w Wl0ObuVMFm6kcBhfX4Yzra62kC6xqGlKVgtLreUTUf1CyWnHhXKbTCzJ1VbKjMX5LzcTvvf9HuXR gPHJNKdgQU5hB+ZyK23zHztFL6w81c5zQp6m6P9TMfB3PtPWFCczVQtB9N4U2rp2HOA44NMz4y8A AAD//wMAUEsDBBQABgAIAAAAIQCj02hmxgAAANwAAAAPAAAAZHJzL2Rvd25yZXYueG1sRI9BS8NA FITvgv9heQUvod1UtJS02yIRRXqy1d4f2ddNaPZtml2T1V/fFQSPw8x8w6y30bZioN43jhXMZzkI 4srpho2Cz4+X6RKED8gaW8ek4Js8bDe3N2sstBt5T8MhGJEg7AtUUIfQFVL6qiaLfuY64uSdXG8x JNkbqXscE9y28j7PF9Jiw2mhxo7Kmqrz4csqMKesG153JrvkxzGL7+VzeYk/St1N4tMKRKAY/sN/ 7Tet4PFhDr9n0hGQmysAAAD//wMAUEsBAi0AFAAGAAgAAAAhANvh9svuAAAAhQEAABMAAAAAAAAA AAAAAAAAAAAAAFtDb250ZW50X1R5cGVzXS54bWxQSwECLQAUAAYACAAAACEAWvQsW78AAAAVAQAA CwAAAAAAAAAAAAAAAAAfAQAAX3JlbHMvLnJlbHNQSwECLQAUAAYACAAAACEAo9NoZsYAAADcAAAA DwAAAAAAAAAAAAAAAAAHAgAAZHJzL2Rvd25yZXYueG1sUEsFBgAAAAADAAMAtwAAAPoCAAAAAA== " path="m94500,l57714,7427,27676,27681,7425,57719,,94500r7425,36787l27676,161324r30038,20251l94500,189001r36787,-7426l161324,161324r20251,-30037l189001,94500,181575,57719,161324,27681,131287,7427,94500,xe" fillcolor="#797979" stroked="f">
-                  <v:path arrowok="t"/>
-                </v:shape>
-                <v:shape id="Graphic 542" o:spid="_x0000_s1033" style="position:absolute;left:6218;top:135;width:1893;height:1892;visibility:visible;mso-wrap-style:square;v-text-anchor:top" coordsize="189230,189230" o:gfxdata="UEsDBBQABgAIAAAAIQDb4fbL7gAAAIUBAAATAAAAW0NvbnRlbnRfVHlwZXNdLnhtbHyQz07DMAyH 70i8Q+QralM4IITa7kDhCAiNB7ASt43WOlEcyvb2pNu4IODoPz9/n1xv9vOkForiPDdwXVagiI23 jocG3rdPxR0oScgWJ8/UwIEENu3lRb09BBKV0ywNjCmFe63FjDSjlD4Q50nv44wpl3HQAc0OB9I3 VXWrjedEnIq03oC27qjHjympx31un0wiTQLq4bS4shrAECZnMGVTvbD9QSnOhDInjzsyuiBXWQP0 r4R18jfgnHvJr4nOknrFmJ5xzhraRtHWf3Kkpfz/yGo5S+H73hkquyhdjr3R8m2lj09svwAAAP// AwBQSwMEFAAGAAgAAAAhAFr0LFu/AAAAFQEAAAsAAABfcmVscy8ucmVsc2zPwWrDMAwG4Ptg72B0 X5TuUMaI01uh19I+gLGVxCy2jGSy9e1nemrHjpL4P0nD4SetZiPRyNnCruvBUPYcYp4tXC/Htw8w Wl0ObuVMFm6kcBhfX4Yzra62kC6xqGlKVgtLreUTUf1CyWnHhXKbTCzJ1VbKjMX5LzcTvvf9HuXR gPHJNKdgQU5hB+ZyK23zHztFL6w81c5zQp6m6P9TMfB3PtPWFCczVQtB9N4U2rp2HOA44NMz4y8A AAD//wMAUEsDBBQABgAIAAAAIQC2sURlyQAAANwAAAAPAAAAZHJzL2Rvd25yZXYueG1sRI9BT8JA FITvJv6HzTPxYmQrikLpQkADclCRQuD60n22Dd23TXcp9d+7JiYeJzPzTSaZdqYSLTWutKzgrheB IM6sLjlXsNsubocgnEfWWFkmBd/kYDq5vEgw1vbMG2pTn4sAYRejgsL7OpbSZQUZdD1bEwfvyzYG fZBNLnWD5wA3lexH0aM0WHJYKLCm54KyY3oyCpbz1dPobf7x6V5e0/f1fn0/yG8OSl1fdbMxCE+d /w//tVdaweChD79nwhGQkx8AAAD//wMAUEsBAi0AFAAGAAgAAAAhANvh9svuAAAAhQEAABMAAAAA AAAAAAAAAAAAAAAAAFtDb250ZW50X1R5cGVzXS54bWxQSwECLQAUAAYACAAAACEAWvQsW78AAAAV AQAACwAAAAAAAAAAAAAAAAAfAQAAX3JlbHMvLnJlbHNQSwECLQAUAAYACAAAACEAtrFEZckAAADc AAAADwAAAAAAAAAAAAAAAAAHAgAAZHJzL2Rvd25yZXYueG1sUEsFBgAAAAADAAMAtwAAAP0CAAAA AA== " path="m94500,189001r36787,-7426l161324,161324r20251,-30037l189001,94500,181575,57719,161324,27681,131287,7427,94500,,57714,7427,27676,27681,7425,57719,,94500r7425,36787l27676,161324r30038,20251l94500,189001xe" filled="f" strokecolor="#e0e0e0" strokeweight=".75mm">
-                  <v:path arrowok="t"/>
-                </v:shape>
-                <v:shape id="Graphic 543" o:spid="_x0000_s1034" style="position:absolute;left:8378;top:135;width:1893;height:1892;visibility:visible;mso-wrap-style:square;v-text-anchor:top" coordsize="189230,189230" o:gfxdata="UEsDBBQABgAIAAAAIQDb4fbL7gAAAIUBAAATAAAAW0NvbnRlbnRfVHlwZXNdLnhtbHyQz07DMAyH 70i8Q+QralM4IITa7kDhCAiNB7ASt43WOlEcyvb2pNu4IODoPz9/n1xv9vOkForiPDdwXVagiI23 jocG3rdPxR0oScgWJ8/UwIEENu3lRb09BBKV0ywNjCmFe63FjDSjlD4Q50nv44wpl3HQAc0OB9I3 VXWrjedEnIq03oC27qjHjympx31un0wiTQLq4bS4shrAECZnMGVTvbD9QSnOhDInjzsyuiBXWQP0 r4R18jfgnHvJr4nOknrFmJ5xzhraRtHWf3Kkpfz/yGo5S+H73hkquyhdjr3R8m2lj09svwAAAP// AwBQSwMEFAAGAAgAAAAhAFr0LFu/AAAAFQEAAAsAAABfcmVscy8ucmVsc2zPwWrDMAwG4Ptg72B0 X5TuUMaI01uh19I+gLGVxCy2jGSy9e1nemrHjpL4P0nD4SetZiPRyNnCruvBUPYcYp4tXC/Htw8w Wl0ObuVMFm6kcBhfX4Yzra62kC6xqGlKVgtLreUTUf1CyWnHhXKbTCzJ1VbKjMX5LzcTvvf9HuXR gPHJNKdgQU5hB+ZyK23zHztFL6w81c5zQp6m6P9TMfB3PtPWFCczVQtB9N4U2rp2HOA44NMz4y8A AAD//wMAUEsDBBQABgAIAAAAIQA8TVOKxgAAANwAAAAPAAAAZHJzL2Rvd25yZXYueG1sRI9PS8NA FMTvQr/D8gq9BLuxWpHYbSkRRTxp/9wf2ddNaPZtml2T1U/vCoLHYWZ+w6w20bZioN43jhXczHMQ xJXTDRsFh/3z9QMIH5A1to5JwRd52KwnVysstBv5g4ZdMCJB2BeooA6hK6T0VU0W/dx1xMk7ud5i SLI3Uvc4Jrht5SLP76XFhtNCjR2VNVXn3adVYE5ZN7y8meySH8csvpdP5SV+KzWbxu0jiEAx/If/ 2q9awfLuFn7PpCMg1z8AAAD//wMAUEsBAi0AFAAGAAgAAAAhANvh9svuAAAAhQEAABMAAAAAAAAA AAAAAAAAAAAAAFtDb250ZW50X1R5cGVzXS54bWxQSwECLQAUAAYACAAAACEAWvQsW78AAAAVAQAA CwAAAAAAAAAAAAAAAAAfAQAAX3JlbHMvLnJlbHNQSwECLQAUAAYACAAAACEAPE1TisYAAADcAAAA DwAAAAAAAAAAAAAAAAAHAgAAZHJzL2Rvd25yZXYueG1sUEsFBgAAAAADAAMAtwAAAPoCAAAAAA== " path="m94500,l57714,7427,27676,27681,7425,57719,,94500r7425,36787l27676,161324r30038,20251l94500,189001r36787,-7426l161324,161324r20251,-30037l189001,94500,181575,57719,161324,27681,131287,7427,94500,xe" fillcolor="#797979" stroked="f">
-                  <v:path arrowok="t"/>
-                </v:shape>
-                <v:shape id="Graphic 544" o:spid="_x0000_s1035" style="position:absolute;left:8378;top:135;width:1893;height:1892;visibility:visible;mso-wrap-style:square;v-text-anchor:top" coordsize="189230,189230" o:gfxdata="UEsDBBQABgAIAAAAIQDb4fbL7gAAAIUBAAATAAAAW0NvbnRlbnRfVHlwZXNdLnhtbHyQz07DMAyH 70i8Q+QralM4IITa7kDhCAiNB7ASt43WOlEcyvb2pNu4IODoPz9/n1xv9vOkForiPDdwXVagiI23 jocG3rdPxR0oScgWJ8/UwIEENu3lRb09BBKV0ywNjCmFe63FjDSjlD4Q50nv44wpl3HQAc0OB9I3 VXWrjedEnIq03oC27qjHjympx31un0wiTQLq4bS4shrAECZnMGVTvbD9QSnOhDInjzsyuiBXWQP0 r4R18jfgnHvJr4nOknrFmJ5xzhraRtHWf3Kkpfz/yGo5S+H73hkquyhdjr3R8m2lj09svwAAAP// AwBQSwMEFAAGAAgAAAAhAFr0LFu/AAAAFQEAAAsAAABfcmVscy8ucmVsc2zPwWrDMAwG4Ptg72B0 X5TuUMaI01uh19I+gLGVxCy2jGSy9e1nemrHjpL4P0nD4SetZiPRyNnCruvBUPYcYp4tXC/Htw8w Wl0ObuVMFm6kcBhfX4Yzra62kC6xqGlKVgtLreUTUf1CyWnHhXKbTCzJ1VbKjMX5LzcTvvf9HuXR gPHJNKdgQU5hB+ZyK23zHztFL6w81c5zQp6m6P9TMfB3PtPWFCczVQtB9N4U2rp2HOA44NMz4y8A AAD//wMAUEsDBBQABgAIAAAAIQBWFHmKyQAAANwAAAAPAAAAZHJzL2Rvd25yZXYueG1sRI9Lb8Iw EITvSPwHa5G4VMXh1UeKQYWqwIFHm1btdRUvSdR4HcUuhH+PK1XiOJqZbzSTWWNKcaTaFZYV9HsR COLU6oIzBZ8fr7cPIJxH1lhaJgVncjCbtlsTjLU98TsdE5+JAGEXo4Lc+yqW0qU5GXQ9WxEH72Br gz7IOpO6xlOAm1IOouhOGiw4LORY0SKn9Cf5NQqW8/X942a+e3Mvq2S7/9oPx9nNt1LdTvP8BMJT 46/h//ZaKxiPRvB3JhwBOb0AAAD//wMAUEsBAi0AFAAGAAgAAAAhANvh9svuAAAAhQEAABMAAAAA AAAAAAAAAAAAAAAAAFtDb250ZW50X1R5cGVzXS54bWxQSwECLQAUAAYACAAAACEAWvQsW78AAAAV AQAACwAAAAAAAAAAAAAAAAAfAQAAX3JlbHMvLnJlbHNQSwECLQAUAAYACAAAACEAVhR5iskAAADc AAAADwAAAAAAAAAAAAAAAAAHAgAAZHJzL2Rvd25yZXYueG1sUEsFBgAAAAADAAMAtwAAAP0CAAAA AA== " path="m94500,189001r36787,-7426l161324,161324r20251,-30037l189001,94500,181575,57719,161324,27681,131287,7427,94500,,57714,7427,27676,27681,7425,57719,,94500r7425,36787l27676,161324r30038,20251l94500,189001xe" filled="f" strokecolor="#e0e0e0" strokeweight=".75mm">
-                  <v:path arrowok="t"/>
-                </v:shape>
-                <v:shapetype id="_x0000_t202" coordsize="21600,21600" o:spt="202" path="m,l,21600r21600,l21600,xe">
-                  <v:stroke joinstyle="miter"/>
-                  <v:path gradientshapeok="t" o:connecttype="rect"/>
-                </v:shapetype>
-                <v:shape id="Textbox 545" o:spid="_x0000_s1036" type="#_x0000_t202" style="position:absolute;width:57245;height:2165;visibility:visible;mso-wrap-style:square;v-text-anchor:top" o:gfxdata="UEsDBBQABgAIAAAAIQDb4fbL7gAAAIUBAAATAAAAW0NvbnRlbnRfVHlwZXNdLnhtbHyQz07DMAyH 70i8Q+QralM4IITa7kDhCAiNB7ASt43WOlEcyvb2pNu4IODoPz9/n1xv9vOkForiPDdwXVagiI23 jocG3rdPxR0oScgWJ8/UwIEENu3lRb09BBKV0ywNjCmFe63FjDSjlD4Q50nv44wpl3HQAc0OB9I3 VXWrjedEnIq03oC27qjHjympx31un0wiTQLq4bS4shrAECZnMGVTvbD9QSnOhDInjzsyuiBXWQP0 r4R18jfgnHvJr4nOknrFmJ5xzhraRtHWf3Kkpfz/yGo5S+H73hkquyhdjr3R8m2lj09svwAAAP// AwBQSwMEFAAGAAgAAAAhAFr0LFu/AAAAFQEAAAsAAABfcmVscy8ucmVsc2zPwWrDMAwG4Ptg72B0 X5TuUMaI01uh19I+gLGVxCy2jGSy9e1nemrHjpL4P0nD4SetZiPRyNnCruvBUPYcYp4tXC/Htw8w Wl0ObuVMFm6kcBhfX4Yzra62kC6xqGlKVgtLreUTUf1CyWnHhXKbTCzJ1VbKjMX5LzcTvvf9HuXR gPHJNKdgQU5hB+ZyK23zHztFL6w81c5zQp6m6P9TMfB3PtPWFCczVQtB9N4U2rp2HOA44NMz4y8A AAD//wMAUEsDBBQABgAIAAAAIQD8TOeuxgAAANwAAAAPAAAAZHJzL2Rvd25yZXYueG1sRI9Ba8JA FITvhf6H5RW81U2Lik3diBQFQSiN6aHH1+wzWZJ9G7Orxn/vFgoeh5n5hlksB9uKM/XeOFbwMk5A EJdOG64UfBeb5zkIH5A1to5JwZU8LLPHhwWm2l04p/M+VCJC2KeooA6hS6X0ZU0W/dh1xNE7uN5i iLKvpO7xEuG2la9JMpMWDceFGjv6qKls9ierYPXD+docP3+/8kNuiuIt4d2sUWr0NKzeQQQawj38 395qBdPJFP7OxCMgsxsAAAD//wMAUEsBAi0AFAAGAAgAAAAhANvh9svuAAAAhQEAABMAAAAAAAAA AAAAAAAAAAAAAFtDb250ZW50X1R5cGVzXS54bWxQSwECLQAUAAYACAAAACEAWvQsW78AAAAVAQAA CwAAAAAAAAAAAAAAAAAfAQAAX3JlbHMvLnJlbHNQSwECLQAUAAYACAAAACEA/EznrsYAAADcAAAA DwAAAAAAAAAAAAAAAAAHAgAAZHJzL2Rvd25yZXYueG1sUEsFBgAAAAADAAMAtwAAAPoCAAAAAA== " filled="f" stroked="f">
-                  <v:textbox inset="0,0,0,0">
-                    <w:txbxContent>
-                      <w:p>
-                        <w:pPr>
-                          <w:spacing w:before="57"/>
-                          <w:ind w:left="351"/>
-                          <w:rPr>
-                            <w:rFonts w:ascii="新細明體" w:eastAsia="新細明體"/>
-                            <w:sz w:val="18"/>
-                          </w:rPr>
-                        </w:pPr>
-                        <w:r>
-                          <w:rPr>
-                            <w:rFonts w:ascii="新細明體" w:eastAsia="新細明體" w:hint="eastAsia"/>
-                            <w:color w:val="FFFFFF"/>
-                            <w:w w:val="110"/>
-                            <w:sz w:val="18"/>
-                          </w:rPr>
-                          <w:t>作</w:t>
-                        </w:r>
-                        <w:r>
-                          <w:rPr>
-                            <w:rFonts w:ascii="新細明體" w:eastAsia="新細明體" w:hint="eastAsia"/>
-                            <w:color w:val="FFFFFF"/>
-                            <w:spacing w:val="65"/>
-                            <w:w w:val="150"/>
-                            <w:sz w:val="18"/>
-                          </w:rPr>
-                          <w:t xml:space="preserve"> </w:t>
-                        </w:r>
-                        <w:r>
-                          <w:rPr>
-                            <w:rFonts w:ascii="新細明體" w:eastAsia="新細明體" w:hint="eastAsia"/>
-                            <w:color w:val="FFFFFF"/>
-                            <w:w w:val="110"/>
-                            <w:sz w:val="18"/>
-                          </w:rPr>
-                          <w:t>者</w:t>
-                        </w:r>
-                        <w:r>
-                          <w:rPr>
-                            <w:rFonts w:ascii="新細明體" w:eastAsia="新細明體" w:hint="eastAsia"/>
-                            <w:color w:val="FFFFFF"/>
-                            <w:spacing w:val="73"/>
-                            <w:w w:val="150"/>
-                            <w:sz w:val="18"/>
-                          </w:rPr>
-                          <w:t xml:space="preserve"> </w:t>
-                        </w:r>
-                        <w:r>
-                          <w:rPr>
-                            <w:rFonts w:ascii="新細明體" w:eastAsia="新細明體" w:hint="eastAsia"/>
-                            <w:color w:val="FFFFFF"/>
-                            <w:w w:val="110"/>
-                            <w:sz w:val="18"/>
-                          </w:rPr>
-                          <w:t>簡</w:t>
-                        </w:r>
-                        <w:r>
-                          <w:rPr>
-                            <w:rFonts w:ascii="新細明體" w:eastAsia="新細明體" w:hint="eastAsia"/>
-                            <w:color w:val="FFFFFF"/>
-                            <w:spacing w:val="73"/>
-                            <w:w w:val="150"/>
-                            <w:sz w:val="18"/>
-                          </w:rPr>
-                          <w:t xml:space="preserve"> </w:t>
-                        </w:r>
-                        <w:r>
-                          <w:rPr>
-                            <w:rFonts w:ascii="新細明體" w:eastAsia="新細明體" w:hint="eastAsia"/>
-                            <w:color w:val="FFFFFF"/>
-                            <w:spacing w:val="-10"/>
-                            <w:w w:val="110"/>
-                            <w:sz w:val="18"/>
-                          </w:rPr>
-                          <w:t>介</w:t>
-                        </w:r>
-                      </w:p>
-                    </w:txbxContent>
-                  </v:textbox>
-                </v:shape>
-                <w10:wrap type="topAndBottom" anchorx="page"/>
-              </v:group>
-            </w:pict>
-          </mc:Fallback>
-        </mc:AlternateContent>
-      </w:r>
-      <w:r>
-        <w:rPr>
-          <w:rFonts w:ascii="微軟正黑體" w:eastAsia="微軟正黑體" w:hAnsi="微軟正黑體" w:cs="新細明體"/>
-          <w:noProof/>
-          <w:spacing w:val="-7"/>
-          <w:w w:val="105"/>
-          <w:sz w:val="24"/>
-          <w:szCs w:val="24"/>
-          <w:lang w:eastAsia="zh-TW"/>
-        </w:rPr>
-        <mc:AlternateContent>
-          <mc:Choice Requires="wpg">
-            <w:drawing>
-              <wp:anchor distT="0" distB="0" distL="0" distR="0" simplePos="0" relativeHeight="251662336" behindDoc="1" locked="0" layoutInCell="1" allowOverlap="1" wp14:anchorId="1D16EF0D" wp14:editId="13DD86FD">
-                <wp:simplePos x="0" y="0"/>
-                <wp:positionH relativeFrom="page">
-                  <wp:posOffset>840193</wp:posOffset>
-                </wp:positionH>
-                <wp:positionV relativeFrom="paragraph">
-                  <wp:posOffset>205866</wp:posOffset>
-                </wp:positionV>
-                <wp:extent cx="5724525" cy="216535"/>
-                <wp:effectExtent l="0" t="0" r="0" b="0"/>
-                <wp:wrapTopAndBottom/>
-                <wp:docPr id="29" name="Group 535"/>
-                <wp:cNvGraphicFramePr>
-                  <a:graphicFrameLocks xmlns:a="http://schemas.openxmlformats.org/drawingml/2006/main"/>
-                </wp:cNvGraphicFramePr>
-                <a:graphic xmlns:a="http://schemas.openxmlformats.org/drawingml/2006/main">
-                  <a:graphicData uri="http://schemas.microsoft.com/office/word/2010/wordprocessingGroup">
-                    <wpg:wgp>
-                      <wpg:cNvGrpSpPr>
-                        <a:grpSpLocks/>
-                      </wpg:cNvGrpSpPr>
-                      <wpg:grpSpPr>
-                        <a:xfrm>
-                          <a:off x="0" y="0"/>
-                          <a:ext cx="5724525" cy="216535"/>
-                          <a:chOff x="0" y="0"/>
-                          <a:chExt cx="5724525" cy="216535"/>
-                        </a:xfrm>
-                      </wpg:grpSpPr>
-                      <wps:wsp>
-                        <wps:cNvPr id="30" name="Graphic 536"/>
-                        <wps:cNvSpPr/>
-                        <wps:spPr>
-                          <a:xfrm>
-                            <a:off x="0" y="92848"/>
-                            <a:ext cx="5724525" cy="46990"/>
-                          </a:xfrm>
-                          <a:custGeom>
-                            <a:avLst/>
-                            <a:gdLst/>
-                            <a:ahLst/>
-                            <a:cxnLst/>
-                            <a:rect l="l" t="t" r="r" b="b"/>
-                            <a:pathLst>
-                              <a:path w="5724525" h="46990">
-                                <a:moveTo>
-                                  <a:pt x="5724042" y="0"/>
-                                </a:moveTo>
-                                <a:lnTo>
-                                  <a:pt x="0" y="0"/>
-                                </a:lnTo>
-                                <a:lnTo>
-                                  <a:pt x="0" y="46799"/>
-                                </a:lnTo>
-                                <a:lnTo>
-                                  <a:pt x="5724042" y="46799"/>
-                                </a:lnTo>
-                                <a:lnTo>
-                                  <a:pt x="5724042" y="0"/>
-                                </a:lnTo>
-                                <a:close/>
-                              </a:path>
-                            </a:pathLst>
-                          </a:custGeom>
-                          <a:solidFill>
-                            <a:srgbClr val="A6A6A6"/>
-                          </a:solidFill>
-                        </wps:spPr>
-                        <wps:bodyPr wrap="square" lIns="0" tIns="0" rIns="0" bIns="0" rtlCol="0">
-                          <a:prstTxWarp prst="textNoShape">
-                            <a:avLst/>
-                          </a:prstTxWarp>
-                          <a:noAutofit/>
-                        </wps:bodyPr>
-                      </wps:wsp>
-                      <wps:wsp>
-                        <wps:cNvPr id="31" name="Graphic 537"/>
-                        <wps:cNvSpPr/>
-                        <wps:spPr>
-                          <a:xfrm>
-                            <a:off x="189896" y="13500"/>
-                            <a:ext cx="189230" cy="189230"/>
-                          </a:xfrm>
-                          <a:custGeom>
-                            <a:avLst/>
-                            <a:gdLst/>
-                            <a:ahLst/>
-                            <a:cxnLst/>
-                            <a:rect l="l" t="t" r="r" b="b"/>
-                            <a:pathLst>
-                              <a:path w="189230" h="189230">
-                                <a:moveTo>
-                                  <a:pt x="94500" y="0"/>
-                                </a:moveTo>
-                                <a:lnTo>
-                                  <a:pt x="57714" y="7427"/>
-                                </a:lnTo>
-                                <a:lnTo>
-                                  <a:pt x="27676" y="27681"/>
-                                </a:lnTo>
-                                <a:lnTo>
-                                  <a:pt x="7425" y="57719"/>
-                                </a:lnTo>
-                                <a:lnTo>
-                                  <a:pt x="0" y="94500"/>
-                                </a:lnTo>
-                                <a:lnTo>
-                                  <a:pt x="7425" y="131287"/>
-                                </a:lnTo>
-                                <a:lnTo>
-                                  <a:pt x="27676" y="161324"/>
-                                </a:lnTo>
-                                <a:lnTo>
-                                  <a:pt x="57714" y="181575"/>
-                                </a:lnTo>
-                                <a:lnTo>
-                                  <a:pt x="94500" y="189001"/>
-                                </a:lnTo>
-                                <a:lnTo>
-                                  <a:pt x="131287" y="181575"/>
-                                </a:lnTo>
-                                <a:lnTo>
-                                  <a:pt x="161324" y="161324"/>
-                                </a:lnTo>
-                                <a:lnTo>
-                                  <a:pt x="181575" y="131287"/>
-                                </a:lnTo>
-                                <a:lnTo>
-                                  <a:pt x="189001" y="94500"/>
-                                </a:lnTo>
-                                <a:lnTo>
-                                  <a:pt x="181575" y="57719"/>
-                                </a:lnTo>
-                                <a:lnTo>
-                                  <a:pt x="161324" y="27681"/>
-                                </a:lnTo>
-                                <a:lnTo>
-                                  <a:pt x="131287" y="7427"/>
-                                </a:lnTo>
-                                <a:lnTo>
-                                  <a:pt x="94500" y="0"/>
-                                </a:lnTo>
-                                <a:close/>
-                              </a:path>
-                            </a:pathLst>
-                          </a:custGeom>
-                          <a:solidFill>
-                            <a:srgbClr val="797979"/>
-                          </a:solidFill>
-                        </wps:spPr>
-                        <wps:bodyPr wrap="square" lIns="0" tIns="0" rIns="0" bIns="0" rtlCol="0">
-                          <a:prstTxWarp prst="textNoShape">
-                            <a:avLst/>
-                          </a:prstTxWarp>
-                          <a:noAutofit/>
-                        </wps:bodyPr>
-                      </wps:wsp>
-                      <wps:wsp>
-                        <wps:cNvPr id="32" name="Graphic 538"/>
-                        <wps:cNvSpPr/>
-                        <wps:spPr>
-                          <a:xfrm>
-                            <a:off x="189896" y="13500"/>
-                            <a:ext cx="189230" cy="189230"/>
-                          </a:xfrm>
-                          <a:custGeom>
-                            <a:avLst/>
-                            <a:gdLst/>
-                            <a:ahLst/>
-                            <a:cxnLst/>
-                            <a:rect l="l" t="t" r="r" b="b"/>
-                            <a:pathLst>
-                              <a:path w="189230" h="189230">
-                                <a:moveTo>
-                                  <a:pt x="94500" y="189001"/>
-                                </a:moveTo>
-                                <a:lnTo>
-                                  <a:pt x="131287" y="181575"/>
-                                </a:lnTo>
-                                <a:lnTo>
-                                  <a:pt x="161324" y="161324"/>
-                                </a:lnTo>
-                                <a:lnTo>
-                                  <a:pt x="181575" y="131287"/>
-                                </a:lnTo>
-                                <a:lnTo>
-                                  <a:pt x="189001" y="94500"/>
-                                </a:lnTo>
-                                <a:lnTo>
-                                  <a:pt x="181575" y="57719"/>
-                                </a:lnTo>
-                                <a:lnTo>
-                                  <a:pt x="161324" y="27681"/>
-                                </a:lnTo>
-                                <a:lnTo>
-                                  <a:pt x="131287" y="7427"/>
-                                </a:lnTo>
-                                <a:lnTo>
-                                  <a:pt x="94500" y="0"/>
-                                </a:lnTo>
-                                <a:lnTo>
-                                  <a:pt x="57714" y="7427"/>
-                                </a:lnTo>
-                                <a:lnTo>
-                                  <a:pt x="27676" y="27681"/>
-                                </a:lnTo>
-                                <a:lnTo>
-                                  <a:pt x="7425" y="57719"/>
-                                </a:lnTo>
-                                <a:lnTo>
-                                  <a:pt x="0" y="94500"/>
-                                </a:lnTo>
-                                <a:lnTo>
-                                  <a:pt x="7425" y="131287"/>
-                                </a:lnTo>
-                                <a:lnTo>
-                                  <a:pt x="27676" y="161324"/>
-                                </a:lnTo>
-                                <a:lnTo>
-                                  <a:pt x="57714" y="181575"/>
-                                </a:lnTo>
-                                <a:lnTo>
-                                  <a:pt x="94500" y="189001"/>
-                                </a:lnTo>
-                                <a:close/>
-                              </a:path>
-                            </a:pathLst>
-                          </a:custGeom>
-                          <a:ln w="27000">
-                            <a:solidFill>
-                              <a:srgbClr val="E0E0E0"/>
-                            </a:solidFill>
-                            <a:prstDash val="solid"/>
-                          </a:ln>
-                        </wps:spPr>
-                        <wps:bodyPr wrap="square" lIns="0" tIns="0" rIns="0" bIns="0" rtlCol="0">
-                          <a:prstTxWarp prst="textNoShape">
-                            <a:avLst/>
-                          </a:prstTxWarp>
-                          <a:noAutofit/>
-                        </wps:bodyPr>
-                      </wps:wsp>
-                      <wps:wsp>
-                        <wps:cNvPr id="33" name="Graphic 539"/>
-                        <wps:cNvSpPr/>
-                        <wps:spPr>
-                          <a:xfrm>
-                            <a:off x="405895" y="13500"/>
-                            <a:ext cx="189230" cy="189230"/>
-                          </a:xfrm>
-                          <a:custGeom>
-                            <a:avLst/>
-                            <a:gdLst/>
-                            <a:ahLst/>
-                            <a:cxnLst/>
-                            <a:rect l="l" t="t" r="r" b="b"/>
-                            <a:pathLst>
-                              <a:path w="189230" h="189230">
-                                <a:moveTo>
-                                  <a:pt x="94500" y="0"/>
-                                </a:moveTo>
-                                <a:lnTo>
-                                  <a:pt x="57714" y="7427"/>
-                                </a:lnTo>
-                                <a:lnTo>
-                                  <a:pt x="27676" y="27681"/>
-                                </a:lnTo>
-                                <a:lnTo>
-                                  <a:pt x="7425" y="57719"/>
-                                </a:lnTo>
-                                <a:lnTo>
-                                  <a:pt x="0" y="94500"/>
-                                </a:lnTo>
-                                <a:lnTo>
-                                  <a:pt x="7425" y="131287"/>
-                                </a:lnTo>
-                                <a:lnTo>
-                                  <a:pt x="27676" y="161324"/>
-                                </a:lnTo>
-                                <a:lnTo>
-                                  <a:pt x="57714" y="181575"/>
-                                </a:lnTo>
-                                <a:lnTo>
-                                  <a:pt x="94500" y="189001"/>
-                                </a:lnTo>
-                                <a:lnTo>
-                                  <a:pt x="131287" y="181575"/>
-                                </a:lnTo>
-                                <a:lnTo>
-                                  <a:pt x="161324" y="161324"/>
-                                </a:lnTo>
-                                <a:lnTo>
-                                  <a:pt x="181575" y="131287"/>
-                                </a:lnTo>
-                                <a:lnTo>
-                                  <a:pt x="189001" y="94500"/>
-                                </a:lnTo>
-                                <a:lnTo>
-                                  <a:pt x="181575" y="57719"/>
-                                </a:lnTo>
-                                <a:lnTo>
-                                  <a:pt x="161324" y="27681"/>
-                                </a:lnTo>
-                                <a:lnTo>
-                                  <a:pt x="131287" y="7427"/>
-                                </a:lnTo>
-                                <a:lnTo>
-                                  <a:pt x="94500" y="0"/>
-                                </a:lnTo>
-                                <a:close/>
-                              </a:path>
-                            </a:pathLst>
-                          </a:custGeom>
-                          <a:solidFill>
-                            <a:srgbClr val="797979"/>
-                          </a:solidFill>
-                        </wps:spPr>
-                        <wps:bodyPr wrap="square" lIns="0" tIns="0" rIns="0" bIns="0" rtlCol="0">
-                          <a:prstTxWarp prst="textNoShape">
-                            <a:avLst/>
-                          </a:prstTxWarp>
-                          <a:noAutofit/>
-                        </wps:bodyPr>
-                      </wps:wsp>
-                      <wps:wsp>
-                        <wps:cNvPr id="34" name="Graphic 540"/>
-                        <wps:cNvSpPr/>
-                        <wps:spPr>
-                          <a:xfrm>
-                            <a:off x="405895" y="13500"/>
-                            <a:ext cx="189230" cy="189230"/>
-                          </a:xfrm>
-                          <a:custGeom>
-                            <a:avLst/>
-                            <a:gdLst/>
-                            <a:ahLst/>
-                            <a:cxnLst/>
-                            <a:rect l="l" t="t" r="r" b="b"/>
-                            <a:pathLst>
-                              <a:path w="189230" h="189230">
-                                <a:moveTo>
-                                  <a:pt x="94500" y="189001"/>
-                                </a:moveTo>
-                                <a:lnTo>
-                                  <a:pt x="131287" y="181575"/>
-                                </a:lnTo>
-                                <a:lnTo>
-                                  <a:pt x="161324" y="161324"/>
-                                </a:lnTo>
-                                <a:lnTo>
-                                  <a:pt x="181575" y="131287"/>
-                                </a:lnTo>
-                                <a:lnTo>
-                                  <a:pt x="189001" y="94500"/>
-                                </a:lnTo>
-                                <a:lnTo>
-                                  <a:pt x="181575" y="57719"/>
-                                </a:lnTo>
-                                <a:lnTo>
-                                  <a:pt x="161324" y="27681"/>
-                                </a:lnTo>
-                                <a:lnTo>
-                                  <a:pt x="131287" y="7427"/>
-                                </a:lnTo>
-                                <a:lnTo>
-                                  <a:pt x="94500" y="0"/>
-                                </a:lnTo>
-                                <a:lnTo>
-                                  <a:pt x="57714" y="7427"/>
-                                </a:lnTo>
-                                <a:lnTo>
-                                  <a:pt x="27676" y="27681"/>
-                                </a:lnTo>
-                                <a:lnTo>
-                                  <a:pt x="7425" y="57719"/>
-                                </a:lnTo>
-                                <a:lnTo>
-                                  <a:pt x="0" y="94500"/>
-                                </a:lnTo>
-                                <a:lnTo>
-                                  <a:pt x="7425" y="131287"/>
-                                </a:lnTo>
-                                <a:lnTo>
-                                  <a:pt x="27676" y="161324"/>
-                                </a:lnTo>
-                                <a:lnTo>
-                                  <a:pt x="57714" y="181575"/>
-                                </a:lnTo>
-                                <a:lnTo>
-                                  <a:pt x="94500" y="189001"/>
-                                </a:lnTo>
-                                <a:close/>
-                              </a:path>
-                            </a:pathLst>
-                          </a:custGeom>
-                          <a:ln w="27000">
-                            <a:solidFill>
-                              <a:srgbClr val="E0E0E0"/>
-                            </a:solidFill>
-                            <a:prstDash val="solid"/>
-                          </a:ln>
-                        </wps:spPr>
-                        <wps:bodyPr wrap="square" lIns="0" tIns="0" rIns="0" bIns="0" rtlCol="0">
-                          <a:prstTxWarp prst="textNoShape">
-                            <a:avLst/>
-                          </a:prstTxWarp>
-                          <a:noAutofit/>
-                        </wps:bodyPr>
-                      </wps:wsp>
-                      <wps:wsp>
-                        <wps:cNvPr id="35" name="Graphic 541"/>
-                        <wps:cNvSpPr/>
-                        <wps:spPr>
-                          <a:xfrm>
-                            <a:off x="621896" y="13500"/>
-                            <a:ext cx="189230" cy="189230"/>
-                          </a:xfrm>
-                          <a:custGeom>
-                            <a:avLst/>
-                            <a:gdLst/>
-                            <a:ahLst/>
-                            <a:cxnLst/>
-                            <a:rect l="l" t="t" r="r" b="b"/>
-                            <a:pathLst>
-                              <a:path w="189230" h="189230">
-                                <a:moveTo>
-                                  <a:pt x="94500" y="0"/>
-                                </a:moveTo>
-                                <a:lnTo>
-                                  <a:pt x="57714" y="7427"/>
-                                </a:lnTo>
-                                <a:lnTo>
-                                  <a:pt x="27676" y="27681"/>
-                                </a:lnTo>
-                                <a:lnTo>
-                                  <a:pt x="7425" y="57719"/>
-                                </a:lnTo>
-                                <a:lnTo>
-                                  <a:pt x="0" y="94500"/>
-                                </a:lnTo>
-                                <a:lnTo>
-                                  <a:pt x="7425" y="131287"/>
-                                </a:lnTo>
-                                <a:lnTo>
-                                  <a:pt x="27676" y="161324"/>
-                                </a:lnTo>
-                                <a:lnTo>
-                                  <a:pt x="57714" y="181575"/>
-                                </a:lnTo>
-                                <a:lnTo>
-                                  <a:pt x="94500" y="189001"/>
-                                </a:lnTo>
-                                <a:lnTo>
-                                  <a:pt x="131287" y="181575"/>
-                                </a:lnTo>
-                                <a:lnTo>
-                                  <a:pt x="161324" y="161324"/>
-                                </a:lnTo>
-                                <a:lnTo>
-                                  <a:pt x="181575" y="131287"/>
-                                </a:lnTo>
-                                <a:lnTo>
-                                  <a:pt x="189001" y="94500"/>
-                                </a:lnTo>
-                                <a:lnTo>
-                                  <a:pt x="181575" y="57719"/>
-                                </a:lnTo>
-                                <a:lnTo>
-                                  <a:pt x="161324" y="27681"/>
-                                </a:lnTo>
-                                <a:lnTo>
-                                  <a:pt x="131287" y="7427"/>
-                                </a:lnTo>
-                                <a:lnTo>
-                                  <a:pt x="94500" y="0"/>
-                                </a:lnTo>
-                                <a:close/>
-                              </a:path>
-                            </a:pathLst>
-                          </a:custGeom>
-                          <a:solidFill>
-                            <a:srgbClr val="797979"/>
-                          </a:solidFill>
-                        </wps:spPr>
-                        <wps:bodyPr wrap="square" lIns="0" tIns="0" rIns="0" bIns="0" rtlCol="0">
-                          <a:prstTxWarp prst="textNoShape">
-                            <a:avLst/>
-                          </a:prstTxWarp>
-                          <a:noAutofit/>
-                        </wps:bodyPr>
-                      </wps:wsp>
-                      <wps:wsp>
-                        <wps:cNvPr id="36" name="Graphic 542"/>
-                        <wps:cNvSpPr/>
-                        <wps:spPr>
-                          <a:xfrm>
-                            <a:off x="621896" y="13500"/>
-                            <a:ext cx="189230" cy="189230"/>
-                          </a:xfrm>
-                          <a:custGeom>
-                            <a:avLst/>
-                            <a:gdLst/>
-                            <a:ahLst/>
-                            <a:cxnLst/>
-                            <a:rect l="l" t="t" r="r" b="b"/>
-                            <a:pathLst>
-                              <a:path w="189230" h="189230">
-                                <a:moveTo>
-                                  <a:pt x="94500" y="189001"/>
-                                </a:moveTo>
-                                <a:lnTo>
-                                  <a:pt x="131287" y="181575"/>
-                                </a:lnTo>
-                                <a:lnTo>
-                                  <a:pt x="161324" y="161324"/>
-                                </a:lnTo>
-                                <a:lnTo>
-                                  <a:pt x="181575" y="131287"/>
-                                </a:lnTo>
-                                <a:lnTo>
-                                  <a:pt x="189001" y="94500"/>
-                                </a:lnTo>
-                                <a:lnTo>
-                                  <a:pt x="181575" y="57719"/>
-                                </a:lnTo>
-                                <a:lnTo>
-                                  <a:pt x="161324" y="27681"/>
-                                </a:lnTo>
-                                <a:lnTo>
-                                  <a:pt x="131287" y="7427"/>
-                                </a:lnTo>
-                                <a:lnTo>
-                                  <a:pt x="94500" y="0"/>
-                                </a:lnTo>
-                                <a:lnTo>
-                                  <a:pt x="57714" y="7427"/>
-                                </a:lnTo>
-                                <a:lnTo>
-                                  <a:pt x="27676" y="27681"/>
-                                </a:lnTo>
-                                <a:lnTo>
-                                  <a:pt x="7425" y="57719"/>
-                                </a:lnTo>
-                                <a:lnTo>
-                                  <a:pt x="0" y="94500"/>
-                                </a:lnTo>
-                                <a:lnTo>
-                                  <a:pt x="7425" y="131287"/>
-                                </a:lnTo>
-                                <a:lnTo>
-                                  <a:pt x="27676" y="161324"/>
-                                </a:lnTo>
-                                <a:lnTo>
-                                  <a:pt x="57714" y="181575"/>
-                                </a:lnTo>
-                                <a:lnTo>
-                                  <a:pt x="94500" y="189001"/>
-                                </a:lnTo>
-                                <a:close/>
-                              </a:path>
-                            </a:pathLst>
-                          </a:custGeom>
-                          <a:ln w="27000">
-                            <a:solidFill>
-                              <a:srgbClr val="E0E0E0"/>
-                            </a:solidFill>
-                            <a:prstDash val="solid"/>
-                          </a:ln>
-                        </wps:spPr>
-                        <wps:bodyPr wrap="square" lIns="0" tIns="0" rIns="0" bIns="0" rtlCol="0">
-                          <a:prstTxWarp prst="textNoShape">
-                            <a:avLst/>
-                          </a:prstTxWarp>
-                          <a:noAutofit/>
-                        </wps:bodyPr>
-                      </wps:wsp>
-                      <wps:wsp>
-                        <wps:cNvPr id="37" name="Graphic 543"/>
-                        <wps:cNvSpPr/>
-                        <wps:spPr>
-                          <a:xfrm>
-                            <a:off x="837896" y="13500"/>
-                            <a:ext cx="189230" cy="189230"/>
-                          </a:xfrm>
-                          <a:custGeom>
-                            <a:avLst/>
-                            <a:gdLst/>
-                            <a:ahLst/>
-                            <a:cxnLst/>
-                            <a:rect l="l" t="t" r="r" b="b"/>
-                            <a:pathLst>
-                              <a:path w="189230" h="189230">
-                                <a:moveTo>
-                                  <a:pt x="94500" y="0"/>
-                                </a:moveTo>
-                                <a:lnTo>
-                                  <a:pt x="57714" y="7427"/>
-                                </a:lnTo>
-                                <a:lnTo>
-                                  <a:pt x="27676" y="27681"/>
-                                </a:lnTo>
-                                <a:lnTo>
-                                  <a:pt x="7425" y="57719"/>
-                                </a:lnTo>
-                                <a:lnTo>
-                                  <a:pt x="0" y="94500"/>
-                                </a:lnTo>
-                                <a:lnTo>
-                                  <a:pt x="7425" y="131287"/>
-                                </a:lnTo>
-                                <a:lnTo>
-                                  <a:pt x="27676" y="161324"/>
-                                </a:lnTo>
-                                <a:lnTo>
-                                  <a:pt x="57714" y="181575"/>
-                                </a:lnTo>
-                                <a:lnTo>
-                                  <a:pt x="94500" y="189001"/>
-                                </a:lnTo>
-                                <a:lnTo>
-                                  <a:pt x="131287" y="181575"/>
-                                </a:lnTo>
-                                <a:lnTo>
-                                  <a:pt x="161324" y="161324"/>
-                                </a:lnTo>
-                                <a:lnTo>
-                                  <a:pt x="181575" y="131287"/>
-                                </a:lnTo>
-                                <a:lnTo>
-                                  <a:pt x="189001" y="94500"/>
-                                </a:lnTo>
-                                <a:lnTo>
-                                  <a:pt x="181575" y="57719"/>
-                                </a:lnTo>
-                                <a:lnTo>
-                                  <a:pt x="161324" y="27681"/>
-                                </a:lnTo>
-                                <a:lnTo>
-                                  <a:pt x="131287" y="7427"/>
-                                </a:lnTo>
-                                <a:lnTo>
-                                  <a:pt x="94500" y="0"/>
-                                </a:lnTo>
-                                <a:close/>
-                              </a:path>
-                            </a:pathLst>
-                          </a:custGeom>
-                          <a:solidFill>
-                            <a:srgbClr val="797979"/>
-                          </a:solidFill>
-                        </wps:spPr>
-                        <wps:bodyPr wrap="square" lIns="0" tIns="0" rIns="0" bIns="0" rtlCol="0">
-                          <a:prstTxWarp prst="textNoShape">
-                            <a:avLst/>
-                          </a:prstTxWarp>
-                          <a:noAutofit/>
-                        </wps:bodyPr>
-                      </wps:wsp>
-                      <wps:wsp>
-                        <wps:cNvPr id="38" name="Graphic 544"/>
-                        <wps:cNvSpPr/>
-                        <wps:spPr>
-                          <a:xfrm>
-                            <a:off x="837896" y="13500"/>
-                            <a:ext cx="189230" cy="189230"/>
-                          </a:xfrm>
-                          <a:custGeom>
-                            <a:avLst/>
-                            <a:gdLst/>
-                            <a:ahLst/>
-                            <a:cxnLst/>
-                            <a:rect l="l" t="t" r="r" b="b"/>
-                            <a:pathLst>
-                              <a:path w="189230" h="189230">
-                                <a:moveTo>
-                                  <a:pt x="94500" y="189001"/>
-                                </a:moveTo>
-                                <a:lnTo>
-                                  <a:pt x="131287" y="181575"/>
-                                </a:lnTo>
-                                <a:lnTo>
-                                  <a:pt x="161324" y="161324"/>
-                                </a:lnTo>
-                                <a:lnTo>
-                                  <a:pt x="181575" y="131287"/>
-                                </a:lnTo>
-                                <a:lnTo>
-                                  <a:pt x="189001" y="94500"/>
-                                </a:lnTo>
-                                <a:lnTo>
-                                  <a:pt x="181575" y="57719"/>
-                                </a:lnTo>
-                                <a:lnTo>
-                                  <a:pt x="161324" y="27681"/>
-                                </a:lnTo>
-                                <a:lnTo>
-                                  <a:pt x="131287" y="7427"/>
-                                </a:lnTo>
-                                <a:lnTo>
-                                  <a:pt x="94500" y="0"/>
-                                </a:lnTo>
-                                <a:lnTo>
-                                  <a:pt x="57714" y="7427"/>
-                                </a:lnTo>
-                                <a:lnTo>
-                                  <a:pt x="27676" y="27681"/>
-                                </a:lnTo>
-                                <a:lnTo>
-                                  <a:pt x="7425" y="57719"/>
-                                </a:lnTo>
-                                <a:lnTo>
-                                  <a:pt x="0" y="94500"/>
-                                </a:lnTo>
-                                <a:lnTo>
-                                  <a:pt x="7425" y="131287"/>
-                                </a:lnTo>
-                                <a:lnTo>
-                                  <a:pt x="27676" y="161324"/>
-                                </a:lnTo>
-                                <a:lnTo>
-                                  <a:pt x="57714" y="181575"/>
-                                </a:lnTo>
-                                <a:lnTo>
-                                  <a:pt x="94500" y="189001"/>
-                                </a:lnTo>
-                                <a:close/>
-                              </a:path>
-                            </a:pathLst>
-                          </a:custGeom>
-                          <a:ln w="27000">
-                            <a:solidFill>
-                              <a:srgbClr val="E0E0E0"/>
-                            </a:solidFill>
-                            <a:prstDash val="solid"/>
-                          </a:ln>
-                        </wps:spPr>
-                        <wps:bodyPr wrap="square" lIns="0" tIns="0" rIns="0" bIns="0" rtlCol="0">
-                          <a:prstTxWarp prst="textNoShape">
-                            <a:avLst/>
-                          </a:prstTxWarp>
-                          <a:noAutofit/>
-                        </wps:bodyPr>
-                      </wps:wsp>
-                      <wps:wsp>
-                        <wps:cNvPr id="39" name="Textbox 545"/>
-                        <wps:cNvSpPr txBox="1"/>
-                        <wps:spPr>
-                          <a:xfrm>
-                            <a:off x="0" y="0"/>
-                            <a:ext cx="5724525" cy="216535"/>
-                          </a:xfrm>
-                          <a:prstGeom prst="rect">
-                            <a:avLst/>
-                          </a:prstGeom>
-                        </wps:spPr>
-                        <wps:txbx>
-                          <w:txbxContent>
-                            <w:p>
-                              <w:pPr>
-                                <w:spacing w:before="57"/>
-                                <w:ind w:left="351"/>
-                                <w:rPr>
-                                  <w:rFonts w:ascii="新細明體" w:eastAsia="新細明體"/>
-                                  <w:sz w:val="18"/>
-                                </w:rPr>
-                              </w:pPr>
-                              <w:r>
-                                <w:rPr>
-                                  <w:rFonts w:ascii="新細明體" w:eastAsia="新細明體" w:hint="eastAsia"/>
-                                  <w:color w:val="FFFFFF"/>
-                                  <w:w w:val="110"/>
-                                  <w:sz w:val="18"/>
-                                </w:rPr>
-                                <w:t>作</w:t>
-                              </w:r>
-                              <w:r>
-                                <w:rPr>
-                                  <w:rFonts w:ascii="新細明體" w:eastAsia="新細明體" w:hint="eastAsia"/>
-                                  <w:color w:val="FFFFFF"/>
-                                  <w:spacing w:val="65"/>
-                                  <w:w w:val="150"/>
-                                  <w:sz w:val="18"/>
-                                </w:rPr>
-                                <w:t xml:space="preserve"> </w:t>
-                              </w:r>
-                              <w:r>
-                                <w:rPr>
-                                  <w:rFonts w:ascii="新細明體" w:eastAsia="新細明體" w:hint="eastAsia"/>
-                                  <w:color w:val="FFFFFF"/>
-                                  <w:w w:val="110"/>
-                                  <w:sz w:val="18"/>
-                                </w:rPr>
-                                <w:t>者</w:t>
-                              </w:r>
-                              <w:r>
-                                <w:rPr>
-                                  <w:rFonts w:ascii="新細明體" w:eastAsia="新細明體" w:hint="eastAsia"/>
-                                  <w:color w:val="FFFFFF"/>
-                                  <w:spacing w:val="73"/>
-                                  <w:w w:val="150"/>
-                                  <w:sz w:val="18"/>
-                                </w:rPr>
-                                <w:t xml:space="preserve"> </w:t>
-                              </w:r>
-                              <w:r>
-                                <w:rPr>
-                                  <w:rFonts w:ascii="新細明體" w:eastAsia="新細明體" w:hint="eastAsia"/>
-                                  <w:color w:val="FFFFFF"/>
-                                  <w:w w:val="110"/>
-                                  <w:sz w:val="18"/>
-                                </w:rPr>
-                                <w:t>簡</w:t>
-                              </w:r>
-                              <w:r>
-                                <w:rPr>
-                                  <w:rFonts w:ascii="新細明體" w:eastAsia="新細明體" w:hint="eastAsia"/>
-                                  <w:color w:val="FFFFFF"/>
-                                  <w:spacing w:val="73"/>
-                                  <w:w w:val="150"/>
-                                  <w:sz w:val="18"/>
-                                </w:rPr>
-                                <w:t xml:space="preserve"> </w:t>
-                              </w:r>
-                              <w:r>
-                                <w:rPr>
-                                  <w:rFonts w:ascii="新細明體" w:eastAsia="新細明體" w:hint="eastAsia"/>
-                                  <w:color w:val="FFFFFF"/>
-                                  <w:spacing w:val="-10"/>
-                                  <w:w w:val="110"/>
-                                  <w:sz w:val="18"/>
-                                </w:rPr>
-                                <w:t>介</w:t>
-                              </w:r>
-                            </w:p>
-                          </w:txbxContent>
-                        </wps:txbx>
-                        <wps:bodyPr wrap="square" lIns="0" tIns="0" rIns="0" bIns="0" rtlCol="0">
-                          <a:noAutofit/>
-                        </wps:bodyPr>
-                      </wps:wsp>
-                    </wpg:wgp>
-                  </a:graphicData>
-                </a:graphic>
-              </wp:anchor>
-            </w:drawing>
-          </mc:Choice>
-          <mc:Fallback>
-            <w:pict>
-              <v:group w14:anchorId="1D16EF0D" id="_x0000_s1037" style="position:absolute;left:0;text-align:left;margin-left:66.15pt;margin-top:16.2pt;width:450.75pt;height:17.05pt;z-index:-251654144;mso-wrap-distance-left:0;mso-wrap-distance-right:0;mso-position-horizontal-relative:page" coordsize="57245,2165" o:gfxdata="UEsDBBQABgAIAAAAIQC2gziS/gAAAOEBAAATAAAAW0NvbnRlbnRfVHlwZXNdLnhtbJSRQU7DMBBF 90jcwfIWJU67QAgl6YK0S0CoHGBkTxKLZGx5TGhvj5O2G0SRWNoz/78nu9wcxkFMGNg6quQqL6RA 0s5Y6ir5vt9lD1JwBDIwOMJKHpHlpr69KfdHjyxSmriSfYz+USnWPY7AufNIadK6MEJMx9ApD/oD OlTrorhX2lFEilmcO2RdNtjC5xDF9pCuTyYBB5bi6bQ4syoJ3g9WQ0ymaiLzg5KdCXlKLjvcW893 SUOqXwnz5DrgnHtJTxOsQfEKIT7DmDSUCaxw7Rqn8787ZsmRM9e2VmPeBN4uqYvTtW7jvijg9N/y JsXecLq0q+WD6m8AAAD//wMAUEsDBBQABgAIAAAAIQA4/SH/1gAAAJQBAAALAAAAX3JlbHMvLnJl bHOkkMFqwzAMhu+DvYPRfXGawxijTi+j0GvpHsDYimMaW0Yy2fr2M4PBMnrbUb/Q94l/f/hMi1qR JVI2sOt6UJgd+ZiDgffL8ekFlFSbvV0oo4EbChzGx4f9GRdb25HMsYhqlCwG5lrLq9biZkxWOiqY 22YiTra2kYMu1l1tQD30/bPm3wwYN0x18gb45AdQl1tp5j/sFB2T0FQ7R0nTNEV3j6o9feQzro1i OWA14Fm+Q8a1a8+Bvu/d/dMb2JY5uiPbhG/ktn4cqGU/er3pcvwCAAD//wMAUEsDBBQABgAIAAAA IQDzRtvjTQUAAJIzAAAOAAAAZHJzL2Uyb0RvYy54bWzsW22PozYQ/l6p/wHxvRsgEF602dP19m5V 6XQ96bbqZ4eQBJVgajub7L/vjI15STYhudu7Vo0VKTFhMMPj8eOHYbh9s1sX1lPGeE7Lqe3eOLaV lSmd5+Vyav/x+OGXyLa4IOWcFLTMpvZzxu03dz//dLutksyjK1rMM2ZBJyVPttXUXglRJaMRT1fZ mvAbWmUl7FxQtiYCNtlyNGdkC72vi5HnOJPRlrJ5xWiacQ7/3qud9p3sf7HIUvH7YsEzYRVTG3wT 8pvJ7xl+j+5uSbJkpFrlae0G+Qov1iQv4aRNV/dEEGvD8oOu1nnKKKcLcZPS9YguFnmayWuAq3Gd vat5YHRTyWtZJttl1cAE0O7h9NXdpp+eHlj1pfrMlPfQ/EjTvzjgMtpWy6S7H7eXrfFuwdZ4EFyE tZOIPjeIZjthpfBnEHp+4AW2lcI+z50E40BBnq5gXA4OS1fvTx84Iok6rXSucWZbQfTwFiD+bQB9 WZEqk7hzBOAzs/L51B5D/JRkDUH8UMdLMJ7g1eDZwQxBrLd4jeeLEMVe5EcKhRdh8idxLAOzuViS pBsuHjIq8SZPH7lQcTvXLbLSrXRX6iaD6Me4L2TcC9uCuGe2BXE/U6eviMDjcBCxaW07A7aa2soR 3LumT9kjlXYCBw2H1fE929IjDq62NkXZtQXUOlZ6n/6tZH/Kxp+EcYyeQW96v/5Vdt3zXmatAdX9 pQXlmToVXro8ZwMHnL8LOKdFPv+QFwUCwNly9q5g1hMBZN9O8FO73DGD6OSJCgJszej8GYJoC2Ez tfnfG8Iy2yp+KyFMkZN0g+nGTDeYKN5RyVwSe8bF4+5PwiqrgubUFhA/n6iOVpLoyAD/0UDZ4pEl fbsRdJFj2EjflEf1BswcFcTffwq5h1MoRPjOnkJuFEfxRIaUOw6cmsD1PIK9Hk5TZJu6rcZYT8Tu sGq0gLRffx5pT2Aa1U0ch3aOqHiOfbyE7vxoLXSk6sgPXV9ahr4nITs6SbxwEiqEoBW5JycUdAbk DGgFYeiennvKT+WxAlV7qH+Vp02X7tj1onNddSfu2PNP+oouKgjcyA1CuZAcBaFFFuB3nNMo1J4i Dmd0XbsqrYe9rjuU1sOA1M6i9TDSna6Hh6/j9XBYdAAZDLcW6e/DsWGMH8Oxh/JQE39NnlqmwLK8 L1Ok3Lh6ju0xwTGi7YS+4QLUeh1AvoEL+mtES+WDXZrVDMag5dheDGtQLxGzRYky3wsdEB5Szx4V t+8d/BwSrxKX94SvlAiWurdZuWtNacTv4f3j+JCY5bp2NjH7ThDFSq8Z8auDX/8q9WnoYpgu+oh1 +N0seK+34F3CyZ3MwV6CwYhfzO++lBs9In7hBnFP/PpyCbt6ju0JByN+ZdLjR90I9wnXiF+ZbXqt VM4lRGvEb52L/vGZX5Ct+8Qsk3JnE/PEAwozmd9TqVcjfo34xXv6/npjMr/yMdsVPF0DdtznWA8T M1fPsUb8Jio98i9wQZ+MjPg14vf6yh7CQ2IeX0TM0Tg04vfcWoLh2/qmRmH4ubkpezhcOupV5NSt SKc2oU4wn7aWNRqm7KEtLTOZ3wszv1BovC9+ZT3R2eL3/8qxRvweMtjwEtF5LDZYo9A+ntePy7Xo 1b+miK8eg1b/n/GwscW1F8MaVJP5hVyPrmL979b8xpqYH6FMd0Z3VuDL2s0OMVti9yvFWiMtik8W 0MtJRhJd9HvkHQMARFf9YjE0Vs/XZdNYFy9rX/awUwX2e7XbYjfbyfL/xrdXquY+oyZbvuQAL35A tr73Zkl3W2by21dp7v4BAAD//wMAUEsDBBQABgAIAAAAIQBW0IWJ3wAAAAoBAAAPAAAAZHJzL2Rv d25yZXYueG1sTI9BS8NAEIXvgv9hGcGb3SRrg8RsSinqqQi2gnjbJtMkNDsbstsk/fdOT/b4mI83 38tXs+3EiINvHWmIFxEIpNJVLdUavvfvTy8gfDBUmc4Rarigh1Vxf5ebrHITfeG4C7XgEvKZ0dCE 0GdS+rJBa/zC9Uh8O7rBmsBxqGU1mInLbSeTKEqlNS3xh8b0uGmwPO3OVsPHZKa1it/G7em4ufzu l58/2xi1fnyY168gAs7hH4arPqtDwU4Hd6bKi46zShSjGlTyDOIKRErxmIOGNF2CLHJ5O6H4AwAA //8DAFBLAQItABQABgAIAAAAIQC2gziS/gAAAOEBAAATAAAAAAAAAAAAAAAAAAAAAABbQ29udGVu dF9UeXBlc10ueG1sUEsBAi0AFAAGAAgAAAAhADj9If/WAAAAlAEAAAsAAAAAAAAAAAAAAAAALwEA AF9yZWxzLy5yZWxzUEsBAi0AFAAGAAgAAAAhAPNG2+NNBQAAkjMAAA4AAAAAAAAAAAAAAAAALgIA AGRycy9lMm9Eb2MueG1sUEsBAi0AFAAGAAgAAAAhAFbQhYnfAAAACgEAAA8AAAAAAAAAAAAAAAAA pwcAAGRycy9kb3ducmV2LnhtbFBLBQYAAAAABAAEAPMAAACzCAAAAAA= ">
-                <v:shape id="Graphic 536" o:spid="_x0000_s1038" style="position:absolute;top:928;width:57245;height:470;visibility:visible;mso-wrap-style:square;v-text-anchor:top" coordsize="5724525,46990" o:gfxdata="UEsDBBQABgAIAAAAIQDb4fbL7gAAAIUBAAATAAAAW0NvbnRlbnRfVHlwZXNdLnhtbHyQz07DMAyH 70i8Q+QralM4IITa7kDhCAiNB7ASt43WOlEcyvb2pNu4IODoPz9/n1xv9vOkForiPDdwXVagiI23 jocG3rdPxR0oScgWJ8/UwIEENu3lRb09BBKV0ywNjCmFe63FjDSjlD4Q50nv44wpl3HQAc0OB9I3 VXWrjedEnIq03oC27qjHjympx31un0wiTQLq4bS4shrAECZnMGVTvbD9QSnOhDInjzsyuiBXWQP0 r4R18jfgnHvJr4nOknrFmJ5xzhraRtHWf3Kkpfz/yGo5S+H73hkquyhdjr3R8m2lj09svwAAAP// AwBQSwMEFAAGAAgAAAAhAFr0LFu/AAAAFQEAAAsAAABfcmVscy8ucmVsc2zPwWrDMAwG4Ptg72B0 X5TuUMaI01uh19I+gLGVxCy2jGSy9e1nemrHjpL4P0nD4SetZiPRyNnCruvBUPYcYp4tXC/Htw8w Wl0ObuVMFm6kcBhfX4Yzra62kC6xqGlKVgtLreUTUf1CyWnHhXKbTCzJ1VbKjMX5LzcTvvf9HuXR gPHJNKdgQU5hB+ZyK23zHztFL6w81c5zQp6m6P9TMfB3PtPWFCczVQtB9N4U2rp2HOA44NMz4y8A AAD//wMAUEsDBBQABgAIAAAAIQB1mko8vwAAANsAAAAPAAAAZHJzL2Rvd25yZXYueG1sRE/LisIw FN0L/kO4wuw0tQ4i1SiiCCIDMj721+baFJub2kStfz9ZCLM8nPds0dpKPKnxpWMFw0ECgjh3uuRC wem46U9A+ICssXJMCt7kYTHvdmaYaffiX3oeQiFiCPsMFZgQ6kxKnxuy6AeuJo7c1TUWQ4RNIXWD rxhuK5kmyVhaLDk2GKxpZSi/HR5WwXm9S3/cfZkW5eV8+tbv8Xpvdkp99drlFESgNvyLP+6tVjCK 6+OX+APk/A8AAP//AwBQSwECLQAUAAYACAAAACEA2+H2y+4AAACFAQAAEwAAAAAAAAAAAAAAAAAA AAAAW0NvbnRlbnRfVHlwZXNdLnhtbFBLAQItABQABgAIAAAAIQBa9CxbvwAAABUBAAALAAAAAAAA AAAAAAAAAB8BAABfcmVscy8ucmVsc1BLAQItABQABgAIAAAAIQB1mko8vwAAANsAAAAPAAAAAAAA AAAAAAAAAAcCAABkcnMvZG93bnJldi54bWxQSwUGAAAAAAMAAwC3AAAA8wIAAAAA " path="m5724042,l,,,46799r5724042,l5724042,xe" fillcolor="#a6a6a6" stroked="f">
-                  <v:path arrowok="t"/>
-                </v:shape>
-                <v:shape id="Graphic 537" o:spid="_x0000_s1039" style="position:absolute;left:1898;top:135;width:1893;height:1892;visibility:visible;mso-wrap-style:square;v-text-anchor:top" coordsize="189230,189230" o:gfxdata="UEsDBBQABgAIAAAAIQDb4fbL7gAAAIUBAAATAAAAW0NvbnRlbnRfVHlwZXNdLnhtbHyQz07DMAyH 70i8Q+QralM4IITa7kDhCAiNB7ASt43WOlEcyvb2pNu4IODoPz9/n1xv9vOkForiPDdwXVagiI23 jocG3rdPxR0oScgWJ8/UwIEENu3lRb09BBKV0ywNjCmFe63FjDSjlD4Q50nv44wpl3HQAc0OB9I3 VXWrjedEnIq03oC27qjHjympx31un0wiTQLq4bS4shrAECZnMGVTvbD9QSnOhDInjzsyuiBXWQP0 r4R18jfgnHvJr4nOknrFmJ5xzhraRtHWf3Kkpfz/yGo5S+H73hkquyhdjr3R8m2lj09svwAAAP// AwBQSwMEFAAGAAgAAAAhAFr0LFu/AAAAFQEAAAsAAABfcmVscy8ucmVsc2zPwWrDMAwG4Ptg72B0 X5TuUMaI01uh19I+gLGVxCy2jGSy9e1nemrHjpL4P0nD4SetZiPRyNnCruvBUPYcYp4tXC/Htw8w Wl0ObuVMFm6kcBhfX4Yzra62kC6xqGlKVgtLreUTUf1CyWnHhXKbTCzJ1VbKjMX5LzcTvvf9HuXR gPHJNKdgQU5hB+ZyK23zHztFL6w81c5zQp6m6P9TMfB3PtPWFCczVQtB9N4U2rp2HOA44NMz4y8A AAD//wMAUEsDBBQABgAIAAAAIQCBbEykxAAAANsAAAAPAAAAZHJzL2Rvd25yZXYueG1sRI9Ba8JA FITvhf6H5RV6CbqxQinRVSSlpfRkrd4f2ecmmH0bs9tk21/vCgWPw8x8wyzX0bZioN43jhXMpjkI 4srpho2C/ffb5AWED8gaW8ek4Jc8rFf3d0sstBv5i4ZdMCJB2BeooA6hK6T0VU0W/dR1xMk7ut5i SLI3Uvc4Jrht5VOeP0uLDaeFGjsqa6pOux+rwByzbnj/NNk5P4xZ3Jav5Tn+KfX4EDcLEIFiuIX/ 2x9awXwG1y/pB8jVBQAA//8DAFBLAQItABQABgAIAAAAIQDb4fbL7gAAAIUBAAATAAAAAAAAAAAA AAAAAAAAAABbQ29udGVudF9UeXBlc10ueG1sUEsBAi0AFAAGAAgAAAAhAFr0LFu/AAAAFQEAAAsA AAAAAAAAAAAAAAAAHwEAAF9yZWxzLy5yZWxzUEsBAi0AFAAGAAgAAAAhAIFsTKTEAAAA2wAAAA8A AAAAAAAAAAAAAAAABwIAAGRycy9kb3ducmV2LnhtbFBLBQYAAAAAAwADALcAAAD4AgAAAAA= " path="m94500,l57714,7427,27676,27681,7425,57719,,94500r7425,36787l27676,161324r30038,20251l94500,189001r36787,-7426l161324,161324r20251,-30037l189001,94500,181575,57719,161324,27681,131287,7427,94500,xe" fillcolor="#797979" stroked="f">
-                  <v:path arrowok="t"/>
-                </v:shape>
-                <v:shape id="Graphic 538" o:spid="_x0000_s1040" style="position:absolute;left:1898;top:135;width:1893;height:1892;visibility:visible;mso-wrap-style:square;v-text-anchor:top" coordsize="189230,189230" o:gfxdata="UEsDBBQABgAIAAAAIQDb4fbL7gAAAIUBAAATAAAAW0NvbnRlbnRfVHlwZXNdLnhtbHyQz07DMAyH 70i8Q+QralM4IITa7kDhCAiNB7ASt43WOlEcyvb2pNu4IODoPz9/n1xv9vOkForiPDdwXVagiI23 jocG3rdPxR0oScgWJ8/UwIEENu3lRb09BBKV0ywNjCmFe63FjDSjlD4Q50nv44wpl3HQAc0OB9I3 VXWrjedEnIq03oC27qjHjympx31un0wiTQLq4bS4shrAECZnMGVTvbD9QSnOhDInjzsyuiBXWQP0 r4R18jfgnHvJr4nOknrFmJ5xzhraRtHWf3Kkpfz/yGo5S+H73hkquyhdjr3R8m2lj09svwAAAP// AwBQSwMEFAAGAAgAAAAhAFr0LFu/AAAAFQEAAAsAAABfcmVscy8ucmVsc2zPwWrDMAwG4Ptg72B0 X5TuUMaI01uh19I+gLGVxCy2jGSy9e1nemrHjpL4P0nD4SetZiPRyNnCruvBUPYcYp4tXC/Htw8w Wl0ObuVMFm6kcBhfX4Yzra62kC6xqGlKVgtLreUTUf1CyWnHhXKbTCzJ1VbKjMX5LzcTvvf9HuXR gPHJNKdgQU5hB+ZyK23zHztFL6w81c5zQp6m6P9TMfB3PtPWFCczVQtB9N4U2rp2HOA44NMz4y8A AAD//wMAUEsDBBQABgAIAAAAIQDywbDQyAAAANsAAAAPAAAAZHJzL2Rvd25yZXYueG1sRI9PT8JA FMTvJHyHzSPxYmArjQKVhYhG5SD/qpHrS/fRNnbfNt2V1m/vmphwnMzMbzLzZWcqcabGlZYV3Iwi EMSZ1SXnCj7en4dTEM4ja6wsk4IfcrBc9HtzTLRt+UDn1OciQNglqKDwvk6kdFlBBt3I1sTBO9nG oA+yyaVusA1wU8lxFN1JgyWHhQJreiwo+0q/jYKX1Xoye1tt9+7pNd3sPnfxbX59VOpq0D3cg/DU +Uv4v73WCuIx/H0JP0AufgEAAP//AwBQSwECLQAUAAYACAAAACEA2+H2y+4AAACFAQAAEwAAAAAA AAAAAAAAAAAAAAAAW0NvbnRlbnRfVHlwZXNdLnhtbFBLAQItABQABgAIAAAAIQBa9CxbvwAAABUB AAALAAAAAAAAAAAAAAAAAB8BAABfcmVscy8ucmVsc1BLAQItABQABgAIAAAAIQDywbDQyAAAANsA AAAPAAAAAAAAAAAAAAAAAAcCAABkcnMvZG93bnJldi54bWxQSwUGAAAAAAMAAwC3AAAA/AIAAAAA " path="m94500,189001r36787,-7426l161324,161324r20251,-30037l189001,94500,181575,57719,161324,27681,131287,7427,94500,,57714,7427,27676,27681,7425,57719,,94500r7425,36787l27676,161324r30038,20251l94500,189001xe" filled="f" strokecolor="#e0e0e0" strokeweight=".75mm">
-                  <v:path arrowok="t"/>
-                </v:shape>
-                <v:shape id="Graphic 539" o:spid="_x0000_s1041" style="position:absolute;left:4058;top:135;width:1893;height:1892;visibility:visible;mso-wrap-style:square;v-text-anchor:top" coordsize="189230,189230" o:gfxdata="UEsDBBQABgAIAAAAIQDb4fbL7gAAAIUBAAATAAAAW0NvbnRlbnRfVHlwZXNdLnhtbHyQz07DMAyH 70i8Q+QralM4IITa7kDhCAiNB7ASt43WOlEcyvb2pNu4IODoPz9/n1xv9vOkForiPDdwXVagiI23 jocG3rdPxR0oScgWJ8/UwIEENu3lRb09BBKV0ywNjCmFe63FjDSjlD4Q50nv44wpl3HQAc0OB9I3 VXWrjedEnIq03oC27qjHjympx31un0wiTQLq4bS4shrAECZnMGVTvbD9QSnOhDInjzsyuiBXWQP0 r4R18jfgnHvJr4nOknrFmJ5xzhraRtHWf3Kkpfz/yGo5S+H73hkquyhdjr3R8m2lj09svwAAAP// AwBQSwMEFAAGAAgAAAAhAFr0LFu/AAAAFQEAAAsAAABfcmVscy8ucmVsc2zPwWrDMAwG4Ptg72B0 X5TuUMaI01uh19I+gLGVxCy2jGSy9e1nemrHjpL4P0nD4SetZiPRyNnCruvBUPYcYp4tXC/Htw8w Wl0ObuVMFm6kcBhfX4Yzra62kC6xqGlKVgtLreUTUf1CyWnHhXKbTCzJ1VbKjMX5LzcTvvf9HuXR gPHJNKdgQU5hB+ZyK23zHztFL6w81c5zQp6m6P9TMfB3PtPWFCczVQtB9N4U2rp2HOA44NMz4y8A AAD//wMAUEsDBBQABgAIAAAAIQAe8ndIxAAAANsAAAAPAAAAZHJzL2Rvd25yZXYueG1sRI9Ba8JA FITvQv/D8gpegm5aQUp0lZJiEU+tbe+P7HMTmn0bs2uy7a93CwWPw8x8w6y30bZioN43jhU8zHMQ xJXTDRsFnx+72RMIH5A1to5JwQ952G7uJmsstBv5nYZjMCJB2BeooA6hK6T0VU0W/dx1xMk7ud5i SLI3Uvc4Jrht5WOeL6XFhtNCjR2VNVXfx4tVYE5ZN7weTHbOv8YsvpUv5Tn+KjW9j88rEIFiuIX/ 23utYLGAvy/pB8jNFQAA//8DAFBLAQItABQABgAIAAAAIQDb4fbL7gAAAIUBAAATAAAAAAAAAAAA AAAAAAAAAABbQ29udGVudF9UeXBlc10ueG1sUEsBAi0AFAAGAAgAAAAhAFr0LFu/AAAAFQEAAAsA AAAAAAAAAAAAAAAAHwEAAF9yZWxzLy5yZWxzUEsBAi0AFAAGAAgAAAAhAB7yd0jEAAAA2wAAAA8A AAAAAAAAAAAAAAAABwIAAGRycy9kb3ducmV2LnhtbFBLBQYAAAAAAwADALcAAAD4AgAAAAA= " path="m94500,l57714,7427,27676,27681,7425,57719,,94500r7425,36787l27676,161324r30038,20251l94500,189001r36787,-7426l161324,161324r20251,-30037l189001,94500,181575,57719,161324,27681,131287,7427,94500,xe" fillcolor="#797979" stroked="f">
-                  <v:path arrowok="t"/>
-                </v:shape>
-                <v:shape id="Graphic 540" o:spid="_x0000_s1042" style="position:absolute;left:4058;top:135;width:1893;height:1892;visibility:visible;mso-wrap-style:square;v-text-anchor:top" coordsize="189230,189230" o:gfxdata="UEsDBBQABgAIAAAAIQDb4fbL7gAAAIUBAAATAAAAW0NvbnRlbnRfVHlwZXNdLnhtbHyQz07DMAyH 70i8Q+QralM4IITa7kDhCAiNB7ASt43WOlEcyvb2pNu4IODoPz9/n1xv9vOkForiPDdwXVagiI23 jocG3rdPxR0oScgWJ8/UwIEENu3lRb09BBKV0ywNjCmFe63FjDSjlD4Q50nv44wpl3HQAc0OB9I3 VXWrjedEnIq03oC27qjHjympx31un0wiTQLq4bS4shrAECZnMGVTvbD9QSnOhDInjzsyuiBXWQP0 r4R18jfgnHvJr4nOknrFmJ5xzhraRtHWf3Kkpfz/yGo5S+H73hkquyhdjr3R8m2lj09svwAAAP// AwBQSwMEFAAGAAgAAAAhAFr0LFu/AAAAFQEAAAsAAABfcmVscy8ucmVsc2zPwWrDMAwG4Ptg72B0 X5TuUMaI01uh19I+gLGVxCy2jGSy9e1nemrHjpL4P0nD4SetZiPRyNnCruvBUPYcYp4tXC/Htw8w Wl0ObuVMFm6kcBhfX4Yzra62kC6xqGlKVgtLreUTUf1CyWnHhXKbTCzJ1VbKjMX5LzcTvvf9HuXR gPHJNKdgQU5hB+ZyK23zHztFL6w81c5zQp6m6P9TMfB3PtPWFCczVQtB9N4U2rp2HOA44NMz4y8A AAD//wMAUEsDBBQABgAIAAAAIQASZI0/yAAAANsAAAAPAAAAZHJzL2Rvd25yZXYueG1sRI9BS8NA FITvgv9heYIXaTYaq23sthhF7cGaNkp7fWSfSTD7NmTXNv77riB4HGbmG2a2GEwr9tS7xrKCyygG QVxa3XCl4OP9aTQB4TyyxtYyKfghB4v56ckMU20PvKF94SsRIOxSVFB736VSurImgy6yHXHwPm1v 0AfZV1L3eAhw08qrOL6RBhsOCzV29FBT+VV8GwXP2fJ2+pq9rd3jS7HKt3kyri52Sp2fDfd3IDwN /j/8115qBck1/H4JP0DOjwAAAP//AwBQSwECLQAUAAYACAAAACEA2+H2y+4AAACFAQAAEwAAAAAA AAAAAAAAAAAAAAAAW0NvbnRlbnRfVHlwZXNdLnhtbFBLAQItABQABgAIAAAAIQBa9CxbvwAAABUB AAALAAAAAAAAAAAAAAAAAB8BAABfcmVscy8ucmVsc1BLAQItABQABgAIAAAAIQASZI0/yAAAANsA AAAPAAAAAAAAAAAAAAAAAAcCAABkcnMvZG93bnJldi54bWxQSwUGAAAAAAMAAwC3AAAA/AIAAAAA " path="m94500,189001r36787,-7426l161324,161324r20251,-30037l189001,94500,181575,57719,161324,27681,131287,7427,94500,,57714,7427,27676,27681,7425,57719,,94500r7425,36787l27676,161324r30038,20251l94500,189001xe" filled="f" strokecolor="#e0e0e0" strokeweight=".75mm">
-                  <v:path arrowok="t"/>
-                </v:shape>
-                <v:shape id="Graphic 541" o:spid="_x0000_s1043" style="position:absolute;left:6218;top:135;width:1893;height:1892;visibility:visible;mso-wrap-style:square;v-text-anchor:top" coordsize="189230,189230" o:gfxdata="UEsDBBQABgAIAAAAIQDb4fbL7gAAAIUBAAATAAAAW0NvbnRlbnRfVHlwZXNdLnhtbHyQz07DMAyH 70i8Q+QralM4IITa7kDhCAiNB7ASt43WOlEcyvb2pNu4IODoPz9/n1xv9vOkForiPDdwXVagiI23 jocG3rdPxR0oScgWJ8/UwIEENu3lRb09BBKV0ywNjCmFe63FjDSjlD4Q50nv44wpl3HQAc0OB9I3 VXWrjedEnIq03oC27qjHjympx31un0wiTQLq4bS4shrAECZnMGVTvbD9QSnOhDInjzsyuiBXWQP0 r4R18jfgnHvJr4nOknrFmJ5xzhraRtHWf3Kkpfz/yGo5S+H73hkquyhdjr3R8m2lj09svwAAAP// AwBQSwMEFAAGAAgAAAAhAFr0LFu/AAAAFQEAAAsAAABfcmVscy8ucmVsc2zPwWrDMAwG4Ptg72B0 X5TuUMaI01uh19I+gLGVxCy2jGSy9e1nemrHjpL4P0nD4SetZiPRyNnCruvBUPYcYp4tXC/Htw8w Wl0ObuVMFm6kcBhfX4Yzra62kC6xqGlKVgtLreUTUf1CyWnHhXKbTCzJ1VbKjMX5LzcTvvf9HuXR gPHJNKdgQU5hB+ZyK23zHztFL6w81c5zQp6m6P9TMfB3PtPWFCczVQtB9N4U2rp2HOA44NMz4y8A AAD//wMAUEsDBBQABgAIAAAAIQD+V0qnxQAAANsAAAAPAAAAZHJzL2Rvd25yZXYueG1sRI9BS8NA FITvBf/D8gQvod1oqUjstkhEEU9ttfdH9nUTzL5Ns2uy9te7hUKPw8x8wyzX0bZioN43jhXcz3IQ xJXTDRsF319v0ycQPiBrbB2Tgj/ysF7dTJZYaDfyloZdMCJB2BeooA6hK6T0VU0W/cx1xMk7uN5i SLI3Uvc4Jrht5UOeP0qLDaeFGjsqa6p+dr9WgTlk3fD+abJjvh+zuClfy2M8KXV3G1+eQQSK4Rq+ tD+0gvkCzl/SD5CrfwAAAP//AwBQSwECLQAUAAYACAAAACEA2+H2y+4AAACFAQAAEwAAAAAAAAAA AAAAAAAAAAAAW0NvbnRlbnRfVHlwZXNdLnhtbFBLAQItABQABgAIAAAAIQBa9CxbvwAAABUBAAAL AAAAAAAAAAAAAAAAAB8BAABfcmVscy8ucmVsc1BLAQItABQABgAIAAAAIQD+V0qnxQAAANsAAAAP AAAAAAAAAAAAAAAAAAcCAABkcnMvZG93bnJldi54bWxQSwUGAAAAAAMAAwC3AAAA+QIAAAAA " path="m94500,l57714,7427,27676,27681,7425,57719,,94500r7425,36787l27676,161324r30038,20251l94500,189001r36787,-7426l161324,161324r20251,-30037l189001,94500,181575,57719,161324,27681,131287,7427,94500,xe" fillcolor="#797979" stroked="f">
-                  <v:path arrowok="t"/>
-                </v:shape>
-                <v:shape id="Graphic 542" o:spid="_x0000_s1044" style="position:absolute;left:6218;top:135;width:1893;height:1892;visibility:visible;mso-wrap-style:square;v-text-anchor:top" coordsize="189230,189230" o:gfxdata="UEsDBBQABgAIAAAAIQDb4fbL7gAAAIUBAAATAAAAW0NvbnRlbnRfVHlwZXNdLnhtbHyQz07DMAyH 70i8Q+QralM4IITa7kDhCAiNB7ASt43WOlEcyvb2pNu4IODoPz9/n1xv9vOkForiPDdwXVagiI23 jocG3rdPxR0oScgWJ8/UwIEENu3lRb09BBKV0ywNjCmFe63FjDSjlD4Q50nv44wpl3HQAc0OB9I3 VXWrjedEnIq03oC27qjHjympx31un0wiTQLq4bS4shrAECZnMGVTvbD9QSnOhDInjzsyuiBXWQP0 r4R18jfgnHvJr4nOknrFmJ5xzhraRtHWf3Kkpfz/yGo5S+H73hkquyhdjr3R8m2lj09svwAAAP// AwBQSwMEFAAGAAgAAAAhAFr0LFu/AAAAFQEAAAsAAABfcmVscy8ucmVsc2zPwWrDMAwG4Ptg72B0 X5TuUMaI01uh19I+gLGVxCy2jGSy9e1nemrHjpL4P0nD4SetZiPRyNnCruvBUPYcYp4tXC/Htw8w Wl0ObuVMFm6kcBhfX4Yzra62kC6xqGlKVgtLreUTUf1CyWnHhXKbTCzJ1VbKjMX5LzcTvvf9HuXR gPHJNKdgQU5hB+ZyK23zHztFL6w81c5zQp6m6P9TMfB3PtPWFCczVQtB9N4U2rp2HOA44NMz4y8A AAD//wMAUEsDBBQABgAIAAAAIQCN+rbTyAAAANsAAAAPAAAAZHJzL2Rvd25yZXYueG1sRI9bS8NA FITfC/0Pyyn4Iu1Gg73EbotV1D7YWxT7esieJsHs2ZBdm/jvXUHo4zAz3zDzZWcqcabGlZYV3Iwi EMSZ1SXnCj7en4dTEM4ja6wsk4IfcrBc9HtzTLRt+UDn1OciQNglqKDwvk6kdFlBBt3I1sTBO9nG oA+yyaVusA1wU8nbKBpLgyWHhQJreiwo+0q/jYKX1Xoye1tt9+7pNd3sPnfxXX59VOpq0D3cg/DU +Uv4v73WCuIx/H0JP0AufgEAAP//AwBQSwECLQAUAAYACAAAACEA2+H2y+4AAACFAQAAEwAAAAAA AAAAAAAAAAAAAAAAW0NvbnRlbnRfVHlwZXNdLnhtbFBLAQItABQABgAIAAAAIQBa9CxbvwAAABUB AAALAAAAAAAAAAAAAAAAAB8BAABfcmVscy8ucmVsc1BLAQItABQABgAIAAAAIQCN+rbTyAAAANsA AAAPAAAAAAAAAAAAAAAAAAcCAABkcnMvZG93bnJldi54bWxQSwUGAAAAAAMAAwC3AAAA/AIAAAAA " path="m94500,189001r36787,-7426l161324,161324r20251,-30037l189001,94500,181575,57719,161324,27681,131287,7427,94500,,57714,7427,27676,27681,7425,57719,,94500r7425,36787l27676,161324r30038,20251l94500,189001xe" filled="f" strokecolor="#e0e0e0" strokeweight=".75mm">
-                  <v:path arrowok="t"/>
-                </v:shape>
-                <v:shape id="Graphic 543" o:spid="_x0000_s1045" style="position:absolute;left:8378;top:135;width:1893;height:1892;visibility:visible;mso-wrap-style:square;v-text-anchor:top" coordsize="189230,189230" o:gfxdata="UEsDBBQABgAIAAAAIQDb4fbL7gAAAIUBAAATAAAAW0NvbnRlbnRfVHlwZXNdLnhtbHyQz07DMAyH 70i8Q+QralM4IITa7kDhCAiNB7ASt43WOlEcyvb2pNu4IODoPz9/n1xv9vOkForiPDdwXVagiI23 jocG3rdPxR0oScgWJ8/UwIEENu3lRb09BBKV0ywNjCmFe63FjDSjlD4Q50nv44wpl3HQAc0OB9I3 VXWrjedEnIq03oC27qjHjympx31un0wiTQLq4bS4shrAECZnMGVTvbD9QSnOhDInjzsyuiBXWQP0 r4R18jfgnHvJr4nOknrFmJ5xzhraRtHWf3Kkpfz/yGo5S+H73hkquyhdjr3R8m2lj09svwAAAP// AwBQSwMEFAAGAAgAAAAhAFr0LFu/AAAAFQEAAAsAAABfcmVscy8ucmVsc2zPwWrDMAwG4Ptg72B0 X5TuUMaI01uh19I+gLGVxCy2jGSy9e1nemrHjpL4P0nD4SetZiPRyNnCruvBUPYcYp4tXC/Htw8w Wl0ObuVMFm6kcBhfX4Yzra62kC6xqGlKVgtLreUTUf1CyWnHhXKbTCzJ1VbKjMX5LzcTvvf9HuXR gPHJNKdgQU5hB+ZyK23zHztFL6w81c5zQp6m6P9TMfB3PtPWFCczVQtB9N4U2rp2HOA44NMz4y8A AAD//wMAUEsDBBQABgAIAAAAIQBhyXFLxQAAANsAAAAPAAAAZHJzL2Rvd25yZXYueG1sRI9BS8NA FITvBf/D8gQvod1ooUrstkhEEU9ttfdH9nUTzL5Ns2uy9te7hUKPw8x8wyzX0bZioN43jhXcz3IQ xJXTDRsF319v0ycQPiBrbB2Tgj/ysF7dTJZYaDfyloZdMCJB2BeooA6hK6T0VU0W/cx1xMk7uN5i SLI3Uvc4Jrht5UOeL6TFhtNCjR2VNVU/u1+rwByybnj/NNkx349Z3JSv5TGelLq7jS/PIALFcA1f 2h9awfwRzl/SD5CrfwAAAP//AwBQSwECLQAUAAYACAAAACEA2+H2y+4AAACFAQAAEwAAAAAAAAAA AAAAAAAAAAAAW0NvbnRlbnRfVHlwZXNdLnhtbFBLAQItABQABgAIAAAAIQBa9CxbvwAAABUBAAAL AAAAAAAAAAAAAAAAAB8BAABfcmVscy8ucmVsc1BLAQItABQABgAIAAAAIQBhyXFLxQAAANsAAAAP AAAAAAAAAAAAAAAAAAcCAABkcnMvZG93bnJldi54bWxQSwUGAAAAAAMAAwC3AAAA+QIAAAAA " path="m94500,l57714,7427,27676,27681,7425,57719,,94500r7425,36787l27676,161324r30038,20251l94500,189001r36787,-7426l161324,161324r20251,-30037l189001,94500,181575,57719,161324,27681,131287,7427,94500,xe" fillcolor="#797979" stroked="f">
-                  <v:path arrowok="t"/>
-                </v:shape>
-                <v:shape id="Graphic 544" o:spid="_x0000_s1046" style="position:absolute;left:8378;top:135;width:1893;height:1892;visibility:visible;mso-wrap-style:square;v-text-anchor:top" coordsize="189230,189230" o:gfxdata="UEsDBBQABgAIAAAAIQDb4fbL7gAAAIUBAAATAAAAW0NvbnRlbnRfVHlwZXNdLnhtbHyQz07DMAyH 70i8Q+QralM4IITa7kDhCAiNB7ASt43WOlEcyvb2pNu4IODoPz9/n1xv9vOkForiPDdwXVagiI23 jocG3rdPxR0oScgWJ8/UwIEENu3lRb09BBKV0ywNjCmFe63FjDSjlD4Q50nv44wpl3HQAc0OB9I3 VXWrjedEnIq03oC27qjHjympx31un0wiTQLq4bS4shrAECZnMGVTvbD9QSnOhDInjzsyuiBXWQP0 r4R18jfgnHvJr4nOknrFmJ5xzhraRtHWf3Kkpfz/yGo5S+H73hkquyhdjr3R8m2lj09svwAAAP// AwBQSwMEFAAGAAgAAAAhAFr0LFu/AAAAFQEAAAsAAABfcmVscy8ucmVsc2zPwWrDMAwG4Ptg72B0 X5TuUMaI01uh19I+gLGVxCy2jGSy9e1nemrHjpL4P0nD4SetZiPRyNnCruvBUPYcYp4tXC/Htw8w Wl0ObuVMFm6kcBhfX4Yzra62kC6xqGlKVgtLreUTUf1CyWnHhXKbTCzJ1VbKjMX5LzcTvvf9HuXR gPHJNKdgQU5hB+ZyK23zHztFL6w81c5zQp6m6P9TMfB3PtPWFCczVQtB9N4U2rp2HOA44NMz4y8A AAD//wMAUEsDBBQABgAIAAAAIQCTKYc6xQAAANsAAAAPAAAAZHJzL2Rvd25yZXYueG1sRE/LTsJA FN2b8A+TS8KGwFSJIJWBCERhwUOqke1N59I2du40nRHK3zMLEpcn5z2ZNaYUZ6pdYVnBYz8CQZxa XXCm4PvrvfcCwnlkjaVlUnAlB7Np62GCsbYXPtA58ZkIIexiVJB7X8VSujQng65vK+LAnWxt0AdY Z1LXeAnhppRPUTSUBgsODTlWtMgp/U3+jIKP+Xo03sx3n265Srb7n/3gOeseleq0m7dXEJ4a/y++ u9dawSCMDV/CD5DTGwAAAP//AwBQSwECLQAUAAYACAAAACEA2+H2y+4AAACFAQAAEwAAAAAAAAAA AAAAAAAAAAAAW0NvbnRlbnRfVHlwZXNdLnhtbFBLAQItABQABgAIAAAAIQBa9CxbvwAAABUBAAAL AAAAAAAAAAAAAAAAAB8BAABfcmVscy8ucmVsc1BLAQItABQABgAIAAAAIQCTKYc6xQAAANsAAAAP AAAAAAAAAAAAAAAAAAcCAABkcnMvZG93bnJldi54bWxQSwUGAAAAAAMAAwC3AAAA+QIAAAAA " path="m94500,189001r36787,-7426l161324,161324r20251,-30037l189001,94500,181575,57719,161324,27681,131287,7427,94500,,57714,7427,27676,27681,7425,57719,,94500r7425,36787l27676,161324r30038,20251l94500,189001xe" filled="f" strokecolor="#e0e0e0" strokeweight=".75mm">
-                  <v:path arrowok="t"/>
-                </v:shape>
-                <v:shape id="Textbox 545" o:spid="_x0000_s1047" type="#_x0000_t202" style="position:absolute;width:57245;height:2165;visibility:visible;mso-wrap-style:square;v-text-anchor:top" o:gfxdata="UEsDBBQABgAIAAAAIQDb4fbL7gAAAIUBAAATAAAAW0NvbnRlbnRfVHlwZXNdLnhtbHyQz07DMAyH 70i8Q+QralM4IITa7kDhCAiNB7ASt43WOlEcyvb2pNu4IODoPz9/n1xv9vOkForiPDdwXVagiI23 jocG3rdPxR0oScgWJ8/UwIEENu3lRb09BBKV0ywNjCmFe63FjDSjlD4Q50nv44wpl3HQAc0OB9I3 VXWrjedEnIq03oC27qjHjympx31un0wiTQLq4bS4shrAECZnMGVTvbD9QSnOhDInjzsyuiBXWQP0 r4R18jfgnHvJr4nOknrFmJ5xzhraRtHWf3Kkpfz/yGo5S+H73hkquyhdjr3R8m2lj09svwAAAP// AwBQSwMEFAAGAAgAAAAhAFr0LFu/AAAAFQEAAAsAAABfcmVscy8ucmVsc2zPwWrDMAwG4Ptg72B0 X5TuUMaI01uh19I+gLGVxCy2jGSy9e1nemrHjpL4P0nD4SetZiPRyNnCruvBUPYcYp4tXC/Htw8w Wl0ObuVMFm6kcBhfX4Yzra62kC6xqGlKVgtLreUTUf1CyWnHhXKbTCzJ1VbKjMX5LzcTvvf9HuXR gPHJNKdgQU5hB+ZyK23zHztFL6w81c5zQp6m6P9TMfB3PtPWFCczVQtB9N4U2rp2HOA44NMz4y8A AAD//wMAUEsDBBQABgAIAAAAIQDPtldKwwAAANsAAAAPAAAAZHJzL2Rvd25yZXYueG1sRI9Ba8JA FITvBf/D8gre6qYKUlNXEVEQhGKMB4+v2WeymH0bs6vGf98VCh6HmfmGmc47W4sbtd44VvA5SEAQ F04bLhUc8vXHFwgfkDXWjknBgzzMZ723Kaba3Tmj2z6UIkLYp6igCqFJpfRFRRb9wDXE0Tu51mKI si2lbvEe4baWwyQZS4uG40KFDS0rKs77q1WwOHK2Mpef3112ykyeTxLejs9K9d+7xTeIQF14hf/b G61gNIHnl/gD5OwPAAD//wMAUEsBAi0AFAAGAAgAAAAhANvh9svuAAAAhQEAABMAAAAAAAAAAAAA AAAAAAAAAFtDb250ZW50X1R5cGVzXS54bWxQSwECLQAUAAYACAAAACEAWvQsW78AAAAVAQAACwAA AAAAAAAAAAAAAAAfAQAAX3JlbHMvLnJlbHNQSwECLQAUAAYACAAAACEAz7ZXSsMAAADbAAAADwAA AAAAAAAAAAAAAAAHAgAAZHJzL2Rvd25yZXYueG1sUEsFBgAAAAADAAMAtwAAAPcCAAAAAA== " filled="f" stroked="f">
-                  <v:textbox inset="0,0,0,0">
-                    <w:txbxContent>
-                      <w:p>
-                        <w:pPr>
-                          <w:spacing w:before="57"/>
-                          <w:ind w:left="351"/>
-                          <w:rPr>
-                            <w:rFonts w:ascii="新細明體" w:eastAsia="新細明體"/>
-                            <w:sz w:val="18"/>
-                          </w:rPr>
-                        </w:pPr>
-                        <w:r>
-                          <w:rPr>
-                            <w:rFonts w:ascii="新細明體" w:eastAsia="新細明體" w:hint="eastAsia"/>
-                            <w:color w:val="FFFFFF"/>
-                            <w:w w:val="110"/>
-                            <w:sz w:val="18"/>
-                          </w:rPr>
-                          <w:t>作</w:t>
-                        </w:r>
-                        <w:r>
-                          <w:rPr>
-                            <w:rFonts w:ascii="新細明體" w:eastAsia="新細明體" w:hint="eastAsia"/>
-                            <w:color w:val="FFFFFF"/>
-                            <w:spacing w:val="65"/>
-                            <w:w w:val="150"/>
-                            <w:sz w:val="18"/>
-                          </w:rPr>
-                          <w:t xml:space="preserve"> </w:t>
-                        </w:r>
-                        <w:r>
-                          <w:rPr>
-                            <w:rFonts w:ascii="新細明體" w:eastAsia="新細明體" w:hint="eastAsia"/>
-                            <w:color w:val="FFFFFF"/>
-                            <w:w w:val="110"/>
-                            <w:sz w:val="18"/>
-                          </w:rPr>
-                          <w:t>者</w:t>
-                        </w:r>
-                        <w:r>
-                          <w:rPr>
-                            <w:rFonts w:ascii="新細明體" w:eastAsia="新細明體" w:hint="eastAsia"/>
-                            <w:color w:val="FFFFFF"/>
-                            <w:spacing w:val="73"/>
-                            <w:w w:val="150"/>
-                            <w:sz w:val="18"/>
-                          </w:rPr>
-                          <w:t xml:space="preserve"> </w:t>
-                        </w:r>
-                        <w:r>
-                          <w:rPr>
-                            <w:rFonts w:ascii="新細明體" w:eastAsia="新細明體" w:hint="eastAsia"/>
-                            <w:color w:val="FFFFFF"/>
-                            <w:w w:val="110"/>
-                            <w:sz w:val="18"/>
-                          </w:rPr>
-                          <w:t>簡</w:t>
-                        </w:r>
-                        <w:r>
-                          <w:rPr>
-                            <w:rFonts w:ascii="新細明體" w:eastAsia="新細明體" w:hint="eastAsia"/>
-                            <w:color w:val="FFFFFF"/>
-                            <w:spacing w:val="73"/>
-                            <w:w w:val="150"/>
-                            <w:sz w:val="18"/>
-                          </w:rPr>
-                          <w:t xml:space="preserve"> </w:t>
-                        </w:r>
-                        <w:r>
-                          <w:rPr>
-                            <w:rFonts w:ascii="新細明體" w:eastAsia="新細明體" w:hint="eastAsia"/>
-                            <w:color w:val="FFFFFF"/>
-                            <w:spacing w:val="-10"/>
-                            <w:w w:val="110"/>
-                            <w:sz w:val="18"/>
-                          </w:rPr>
-                          <w:t>介</w:t>
-                        </w:r>
-                      </w:p>
-                    </w:txbxContent>
-                  </v:textbox>
-                </v:shape>
-                <w10:wrap type="topAndBottom" anchorx="page"/>
-              </v:group>
-            </w:pict>
-          </mc:Fallback>
-        </mc:AlternateContent>
-      </w:r>
-      <w:r>
-        <w:rPr>
-          <w:rFonts w:ascii="微軟正黑體" w:eastAsia="微軟正黑體" w:hAnsi="微軟正黑體" w:cs="Calibri" w:hint="eastAsia"/>
-          <w:spacing w:val="-7"/>
-          <w:w w:val="105"/>
-          <w:sz w:val="24"/>
-          <w:szCs w:val="24"/>
-          <w:lang w:eastAsia="zh-TW"/>
-        </w:rPr>
-        <w:t>作者1</w:t>
-      </w:r>
-      <w:r>
-        <w:rPr>
-          <w:rFonts w:ascii="微軟正黑體" w:eastAsia="微軟正黑體" w:hAnsi="微軟正黑體" w:cs="Calibri"/>
-          <w:spacing w:val="-7"/>
-          <w:w w:val="105"/>
-          <w:sz w:val="24"/>
-          <w:szCs w:val="24"/>
-          <w:lang w:eastAsia="zh-TW"/>
-        </w:rPr>
-        <w:t xml:space="preserve"> </w:t>
-      </w:r>
-      <w:r>
-        <w:rPr>
-          <w:rFonts w:ascii="微軟正黑體" w:eastAsia="微軟正黑體" w:hAnsi="微軟正黑體" w:cs="Calibri"/>
-          <w:spacing w:val="7"/>
-          <w:w w:val="105"/>
-          <w:sz w:val="24"/>
-          <w:szCs w:val="24"/>
-          <w:lang w:eastAsia="zh-TW"/>
-        </w:rPr>
-        <w:t>/</w:t>
-      </w:r>
-      <w:r>
-        <w:rPr>
-          <w:rFonts w:ascii="微軟正黑體" w:eastAsia="微軟正黑體" w:hAnsi="微軟正黑體" w:cs="微軟正黑體"/>
-          <w:spacing w:val="-4"/>
-          <w:w w:val="105"/>
-          <w:sz w:val="24"/>
-          <w:szCs w:val="24"/>
-          <w:lang w:eastAsia="zh-TW"/>
-        </w:rPr>
-        <w:t xml:space="preserve"> </w:t>
-      </w:r>
-      <w:r>
-        <w:rPr>
-          <w:rFonts w:ascii="微軟正黑體" w:eastAsia="微軟正黑體" w:hAnsi="微軟正黑體" w:cs="微軟正黑體" w:hint="eastAsia"/>
-          <w:spacing w:val="-4"/>
-          <w:w w:val="105"/>
-          <w:sz w:val="24"/>
-          <w:szCs w:val="24"/>
-          <w:lang w:eastAsia="zh-TW"/>
-        </w:rPr>
-        <w:t>單位名稱</w:t>
-      </w:r>
-      <w:r>
-        <w:rPr>
-          <w:rFonts w:ascii="微軟正黑體" w:eastAsia="微軟正黑體" w:hAnsi="微軟正黑體" w:cs="微軟正黑體"/>
-          <w:spacing w:val="-4"/>
-          <w:w w:val="105"/>
-          <w:sz w:val="24"/>
-          <w:szCs w:val="24"/>
-          <w:lang w:eastAsia="zh-TW"/>
-        </w:rPr>
-        <w:t xml:space="preserve"> / </w:t>
-      </w:r>
-      <w:r>
-        <w:rPr>
-          <w:rFonts w:ascii="微軟正黑體" w:eastAsia="微軟正黑體" w:hAnsi="微軟正黑體" w:cs="微軟正黑體" w:hint="eastAsia"/>
-          <w:spacing w:val="-4"/>
-          <w:w w:val="105"/>
-          <w:sz w:val="24"/>
-          <w:szCs w:val="24"/>
-          <w:lang w:eastAsia="zh-TW"/>
-        </w:rPr>
-        <w:t>職稱</w:t>
-      </w:r>
-    </w:p>
-    <w:p>
-      <w:pPr>
-        <w:spacing w:before="163"/>
-        <w:ind w:left="284"/>
-        <w:rPr>
-          <w:rFonts w:ascii="微軟正黑體" w:eastAsia="微軟正黑體" w:hAnsi="微軟正黑體"/>
-          <w:sz w:val="24"/>
-          <w:szCs w:val="24"/>
-          <w:lang w:eastAsia="zh-TW"/>
-        </w:rPr>
-      </w:pPr>
-      <w:r>
-        <w:rPr>
-          <w:rFonts w:ascii="微軟正黑體" w:eastAsia="微軟正黑體" w:hAnsi="微軟正黑體" w:cs="Calibri" w:hint="eastAsia"/>
-          <w:spacing w:val="-7"/>
-          <w:w w:val="105"/>
-          <w:sz w:val="24"/>
-          <w:szCs w:val="24"/>
-          <w:lang w:eastAsia="zh-TW"/>
-        </w:rPr>
-        <w:t>作者2</w:t>
-      </w:r>
-      <w:r>
-        <w:rPr>
-          <w:rFonts w:ascii="微軟正黑體" w:eastAsia="微軟正黑體" w:hAnsi="微軟正黑體" w:cs="Calibri"/>
-          <w:spacing w:val="-7"/>
-          <w:w w:val="105"/>
-          <w:sz w:val="24"/>
-          <w:szCs w:val="24"/>
-          <w:lang w:eastAsia="zh-TW"/>
-        </w:rPr>
-        <w:t xml:space="preserve"> </w:t>
-      </w:r>
-      <w:r>
-        <w:rPr>
-          <w:rFonts w:ascii="微軟正黑體" w:eastAsia="微軟正黑體" w:hAnsi="微軟正黑體" w:cs="Calibri"/>
-          <w:spacing w:val="7"/>
-          <w:w w:val="105"/>
-          <w:sz w:val="24"/>
-          <w:szCs w:val="24"/>
-          <w:lang w:eastAsia="zh-TW"/>
-        </w:rPr>
-        <w:t>/</w:t>
-      </w:r>
-      <w:r>
-        <w:rPr>
-          <w:rFonts w:ascii="微軟正黑體" w:eastAsia="微軟正黑體" w:hAnsi="微軟正黑體" w:cs="微軟正黑體"/>
-          <w:spacing w:val="-4"/>
-          <w:w w:val="105"/>
-          <w:sz w:val="24"/>
-          <w:szCs w:val="24"/>
-          <w:lang w:eastAsia="zh-TW"/>
-        </w:rPr>
-        <w:t xml:space="preserve"> </w:t>
-      </w:r>
-      <w:r>
-        <w:rPr>
-          <w:rFonts w:ascii="微軟正黑體" w:eastAsia="微軟正黑體" w:hAnsi="微軟正黑體" w:cs="微軟正黑體" w:hint="eastAsia"/>
-          <w:spacing w:val="-4"/>
-          <w:w w:val="105"/>
-          <w:sz w:val="24"/>
-          <w:szCs w:val="24"/>
-          <w:lang w:eastAsia="zh-TW"/>
-        </w:rPr>
-        <w:t>單位名稱</w:t>
-      </w:r>
-      <w:r>
-        <w:rPr>
-          <w:rFonts w:ascii="微軟正黑體" w:eastAsia="微軟正黑體" w:hAnsi="微軟正黑體" w:cs="微軟正黑體"/>
-          <w:spacing w:val="-4"/>
-          <w:w w:val="105"/>
-          <w:sz w:val="24"/>
-          <w:szCs w:val="24"/>
-          <w:lang w:eastAsia="zh-TW"/>
-        </w:rPr>
-        <w:t xml:space="preserve"> / </w:t>
-      </w:r>
-      <w:r>
-        <w:rPr>
-          <w:rFonts w:ascii="微軟正黑體" w:eastAsia="微軟正黑體" w:hAnsi="微軟正黑體" w:cs="微軟正黑體" w:hint="eastAsia"/>
-          <w:spacing w:val="-4"/>
-          <w:w w:val="105"/>
-          <w:sz w:val="24"/>
-          <w:szCs w:val="24"/>
-          <w:lang w:eastAsia="zh-TW"/>
-        </w:rPr>
-        <w:t>職稱</w:t>
-      </w:r>
-    </w:p>
-    <w:p>
-      <w:pPr>
-        <w:pStyle w:val="a3"/>
-        <w:spacing w:before="11"/>
-        <w:rPr>
-          <w:rFonts w:ascii="微軟正黑體" w:eastAsia="微軟正黑體" w:hAnsi="微軟正黑體"/>
-          <w:sz w:val="12"/>
-          <w:lang w:eastAsia="zh-TW"/>
-        </w:rPr>
-      </w:pPr>
-      <w:r>
-        <w:rPr>
-          <w:rFonts w:ascii="微軟正黑體" w:eastAsia="微軟正黑體" w:hAnsi="微軟正黑體"/>
-          <w:noProof/>
-          <w:lang w:val="en-US" w:eastAsia="zh-TW"/>
-        </w:rPr>
-        <mc:AlternateContent>
-          <mc:Choice Requires="wpg">
-            <w:drawing>
-              <wp:anchor distT="0" distB="0" distL="0" distR="0" simplePos="0" relativeHeight="251660288" behindDoc="1" locked="0" layoutInCell="1" allowOverlap="1" wp14:anchorId="0114E055" wp14:editId="18EED72D">
-                <wp:simplePos x="0" y="0"/>
-                <wp:positionH relativeFrom="page">
-                  <wp:posOffset>837006</wp:posOffset>
-                </wp:positionH>
-                <wp:positionV relativeFrom="paragraph">
-                  <wp:posOffset>121508</wp:posOffset>
-                </wp:positionV>
-                <wp:extent cx="5724525" cy="99060"/>
-                <wp:effectExtent l="0" t="0" r="0" b="0"/>
-                <wp:wrapTopAndBottom/>
-                <wp:docPr id="546" name="Group 546"/>
-                <wp:cNvGraphicFramePr>
-                  <a:graphicFrameLocks xmlns:a="http://schemas.openxmlformats.org/drawingml/2006/main"/>
-                </wp:cNvGraphicFramePr>
-                <a:graphic xmlns:a="http://schemas.openxmlformats.org/drawingml/2006/main">
-                  <a:graphicData uri="http://schemas.microsoft.com/office/word/2010/wordprocessingGroup">
-                    <wpg:wgp>
-                      <wpg:cNvGrpSpPr>
-                        <a:grpSpLocks/>
-                      </wpg:cNvGrpSpPr>
-                      <wpg:grpSpPr>
-                        <a:xfrm>
-                          <a:off x="0" y="0"/>
-                          <a:ext cx="5724525" cy="99060"/>
-                          <a:chOff x="0" y="0"/>
-                          <a:chExt cx="5724525" cy="99060"/>
-                        </a:xfrm>
-                      </wpg:grpSpPr>
-                      <wps:wsp>
-                        <wps:cNvPr id="547" name="Graphic 547"/>
-                        <wps:cNvSpPr/>
-                        <wps:spPr>
-                          <a:xfrm>
-                            <a:off x="0" y="40510"/>
-                            <a:ext cx="5724525" cy="18415"/>
-                          </a:xfrm>
-                          <a:custGeom>
-                            <a:avLst/>
-                            <a:gdLst/>
-                            <a:ahLst/>
-                            <a:cxnLst/>
-                            <a:rect l="l" t="t" r="r" b="b"/>
-                            <a:pathLst>
-                              <a:path w="5724525" h="18415">
-                                <a:moveTo>
-                                  <a:pt x="5724004" y="0"/>
-                                </a:moveTo>
-                                <a:lnTo>
-                                  <a:pt x="0" y="0"/>
-                                </a:lnTo>
-                                <a:lnTo>
-                                  <a:pt x="0" y="17995"/>
-                                </a:lnTo>
-                                <a:lnTo>
-                                  <a:pt x="5724004" y="17995"/>
-                                </a:lnTo>
-                                <a:lnTo>
-                                  <a:pt x="5724004" y="0"/>
-                                </a:lnTo>
-                                <a:close/>
-                              </a:path>
-                            </a:pathLst>
-                          </a:custGeom>
-                          <a:solidFill>
-                            <a:srgbClr val="A6A6A6"/>
-                          </a:solidFill>
-                        </wps:spPr>
-                        <wps:bodyPr wrap="square" lIns="0" tIns="0" rIns="0" bIns="0" rtlCol="0">
-                          <a:prstTxWarp prst="textNoShape">
-                            <a:avLst/>
-                          </a:prstTxWarp>
-                          <a:noAutofit/>
-                        </wps:bodyPr>
-                      </wps:wsp>
-                      <wps:wsp>
-                        <wps:cNvPr id="548" name="Graphic 548"/>
-                        <wps:cNvSpPr/>
-                        <wps:spPr>
-                          <a:xfrm>
-                            <a:off x="5321283" y="24301"/>
-                            <a:ext cx="50800" cy="50800"/>
-                          </a:xfrm>
-                          <a:custGeom>
-                            <a:avLst/>
-                            <a:gdLst/>
-                            <a:ahLst/>
-                            <a:cxnLst/>
-                            <a:rect l="l" t="t" r="r" b="b"/>
-                            <a:pathLst>
-                              <a:path w="50800" h="50800">
-                                <a:moveTo>
-                                  <a:pt x="25196" y="0"/>
-                                </a:moveTo>
-                                <a:lnTo>
-                                  <a:pt x="15387" y="1979"/>
-                                </a:lnTo>
-                                <a:lnTo>
-                                  <a:pt x="7378" y="7378"/>
-                                </a:lnTo>
-                                <a:lnTo>
-                                  <a:pt x="1979" y="15387"/>
-                                </a:lnTo>
-                                <a:lnTo>
-                                  <a:pt x="0" y="25196"/>
-                                </a:lnTo>
-                                <a:lnTo>
-                                  <a:pt x="1979" y="35005"/>
-                                </a:lnTo>
-                                <a:lnTo>
-                                  <a:pt x="7378" y="43014"/>
-                                </a:lnTo>
-                                <a:lnTo>
-                                  <a:pt x="15387" y="48413"/>
-                                </a:lnTo>
-                                <a:lnTo>
-                                  <a:pt x="25196" y="50393"/>
-                                </a:lnTo>
-                                <a:lnTo>
-                                  <a:pt x="35005" y="48413"/>
-                                </a:lnTo>
-                                <a:lnTo>
-                                  <a:pt x="43014" y="43014"/>
-                                </a:lnTo>
-                                <a:lnTo>
-                                  <a:pt x="48413" y="35005"/>
-                                </a:lnTo>
-                                <a:lnTo>
-                                  <a:pt x="50393" y="25196"/>
-                                </a:lnTo>
-                                <a:lnTo>
-                                  <a:pt x="48413" y="15387"/>
-                                </a:lnTo>
-                                <a:lnTo>
-                                  <a:pt x="43014" y="7378"/>
-                                </a:lnTo>
-                                <a:lnTo>
-                                  <a:pt x="35005" y="1979"/>
-                                </a:lnTo>
-                                <a:lnTo>
-                                  <a:pt x="25196" y="0"/>
-                                </a:lnTo>
-                                <a:close/>
-                              </a:path>
-                            </a:pathLst>
-                          </a:custGeom>
-                          <a:solidFill>
-                            <a:srgbClr val="FFFFFF"/>
-                          </a:solidFill>
-                        </wps:spPr>
-                        <wps:bodyPr wrap="square" lIns="0" tIns="0" rIns="0" bIns="0" rtlCol="0">
-                          <a:prstTxWarp prst="textNoShape">
-                            <a:avLst/>
-                          </a:prstTxWarp>
-                          <a:noAutofit/>
-                        </wps:bodyPr>
-                      </wps:wsp>
-                      <wps:wsp>
-                        <wps:cNvPr id="549" name="Graphic 549"/>
-                        <wps:cNvSpPr/>
-                        <wps:spPr>
-                          <a:xfrm>
-                            <a:off x="5321283" y="24301"/>
-                            <a:ext cx="50800" cy="50800"/>
-                          </a:xfrm>
-                          <a:custGeom>
-                            <a:avLst/>
-                            <a:gdLst/>
-                            <a:ahLst/>
-                            <a:cxnLst/>
-                            <a:rect l="l" t="t" r="r" b="b"/>
-                            <a:pathLst>
-                              <a:path w="50800" h="50800">
-                                <a:moveTo>
-                                  <a:pt x="25196" y="50393"/>
-                                </a:moveTo>
-                                <a:lnTo>
-                                  <a:pt x="35005" y="48413"/>
-                                </a:lnTo>
-                                <a:lnTo>
-                                  <a:pt x="43014" y="43014"/>
-                                </a:lnTo>
-                                <a:lnTo>
-                                  <a:pt x="48413" y="35005"/>
-                                </a:lnTo>
-                                <a:lnTo>
-                                  <a:pt x="50393" y="25196"/>
-                                </a:lnTo>
-                                <a:lnTo>
-                                  <a:pt x="48413" y="15387"/>
-                                </a:lnTo>
-                                <a:lnTo>
-                                  <a:pt x="43014" y="7378"/>
-                                </a:lnTo>
-                                <a:lnTo>
-                                  <a:pt x="35005" y="1979"/>
-                                </a:lnTo>
-                                <a:lnTo>
-                                  <a:pt x="25196" y="0"/>
-                                </a:lnTo>
-                                <a:lnTo>
-                                  <a:pt x="15387" y="1979"/>
-                                </a:lnTo>
-                                <a:lnTo>
-                                  <a:pt x="7378" y="7378"/>
-                                </a:lnTo>
-                                <a:lnTo>
-                                  <a:pt x="1979" y="15387"/>
-                                </a:lnTo>
-                                <a:lnTo>
-                                  <a:pt x="0" y="25196"/>
-                                </a:lnTo>
-                                <a:lnTo>
-                                  <a:pt x="1979" y="35005"/>
-                                </a:lnTo>
-                                <a:lnTo>
-                                  <a:pt x="7378" y="43014"/>
-                                </a:lnTo>
-                                <a:lnTo>
-                                  <a:pt x="15387" y="48413"/>
-                                </a:lnTo>
-                                <a:lnTo>
-                                  <a:pt x="25196" y="50393"/>
-                                </a:lnTo>
-                                <a:close/>
-                              </a:path>
-                            </a:pathLst>
-                          </a:custGeom>
-                          <a:ln w="12598">
-                            <a:solidFill>
-                              <a:srgbClr val="8C8C8C"/>
-                            </a:solidFill>
-                            <a:prstDash val="solid"/>
-                          </a:ln>
-                        </wps:spPr>
-                        <wps:bodyPr wrap="square" lIns="0" tIns="0" rIns="0" bIns="0" rtlCol="0">
-                          <a:prstTxWarp prst="textNoShape">
-                            <a:avLst/>
-                          </a:prstTxWarp>
-                          <a:noAutofit/>
-                        </wps:bodyPr>
-                      </wps:wsp>
-                      <pic:pic xmlns:pic="http://schemas.openxmlformats.org/drawingml/2006/picture">
-                        <pic:nvPicPr>
-                          <pic:cNvPr id="550" name="Image 550"/>
-                          <pic:cNvPicPr/>
-                        </pic:nvPicPr>
-                        <pic:blipFill>
-                          <a:blip r:embed="rId10" cstate="print"/>
-                          <a:stretch>
-                            <a:fillRect/>
-                          </a:stretch>
-                        </pic:blipFill>
-                        <pic:spPr>
-                          <a:xfrm>
-                            <a:off x="5419904" y="8991"/>
-                            <a:ext cx="81000" cy="81000"/>
-                          </a:xfrm>
-                          <a:prstGeom prst="rect">
-                            <a:avLst/>
-                          </a:prstGeom>
-                        </pic:spPr>
-                      </pic:pic>
-                      <pic:pic xmlns:pic="http://schemas.openxmlformats.org/drawingml/2006/picture">
-                        <pic:nvPicPr>
-                          <pic:cNvPr id="551" name="Image 551"/>
-                          <pic:cNvPicPr/>
-                        </pic:nvPicPr>
-                        <pic:blipFill>
-                          <a:blip r:embed="rId11" cstate="print"/>
-                          <a:stretch>
-                            <a:fillRect/>
-                          </a:stretch>
-                        </pic:blipFill>
-                        <pic:spPr>
-                          <a:xfrm>
-                            <a:off x="5542824" y="0"/>
-                            <a:ext cx="99009" cy="98996"/>
-                          </a:xfrm>
-                          <a:prstGeom prst="rect">
-                            <a:avLst/>
-                          </a:prstGeom>
-                        </pic:spPr>
-                      </pic:pic>
-                    </wpg:wgp>
-                  </a:graphicData>
-                </a:graphic>
-              </wp:anchor>
-            </w:drawing>
-          </mc:Choice>
-          <mc:Fallback>
-            <w:pict>
-              <v:group w14:anchorId="46DBA06C" id="Group 546" o:spid="_x0000_s1026" style="position:absolute;margin-left:65.9pt;margin-top:9.55pt;width:450.75pt;height:7.8pt;z-index:-251656192;mso-wrap-distance-left:0;mso-wrap-distance-right:0;mso-position-horizontal-relative:page" coordsize="57245,990" o:gfxdata="UEsDBBQABgAIAAAAIQCxgme2CgEAABMCAAATAAAAW0NvbnRlbnRfVHlwZXNdLnhtbJSRwU7DMAyG 70i8Q5QralN2QAit3YGOIyA0HiBK3DaicaI4lO3tSbpNgokh7Rjb3+8vyXK1tSObIJBxWPPbsuIM UDltsK/5++apuOeMokQtR4dQ8x0QXzXXV8vNzgOxRCPVfIjRPwhBagArqXQeMHU6F6yM6Rh64aX6 kD2IRVXdCeUwAsYi5gzeLFvo5OcY2XqbynsTjz1nj/u5vKrmxmY+18WfRICRThDp/WiUjOluYkJ9 4lUcnMpEzjM0GE83SfzMhtz57fRzwYF7SY8ZjAb2KkN8ljaZCx1IwMK1TpX/Z2RJS4XrOqOgbAOt Z+rodC5buy8MMF0a3ibsDaZjupi/tPkGAAD//wMAUEsDBBQABgAIAAAAIQA4/SH/1gAAAJQBAAAL AAAAX3JlbHMvLnJlbHOkkMFqwzAMhu+DvYPRfXGawxijTi+j0GvpHsDYimMaW0Yy2fr2M4PBMnrb Ub/Q94l/f/hMi1qRJVI2sOt6UJgd+ZiDgffL8ekFlFSbvV0oo4EbChzGx4f9GRdb25HMsYhqlCwG 5lrLq9biZkxWOiqY22YiTra2kYMu1l1tQD30/bPm3wwYN0x18gb45AdQl1tp5j/sFB2T0FQ7R0nT NEV3j6o9feQzro1iOWA14Fm+Q8a1a8+Bvu/d/dMb2JY5uiPbhG/ktn4cqGU/er3pcvwCAAD//wMA UEsDBBQABgAIAAAAIQBwAbTz5wQAAF4VAAAOAAAAZHJzL2Uyb0RvYy54bWzsWG1vpDYQ/l6p/wHx /bLAQhZQNqdT0kSRTteol6qfvV6zoAPs2t6X/PvO2Bi43WQ3d22qnpqsAgMehvEzL8zMxftdU3sb JlXF27kfngW+x1rKl1W7mvu/P9y8S31PadIuSc1bNvcfmfLfX/7808VW5CziJa+XTHogpFX5Vsz9 UmuRTyaKlqwh6owL1sJiwWVDNFzK1WQpyRakN/UkCoLzyZbLpZCcMqXg7rVd9C+N/KJgVP9aFIpp r577oJs2R2mOCzxOLi9IvpJElBXt1CDfoUVDqhZe2ou6Jpp4a1kdiGoqKrnihT6jvJnwoqgoM3uA 3YTB3m5uJV8Ls5dVvl2JHiaAdg+n7xZLP23upVct534Sn/teSxowknmvhzcAnq1Y5cB1K8VncS/t HoH8yOkXBcuT/XW8Xg3Mu0I2+BBs1dsZ3B973NlOexRuJrMoTqLE9yisZVlw3tmFlmC8g6do+cvR 5yYkty81qvWqbAV4mBpAVH8PxM8lEczYRiE8PYizAUTrVEk8szAaPsTQgKpy1cH5JEJxkIQdCk+i FKZxmKDcfrckp2ulbxk3cJPNR6VhGTxy6ShSOoruWkdKCBEMjtoEh/Y9CA7pexAcCxRPckE0PudI bzuyVwkhbxTB1YZv2AM3fBqNhlYNgtj3nMFB1YGnbse8EJojLrfmzsLIszzhLMvcxt26O1u+8Xu/ jdsADlo6ebTmilmMEQUDdg8H8I0BV7yuljdVXSMASq4WV7X0NgSQ/XCOv85WIzZwT+cESC348hG8 aAu5aO6rP9dEMt+r71rwU0xcjpCOWDhC6vqKm/RmsJdKP+z+IFJ4Asi5r8F/PnHnriR3ngH6I4Pl xSdb/mGteVGh2xjdrEbdBYQO5oJ/JYbgm+ESkYuhFPHD10OsnY6hZBqFUTo1ThXF0yC0rtxHUpAG gClmm8SQ1sYuEMdmdWi9ThxZPSCKrBpohSFCrDdHSZhBYh5Fx8Dh/NRyhsk0hewDnGE2yzp/cyzu bFln0xlgDJyGsLt3HO7cCUVRRqaRfozVxqfV9xif0Q5FTpMgOB7KvZ5ow/jolobdx5CRpkd5B0yT YJod57VKorqn5VotDe9Jfa20l8FgtUTe0+gOci0ixywx6HvSDwYYTjrXgO7r5NMb89cZ+C2fjqpf l+S7PNnXJBDB+/nU5If/dz4dx/5zOXVw+7fof9mn5fno3/uwvH2tDKCn/WpAdOyxDs1vqVHrFqv3 MEqy1DSro+S5V7OmV/g7zLG2ZrwmqrS1rZHQf2u7UtE2NphcfoSaVlQ0h/+uuQbqoC88PYSAp/Qa 63U7yGheJKMh8stavIM5APQU1aKqK/1oZhpgG1Sq3dxXFDtuvBi1mAkUWjad3zVkxbwEbsBX3nHh M/jRPxCxqCvhGhSkO2Wh39sbJjyxXzuouOZ03bBW28mLZDXozVtVVkJB35izZsFgkCDvliEU1zD1 0TBLELJqNeoHHqYl0xTaKJIX0Cj9Bp2nrU76BaP0oCdu4ZkuOYlDGBTY5jLNsr0CPw0DV+Bb0r7H FfjY92Cj3HVI2AKbeHDFftca2V7a6GS1MCQoZcEG4gdyGjDJ105jIEOE0bX+C04Tvb7TJHGURqOJ BMldSwjOFECZZAZQ4E+uXf/nPMYMo2CIB5H51ZRwfG3y5zAWvfwLAAD//wMAUEsDBAoAAAAAAAAA IQDl2bCJIgIAACICAAAUAAAAZHJzL21lZGlhL2ltYWdlMS5wbmeJUE5HDQoaCgAAAA1JSERSAAAA EQAAABEIBgAAADttR/oAAAAGYktHRAD/AP8A/6C9p5MAAAAJcEhZcwAADsQAAA7EAZUrDhsAAAHC SURBVDiNrZSxauNAEIZ/C9ScQGjVaEFtSLC3uMaoyakXfgJXdu4t7l7g4J7iYld+Ant7kUa4uGZl EtwKVo1WCDaFVShFWKEjF+Mc97fzzwf/MDOjruswVNu2n4QQSyllVJbltKqqG9/3H4Mg2FNKM8bY yrbt52HPaAgpiuKWc35f1/UV3pHnecckSe7CMHx4A8my7Fuapj8AjEzRdV0QQqCUQtM0Q1YXx/H3 KIp+9pCiKG43m01qAIwxxHEMx3H6Lq010jSFEKIHzefzOAzDh9HpdHLW6/VvE2E2m2E8Hr+XBnme Y7fb9dEWi8VnSwixNADG2FkAAEwmEzDGAAB1XV8JIZaWlDIyhjiOzwL+5pNSRpaUcgq8DnE4g3Ny HAeu6wIAyrKcWkqpawAghFwEMDL+qqpuLELIEwAopT4EMX7f9x8tSukeAJqmgdb6IoDWut+bIAj2 FqU0M8U0TS+CDH2U0sxijK08zzsCgBACh8PhLCDP837hPM87MsZWlm3bOkmSrwA6ANhut+Ccv4mm tQbnvF80AF2SJHe2bT//v9sxKoriC+f81z9fsVHbto75J1LKqVLqmhDyRCkd/pM/sr4Ampj2y1Qa mr4AAAAASUVORK5CYIJQSwMECgAAAAAAAAAhAG0Q9UHiAgAA4gIAABQAAABkcnMvbWVkaWEvaW1h Z2UyLnBuZ4lQTkcNChoKAAAADUlIRFIAAAAUAAAAFQgGAAAARtXOqAAAAAZiS0dEAP8A/wD/oL2n kwAAAAlwSFlzAAAOxAAADsQBlSsOGwAAAoJJREFUOI21lb9LG2Ech5+8N9wiJkK83DUJaYdAKIg/ AukSkxBEyOrWQovQDu3gX9PSLi1Il3ZpV0E0JDFLHaIiVCFDa5NwlzNgTlxuuEsHvbONWmJLn+19 v3fPve+9vJ9vYDAYMIzrulK73c4ZhpExDCOj6/oDAE3Tvqiquq2q6nYsFqsJIZzhdwPDwtPT08Ta 2tr7drudu/KlX4jFYtVSqfRkfHz8x43Cw8PDhxsbG29s2w56c5IkoSgKAKZp4jiXi5Jl2VpYWHie SqU+XhHu7+8/XV9ff+sVEokE2WyWyclJJEkCwHEcjo+PqdfrHB0d+eLFxcVnU1NT73zh2dnZndXV 1a+2bQclSWJ+fp65uTkCgcC12x0MBjQaDba2tnAcB1mW+8vLy/fHxsZ0AVAul19628zn86TT6Rtl AIFAgHQ6TS53/ptt2w6Vy+VXAKLVahWazeYSgKZpTE9P3ygaZmZmBk3TAGg2m0utVisvOp1O1nug UCgghBhZKISgUCj4406nkxWmac7C+WlGIpGRZR6RSMQ/NNM0Z31hOBz2C7dBkiTC4fCl0LKsuwAT ExO3lnmEQiEALMu6J4LB4HeAk5OTvxb2+30AgsHgN6Eoyg5Ar9f77RaMiuM49Ho9ABRF2fGFjuPQ 7XZvLex2u/5CFEXZEdFotO4VK5UKruuOLHNdl0ql4o+j0WhdxOPxSjKZ/Ayg6zp7e3sjC3d3d9F1 HYBkMvkpHo9XBUCxWFyRZdkCqFarNBoNrstJD+8u12o14Dx1isXiCvyvtPE4ODh4tLm5+fqWefgi lUp98Ob+JbFrpVLp8R8T2+Oip+Qv+knGMIwMgKqq25qmeT2lel1P+QlumUcdSjWYCwAAAABJRU5E rkJgglBLAwQUAAYACAAAACEAw/OF4eAAAAAKAQAADwAAAGRycy9kb3ducmV2LnhtbEyPzU7DMBCE 70i8g7VI3KhjTPkJcaqqAk4VEi0S4rZNtknU2I5iN0nfvtsT3GY0o9lvs8VkWzFQHxrvDKhZAoJc 4cvGVQa+t+93zyBCRFdi6x0ZOFGARX59lWFa+tF90bCJleARF1I0UMfYpVKGoiaLYeY7cpztfW8x su0rWfY48rht5X2SPEqLjeMLNXa0qqk4bI7WwMeI41Krt2F92K9Ov9v5589akTG3N9PyFUSkKf6V 4YLP6JAz084fXRlEy14rRo8sXhSISyHRWoPYGdAPTyDzTP5/IT8DAAD//wMAUEsDBBQABgAIAAAA IQAubPAAxQAAAKUBAAAZAAAAZHJzL19yZWxzL2Uyb0RvYy54bWwucmVsc7yQwYrCMBCG7wv7DmHu 27Q9LLKY9iKCV3EfYEimabCZhCSKvr2BZUFB8OZxZvi//2PW48Uv4kwpu8AKuqYFQayDcWwV/B62 XysQuSAbXAKTgitlGIfPj/WeFiw1lGcXs6gUzgrmUuKPlFnP5DE3IRLXyxSSx1LHZGVEfURLsm/b b5nuGTA8MMXOKEg704M4XGNtfs0O0+Q0bYI+eeLypEI6X7srEJOlosCTcfi37JvIFuRzh+49Dt2/ g3x47nADAAD//wMAUEsBAi0AFAAGAAgAAAAhALGCZ7YKAQAAEwIAABMAAAAAAAAAAAAAAAAAAAAA AFtDb250ZW50X1R5cGVzXS54bWxQSwECLQAUAAYACAAAACEAOP0h/9YAAACUAQAACwAAAAAAAAAA AAAAAAA7AQAAX3JlbHMvLnJlbHNQSwECLQAUAAYACAAAACEAcAG08+cEAABeFQAADgAAAAAAAAAA AAAAAAA6AgAAZHJzL2Uyb0RvYy54bWxQSwECLQAKAAAAAAAAACEA5dmwiSICAAAiAgAAFAAAAAAA AAAAAAAAAABNBwAAZHJzL21lZGlhL2ltYWdlMS5wbmdQSwECLQAKAAAAAAAAACEAbRD1QeICAADi AgAAFAAAAAAAAAAAAAAAAAChCQAAZHJzL21lZGlhL2ltYWdlMi5wbmdQSwECLQAUAAYACAAAACEA w/OF4eAAAAAKAQAADwAAAAAAAAAAAAAAAAC1DAAAZHJzL2Rvd25yZXYueG1sUEsBAi0AFAAGAAgA AAAhAC5s8ADFAAAApQEAABkAAAAAAAAAAAAAAAAAwg0AAGRycy9fcmVscy9lMm9Eb2MueG1sLnJl bHNQSwUGAAAAAAcABwC+AQAAvg4AAAAA ">
-                <v:shape id="Graphic 547" o:spid="_x0000_s1027" style="position:absolute;top:405;width:57245;height:184;visibility:visible;mso-wrap-style:square;v-text-anchor:top" coordsize="5724525,18415" o:gfxdata="UEsDBBQABgAIAAAAIQDb4fbL7gAAAIUBAAATAAAAW0NvbnRlbnRfVHlwZXNdLnhtbHyQz07DMAyH 70i8Q+QralM4IITa7kDhCAiNB7ASt43WOlEcyvb2pNu4IODoPz9/n1xv9vOkForiPDdwXVagiI23 jocG3rdPxR0oScgWJ8/UwIEENu3lRb09BBKV0ywNjCmFe63FjDSjlD4Q50nv44wpl3HQAc0OB9I3 VXWrjedEnIq03oC27qjHjympx31un0wiTQLq4bS4shrAECZnMGVTvbD9QSnOhDInjzsyuiBXWQP0 r4R18jfgnHvJr4nOknrFmJ5xzhraRtHWf3Kkpfz/yGo5S+H73hkquyhdjr3R8m2lj09svwAAAP// AwBQSwMEFAAGAAgAAAAhAFr0LFu/AAAAFQEAAAsAAABfcmVscy8ucmVsc2zPwWrDMAwG4Ptg72B0 X5TuUMaI01uh19I+gLGVxCy2jGSy9e1nemrHjpL4P0nD4SetZiPRyNnCruvBUPYcYp4tXC/Htw8w Wl0ObuVMFm6kcBhfX4Yzra62kC6xqGlKVgtLreUTUf1CyWnHhXKbTCzJ1VbKjMX5LzcTvvf9HuXR gPHJNKdgQU5hB+ZyK23zHztFL6w81c5zQp6m6P9TMfB3PtPWFCczVQtB9N4U2rp2HOA44NMz4y8A AAD//wMAUEsDBBQABgAIAAAAIQCxWcnzxQAAANwAAAAPAAAAZHJzL2Rvd25yZXYueG1sRI9BawIx FITvBf9DeIK3mrVoK1ujSKuwlx6qYq+vm7ebpZuXbRLX9d83hUKPw8x8w6w2g21FTz40jhXMphkI 4tLphmsFp+P+fgkiRGSNrWNScKMAm/XoboW5dld+p/4Qa5EgHHJUYGLscilDachimLqOOHmV8xZj kr6W2uM1wW0rH7LsUVpsOC0Y7OjFUPl1uFgF9u3z4/L6fQ7maGRR+VNV7Lpeqcl42D6DiDTE//Bf u9AKFvMn+D2TjoBc/wAAAP//AwBQSwECLQAUAAYACAAAACEA2+H2y+4AAACFAQAAEwAAAAAAAAAA AAAAAAAAAAAAW0NvbnRlbnRfVHlwZXNdLnhtbFBLAQItABQABgAIAAAAIQBa9CxbvwAAABUBAAAL AAAAAAAAAAAAAAAAAB8BAABfcmVscy8ucmVsc1BLAQItABQABgAIAAAAIQCxWcnzxQAAANwAAAAP AAAAAAAAAAAAAAAAAAcCAABkcnMvZG93bnJldi54bWxQSwUGAAAAAAMAAwC3AAAA+QIAAAAA " path="m5724004,l,,,17995r5724004,l5724004,xe" fillcolor="#a6a6a6" stroked="f">
-                  <v:path arrowok="t"/>
-                </v:shape>
-                <v:shape id="Graphic 548" o:spid="_x0000_s1028" style="position:absolute;left:53212;top:243;width:508;height:508;visibility:visible;mso-wrap-style:square;v-text-anchor:top" coordsize="50800,50800" o:gfxdata="UEsDBBQABgAIAAAAIQDb4fbL7gAAAIUBAAATAAAAW0NvbnRlbnRfVHlwZXNdLnhtbHyQz07DMAyH 70i8Q+QralM4IITa7kDhCAiNB7ASt43WOlEcyvb2pNu4IODoPz9/n1xv9vOkForiPDdwXVagiI23 jocG3rdPxR0oScgWJ8/UwIEENu3lRb09BBKV0ywNjCmFe63FjDSjlD4Q50nv44wpl3HQAc0OB9I3 VXWrjedEnIq03oC27qjHjympx31un0wiTQLq4bS4shrAECZnMGVTvbD9QSnOhDInjzsyuiBXWQP0 r4R18jfgnHvJr4nOknrFmJ5xzhraRtHWf3Kkpfz/yGo5S+H73hkquyhdjr3R8m2lj09svwAAAP// AwBQSwMEFAAGAAgAAAAhAFr0LFu/AAAAFQEAAAsAAABfcmVscy8ucmVsc2zPwWrDMAwG4Ptg72B0 X5TuUMaI01uh19I+gLGVxCy2jGSy9e1nemrHjpL4P0nD4SetZiPRyNnCruvBUPYcYp4tXC/Htw8w Wl0ObuVMFm6kcBhfX4Yzra62kC6xqGlKVgtLreUTUf1CyWnHhXKbTCzJ1VbKjMX5LzcTvvf9HuXR gPHJNKdgQU5hB+ZyK23zHztFL6w81c5zQp6m6P9TMfB3PtPWFCczVQtB9N4U2rp2HOA44NMz4y8A AAD//wMAUEsDBBQABgAIAAAAIQDVlQSYwwAAANwAAAAPAAAAZHJzL2Rvd25yZXYueG1sRE89b8Iw EN0r8R+sq9StOKVQUMAg2goJmEpg6HiNjzgiPkexC4Zfj4dKHZ/e92wRbSPO1PnasYKXfgaCuHS6 5krBYb96noDwAVlj45gUXMnDYt57mGGu3YV3dC5CJVII+xwVmBDaXEpfGrLo+64lTtzRdRZDgl0l dYeXFG4bOciyN2mx5tRgsKUPQ+Wp+LUKft7X3+O4i/y1XZ7M5rUpwu3zqtTTY1xOQQSK4V/8515r BaNhWpvOpCMg53cAAAD//wMAUEsBAi0AFAAGAAgAAAAhANvh9svuAAAAhQEAABMAAAAAAAAAAAAA AAAAAAAAAFtDb250ZW50X1R5cGVzXS54bWxQSwECLQAUAAYACAAAACEAWvQsW78AAAAVAQAACwAA AAAAAAAAAAAAAAAfAQAAX3JlbHMvLnJlbHNQSwECLQAUAAYACAAAACEA1ZUEmMMAAADcAAAADwAA AAAAAAAAAAAAAAAHAgAAZHJzL2Rvd25yZXYueG1sUEsFBgAAAAADAAMAtwAAAPcCAAAAAA== " path="m25196,l15387,1979,7378,7378,1979,15387,,25196r1979,9809l7378,43014r8009,5399l25196,50393r9809,-1980l43014,43014r5399,-8009l50393,25196,48413,15387,43014,7378,35005,1979,25196,xe" stroked="f">
-                  <v:path arrowok="t"/>
-                </v:shape>
-                <v:shape id="Graphic 549" o:spid="_x0000_s1029" style="position:absolute;left:53212;top:243;width:508;height:508;visibility:visible;mso-wrap-style:square;v-text-anchor:top" coordsize="50800,50800" o:gfxdata="UEsDBBQABgAIAAAAIQDb4fbL7gAAAIUBAAATAAAAW0NvbnRlbnRfVHlwZXNdLnhtbHyQz07DMAyH 70i8Q+QralM4IITa7kDhCAiNB7ASt43WOlEcyvb2pNu4IODoPz9/n1xv9vOkForiPDdwXVagiI23 jocG3rdPxR0oScgWJ8/UwIEENu3lRb09BBKV0ywNjCmFe63FjDSjlD4Q50nv44wpl3HQAc0OB9I3 VXWrjedEnIq03oC27qjHjympx31un0wiTQLq4bS4shrAECZnMGVTvbD9QSnOhDInjzsyuiBXWQP0 r4R18jfgnHvJr4nOknrFmJ5xzhraRtHWf3Kkpfz/yGo5S+H73hkquyhdjr3R8m2lj09svwAAAP// AwBQSwMEFAAGAAgAAAAhAFr0LFu/AAAAFQEAAAsAAABfcmVscy8ucmVsc2zPwWrDMAwG4Ptg72B0 X5TuUMaI01uh19I+gLGVxCy2jGSy9e1nemrHjpL4P0nD4SetZiPRyNnCruvBUPYcYp4tXC/Htw8w Wl0ObuVMFm6kcBhfX4Yzra62kC6xqGlKVgtLreUTUf1CyWnHhXKbTCzJ1VbKjMX5LzcTvvf9HuXR gPHJNKdgQU5hB+ZyK23zHztFL6w81c5zQp6m6P9TMfB3PtPWFCczVQtB9N4U2rp2HOA44NMz4y8A AAD//wMAUEsDBBQABgAIAAAAIQA2IWbTxAAAANwAAAAPAAAAZHJzL2Rvd25yZXYueG1sRI/RagIx FETfC/5DuIIvRbOKFV2NIoVCKaXg6gdcN9fN4uZmSeK67dc3hYKPw8ycYTa73jaiIx9qxwqmkwwE cel0zZWC0/FtvAQRIrLGxjEp+KYAu+3gaYO5dnc+UFfESiQIhxwVmBjbXMpQGrIYJq4lTt7FeYsx SV9J7fGe4LaRsyxbSIs1pwWDLb0aKq/FzSr4Ctn50/908yXeFoXxTuvnj5VSo2G/X4OI1MdH+L/9 rhW8zFfwdyYdAbn9BQAA//8DAFBLAQItABQABgAIAAAAIQDb4fbL7gAAAIUBAAATAAAAAAAAAAAA AAAAAAAAAABbQ29udGVudF9UeXBlc10ueG1sUEsBAi0AFAAGAAgAAAAhAFr0LFu/AAAAFQEAAAsA AAAAAAAAAAAAAAAAHwEAAF9yZWxzLy5yZWxzUEsBAi0AFAAGAAgAAAAhADYhZtPEAAAA3AAAAA8A AAAAAAAAAAAAAAAABwIAAGRycy9kb3ducmV2LnhtbFBLBQYAAAAAAwADALcAAAD4AgAAAAA= " path="m25196,50393r9809,-1980l43014,43014r5399,-8009l50393,25196,48413,15387,43014,7378,35005,1979,25196,,15387,1979,7378,7378,1979,15387,,25196r1979,9809l7378,43014r8009,5399l25196,50393xe" filled="f" strokecolor="#8c8c8c" strokeweight=".34994mm">
-                  <v:path arrowok="t"/>
-                </v:shape>
-                <v:shapetype id="_x0000_t75" coordsize="21600,21600" o:spt="75" o:preferrelative="t" path="m@4@5l@4@11@9@11@9@5xe" filled="f" stroked="f">
-                  <v:stroke joinstyle="miter"/>
-                  <v:formulas>
-                    <v:f eqn="if lineDrawn pixelLineWidth 0"/>
-                    <v:f eqn="sum @0 1 0"/>
-                    <v:f eqn="sum 0 0 @1"/>
-                    <v:f eqn="prod @2 1 2"/>
-                    <v:f eqn="prod @3 21600 pixelWidth"/>
-                    <v:f eqn="prod @3 21600 pixelHeight"/>
-                    <v:f eqn="sum @0 0 1"/>
-                    <v:f eqn="prod @6 1 2"/>
-                    <v:f eqn="prod @7 21600 pixelWidth"/>
-                    <v:f eqn="sum @8 21600 0"/>
-                    <v:f eqn="prod @7 21600 pixelHeight"/>
-                    <v:f eqn="sum @10 21600 0"/>
-                  </v:formulas>
-                  <v:path o:extrusionok="f" gradientshapeok="t" o:connecttype="rect"/>
-                  <o:lock v:ext="edit" aspectratio="t"/>
-                </v:shapetype>
-                <v:shape id="Image 550" o:spid="_x0000_s1030" type="#_x0000_t75" style="position:absolute;left:54199;top:89;width:810;height:810;visibility:visible;mso-wrap-style:square" o:gfxdata="UEsDBBQABgAIAAAAIQDb4fbL7gAAAIUBAAATAAAAW0NvbnRlbnRfVHlwZXNdLnhtbHyQz07DMAyH 70i8Q+QralM4IITa7kDhCAiNB7ASt43WOlEcyvb2pNu4IODoPz9/n1xv9vOkForiPDdwXVagiI23 jocG3rdPxR0oScgWJ8/UwIEENu3lRb09BBKV0ywNjCmFe63FjDSjlD4Q50nv44wpl3HQAc0OB9I3 VXWrjedEnIq03oC27qjHjympx31un0wiTQLq4bS4shrAECZnMGVTvbD9QSnOhDInjzsyuiBXWQP0 r4R18jfgnHvJr4nOknrFmJ5xzhraRtHWf3Kkpfz/yGo5S+H73hkquyhdjr3R8m2lj09svwAAAP// AwBQSwMEFAAGAAgAAAAhAFr0LFu/AAAAFQEAAAsAAABfcmVscy8ucmVsc2zPwWrDMAwG4Ptg72B0 X5TuUMaI01uh19I+gLGVxCy2jGSy9e1nemrHjpL4P0nD4SetZiPRyNnCruvBUPYcYp4tXC/Htw8w Wl0ObuVMFm6kcBhfX4Yzra62kC6xqGlKVgtLreUTUf1CyWnHhXKbTCzJ1VbKjMX5LzcTvvf9HuXR gPHJNKdgQU5hB+ZyK23zHztFL6w81c5zQp6m6P9TMfB3PtPWFCczVQtB9N4U2rp2HOA44NMz4y8A AAD//wMAUEsDBBQABgAIAAAAIQC030xvwgAAANwAAAAPAAAAZHJzL2Rvd25yZXYueG1sRE/LasJA FN0L/sNwhW6kTiykttFRRGhRigtf+9vMNQlm7oSZaZL+vbMQXB7Oe7HqTS1acr6yrGA6SUAQ51ZX XCg4n75eP0D4gKyxtkwK/snDajkcLDDTtuMDtcdQiBjCPkMFZQhNJqXPSzLoJ7YhjtzVOoMhQldI 7bCL4aaWb0nyLg1WHBtKbGhTUn47/hkFn+lm3e7zU3NxO//d7cez3fb3R6mXUb+egwjUh6f44d5q BWka58cz8QjI5R0AAP//AwBQSwECLQAUAAYACAAAACEA2+H2y+4AAACFAQAAEwAAAAAAAAAAAAAA AAAAAAAAW0NvbnRlbnRfVHlwZXNdLnhtbFBLAQItABQABgAIAAAAIQBa9CxbvwAAABUBAAALAAAA AAAAAAAAAAAAAB8BAABfcmVscy8ucmVsc1BLAQItABQABgAIAAAAIQC030xvwgAAANwAAAAPAAAA AAAAAAAAAAAAAAcCAABkcnMvZG93bnJldi54bWxQSwUGAAAAAAMAAwC3AAAA9gIAAAAA ">
-                  <v:imagedata r:id="rId29" o:title=""/>
-                </v:shape>
-                <v:shape id="Image 551" o:spid="_x0000_s1031" type="#_x0000_t75" style="position:absolute;left:55428;width:990;height:989;visibility:visible;mso-wrap-style:square" o:gfxdata="UEsDBBQABgAIAAAAIQDb4fbL7gAAAIUBAAATAAAAW0NvbnRlbnRfVHlwZXNdLnhtbHyQz07DMAyH 70i8Q+QralM4IITa7kDhCAiNB7ASt43WOlEcyvb2pNu4IODoPz9/n1xv9vOkForiPDdwXVagiI23 jocG3rdPxR0oScgWJ8/UwIEENu3lRb09BBKV0ywNjCmFe63FjDSjlD4Q50nv44wpl3HQAc0OB9I3 VXWrjedEnIq03oC27qjHjympx31un0wiTQLq4bS4shrAECZnMGVTvbD9QSnOhDInjzsyuiBXWQP0 r4R18jfgnHvJr4nOknrFmJ5xzhraRtHWf3Kkpfz/yGo5S+H73hkquyhdjr3R8m2lj09svwAAAP// AwBQSwMEFAAGAAgAAAAhAFr0LFu/AAAAFQEAAAsAAABfcmVscy8ucmVsc2zPwWrDMAwG4Ptg72B0 X5TuUMaI01uh19I+gLGVxCy2jGSy9e1nemrHjpL4P0nD4SetZiPRyNnCruvBUPYcYp4tXC/Htw8w Wl0ObuVMFm6kcBhfX4Yzra62kC6xqGlKVgtLreUTUf1CyWnHhXKbTCzJ1VbKjMX5LzcTvvf9HuXR gPHJNKdgQU5hB+ZyK23zHztFL6w81c5zQp6m6P9TMfB3PtPWFCczVQtB9N4U2rp2HOA44NMz4y8A AAD//wMAUEsDBBQABgAIAAAAIQACg58mxQAAANwAAAAPAAAAZHJzL2Rvd25yZXYueG1sRI9Ba8JA FITvBf/D8gRvdZNiJERXCbaFHpqD2ktvj+wzCWbfhuxGk3/fLQgeh5n5htnuR9OKG/WusawgXkYg iEurG64U/Jw/X1MQziNrbC2Tgokc7Hezly1m2t75SLeTr0SAsMtQQe19l0npypoMuqXtiIN3sb1B H2RfSd3jPcBNK9+iaC0NNhwWauzoUFN5PQ1GgUzT9+5j/V39TkkxnI+DX+VtodRiPuYbEJ5G/ww/ 2l9aQZLE8H8mHAG5+wMAAP//AwBQSwECLQAUAAYACAAAACEA2+H2y+4AAACFAQAAEwAAAAAAAAAA AAAAAAAAAAAAW0NvbnRlbnRfVHlwZXNdLnhtbFBLAQItABQABgAIAAAAIQBa9CxbvwAAABUBAAAL AAAAAAAAAAAAAAAAAB8BAABfcmVscy8ucmVsc1BLAQItABQABgAIAAAAIQACg58mxQAAANwAAAAP AAAAAAAAAAAAAAAAAAcCAABkcnMvZG93bnJldi54bWxQSwUGAAAAAAMAAwC3AAAA+QIAAAAA ">
-                  <v:imagedata r:id="rId30" o:title=""/>
-                </v:shape>
-                <w10:wrap type="topAndBottom" anchorx="page"/>
-              </v:group>
-            </w:pict>
-          </mc:Fallback>
-        </mc:AlternateContent>
-      </w:r>
     </w:p>
     <w:sectPr>
-      <w:headerReference w:type="default" r:id="rId31"/>
-      <w:footerReference w:type="default" r:id="rId32"/>
+      <w:headerReference w:type="default" r:id="rId10"/>
+      <w:footerReference w:type="default" r:id="rId11"/>
       <w:type w:val="continuous"/>
       <w:pgSz w:w="11906" w:h="16838"/>
       <w:pgMar w:top="1702" w:right="1123" w:bottom="851" w:left="1123" w:header="720" w:footer="859" w:gutter="0"/>
@@ -4446,7 +2239,7 @@
               <v:stroke joinstyle="miter"/>
               <v:path gradientshapeok="t" o:connecttype="rect"/>
             </v:shapetype>
-            <v:shape id="TextBox 4" o:spid="_x0000_s1048" type="#_x0000_t202" style="position:absolute;margin-left:-44.9pt;margin-top:-30pt;width:206.85pt;height:26.25pt;z-index:251665408;visibility:visible;mso-wrap-style:square;mso-height-percent:0;mso-wrap-distance-left:9pt;mso-wrap-distance-top:0;mso-wrap-distance-right:9pt;mso-wrap-distance-bottom:0;mso-position-horizontal:absolute;mso-position-horizontal-relative:text;mso-position-vertical:absolute;mso-position-vertical-relative:text;mso-height-percent:0;mso-height-relative:margin;v-text-anchor:top" o:gfxdata="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" filled="f" stroked="f">
+            <v:shape id="TextBox 4" o:spid="_x0000_s1026" type="#_x0000_t202" style="position:absolute;margin-left:-44.9pt;margin-top:-30pt;width:206.85pt;height:26.25pt;z-index:251665408;visibility:visible;mso-wrap-style:square;mso-height-percent:0;mso-wrap-distance-left:9pt;mso-wrap-distance-top:0;mso-wrap-distance-right:9pt;mso-wrap-distance-bottom:0;mso-position-horizontal:absolute;mso-position-horizontal-relative:text;mso-position-vertical:absolute;mso-position-vertical-relative:text;mso-height-percent:0;mso-height-relative:margin;v-text-anchor:top" o:gfxdata="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" filled="f" stroked="f">
               <v:textbox inset="0,0,0,0">
                 <w:txbxContent>
                   <w:p>

</xml_diff>